<commit_message>
Add SportsNegotiationApp complaint themes and negotiator pay research
Co-Authored-By: Claude Opus 5 <noreply@anthropic.com>
</commit_message>
<xml_diff>
--- a/12_SportsNegotiationApp/ResearchAgents/SportsNegotiationApp_Research.docx
+++ b/12_SportsNegotiationApp/ResearchAgents/SportsNegotiationApp_Research.docx
@@ -71,6 +71,17 @@
       </w:pPr>
       <w:r>
         <w:t xml:space="preserve">Section 1 — Opportunity Scan: who has the practice-and-prove problem, how many, what they use today, complaints about current tools, and what AI actually changed. *(Added Sept 25, 2026)*</w:t>
+      </w:r>
+    </w:p>
+    <w:p>
+      <w:pPr>
+        <w:numPr>
+          <w:ilvl w:val="0"/>
+          <w:numId w:val="1"/>
+        </w:numPr>
+      </w:pPr>
+      <w:r>
+        <w:t xml:space="preserve">Section 2 — Complaint Themes &amp; What Humans Are Paid: six themes from 2,134 analog reviews, plus agent commission caps and negotiator salaries. *(Added Sept 25, 2026)*</w:t>
       </w:r>
     </w:p>
     <w:p>
@@ -3680,6 +3691,2902 @@
                 <w:sz w:val="18"/>
               </w:rPr>
               <w:t xml:space="preserve">❌ No evidence found either way.</w:t>
+            </w:r>
+          </w:p>
+        </w:tc>
+      </w:tr>
+    </w:tbl>
+    <w:p>
+      <w:pPr>
+        <w:spacing w:after="0"/>
+      </w:pPr>
+    </w:p>
+    <w:p>
+      <w:r>
+        <w:br w:type="page"/>
+      </w:r>
+    </w:p>
+    <w:p>
+      <w:pPr>
+        <w:pStyle w:val="Title"/>
+      </w:pPr>
+      <w:r>
+        <w:t xml:space="preserve">Complaint Themes &amp; What Humans Are Paid to Negotiate Deals</w:t>
+      </w:r>
+    </w:p>
+    <w:p>
+      <w:r>
+        <w:rPr>
+          <w:b/>
+        </w:rPr>
+        <w:t xml:space="preserve">Prepared:</w:t>
+      </w:r>
+      <w:r>
+        <w:t xml:space="preserve"> September 25, 2026</w:t>
+      </w:r>
+    </w:p>
+    <w:p>
+      <w:r>
+        <w:rPr>
+          <w:b/>
+        </w:rPr>
+        <w:t xml:space="preserve">Scope:</w:t>
+      </w:r>
+      <w:r>
+        <w:t xml:space="preserve"> Complaints from the last 18 months (since March 25, 2025) about products that do part of what this app would do, plus what companies pay humans to negotiate sports deals.</w:t>
+      </w:r>
+    </w:p>
+    <w:p>
+      <w:pPr>
+        <w:ind w:left="360"/>
+        <w:pBdr>
+          <w:left w:val="single" w:sz="18" w:space="8" w:color="9AA0A6"/>
+        </w:pBdr>
+      </w:pPr>
+      <w:r>
+        <w:rPr>
+          <w:b/>
+        </w:rPr>
+        <w:t xml:space="preserve">Access note.</w:t>
+      </w:r>
+      <w:r>
+        <w:t xml:space="preserve"> Reddit is blocked. </w:t>
+      </w:r>
+      <w:r>
+        <w:rPr>
+          <w:b/>
+        </w:rPr>
+        <w:t xml:space="preserve">G2 and Capterra do not list any of these products</w:t>
+      </w:r>
+      <w:r>
+        <w:t xml:space="preserve"> — they cover business software, and every relevant product here is a game, a fan tool or a consumer app. Evidence is </w:t>
+      </w:r>
+      <w:r>
+        <w:rPr>
+          <w:b/>
+        </w:rPr>
+        <w:t xml:space="preserve">1,921 negative Steam reviews</w:t>
+      </w:r>
+      <w:r>
+        <w:t xml:space="preserve"> (six PC sports-management games) and </w:t>
+      </w:r>
+      <w:r>
+        <w:rPr>
+          <w:b/>
+        </w:rPr>
+        <w:t xml:space="preserve">213 critical App Store reviews</w:t>
+      </w:r>
+      <w:r>
+        <w:t xml:space="preserve"> (ten mobile GM, agent-sim and AI-trainer apps), all posted since March 25, 2025. Complaints are paraphrased with app, rating, date and reviewer handle; the originals are in </w:t>
+      </w:r>
+      <w:hyperlink r:id="rHl23">
+        <w:r>
+          <w:rPr>
+            <w:rStyle w:val="Hyperlink"/>
+          </w:rPr>
+          <w:t xml:space="preserve">steam-negative-reviews.json</w:t>
+        </w:r>
+      </w:hyperlink>
+      <w:r>
+        <w:t xml:space="preserve"> and </w:t>
+      </w:r>
+      <w:hyperlink r:id="rHl24">
+        <w:r>
+          <w:rPr>
+            <w:rStyle w:val="Hyperlink"/>
+          </w:rPr>
+          <w:t xml:space="preserve">appstore-reviews.json</w:t>
+        </w:r>
+      </w:hyperlink>
+      <w:r>
+        <w:t xml:space="preserve">.</w:t>
+      </w:r>
+    </w:p>
+    <w:p>
+      <w:pPr>
+        <w:pBdr>
+          <w:bottom w:val="single" w:sz="6" w:space="6" w:color="C9CCD1"/>
+        </w:pBdr>
+      </w:pPr>
+    </w:p>
+    <w:p>
+      <w:pPr>
+        <w:pStyle w:val="Heading1"/>
+      </w:pPr>
+      <w:r>
+        <w:t xml:space="preserve">No product does this, so this uses three analog groups</w:t>
+      </w:r>
+    </w:p>
+    <w:tbl>
+      <w:tblPr>
+        <w:tblW w:w="10080" w:type="dxa"/>
+        <w:tblBorders>
+          <w:top w:val="single" w:sz="4" w:space="0" w:color="C9CCD1"/>
+          <w:left w:val="single" w:sz="4" w:space="0" w:color="C9CCD1"/>
+          <w:bottom w:val="single" w:sz="4" w:space="0" w:color="C9CCD1"/>
+          <w:right w:val="single" w:sz="4" w:space="0" w:color="C9CCD1"/>
+          <w:insideH w:val="single" w:sz="4" w:space="0" w:color="C9CCD1"/>
+          <w:insideV w:val="single" w:sz="4" w:space="0" w:color="C9CCD1"/>
+        </w:tblBorders>
+        <w:tblLayout w:type="fixed"/>
+      </w:tblPr>
+      <w:tblGrid>
+        <w:gridCol w:w="3360"/>
+        <w:gridCol w:w="3360"/>
+        <w:gridCol w:w="3360"/>
+      </w:tblGrid>
+      <w:tr>
+        <w:trPr>
+          <w:tblHeader/>
+        </w:trPr>
+        <w:tc>
+          <w:tcPr>
+            <w:tcW w:w="3360" w:type="dxa"/>
+            <w:shd w:val="clear" w:color="auto" w:fill="EFF1F3"/>
+          </w:tcPr>
+          <w:p>
+            <w:pPr>
+              <w:spacing w:before="40" w:after="40"/>
+            </w:pPr>
+            <w:r>
+              <w:rPr>
+                <w:b/>
+                <w:sz w:val="18"/>
+              </w:rPr>
+              <w:t xml:space="preserve">What your app would do</w:t>
+            </w:r>
+          </w:p>
+        </w:tc>
+        <w:tc>
+          <w:tcPr>
+            <w:tcW w:w="3360" w:type="dxa"/>
+            <w:shd w:val="clear" w:color="auto" w:fill="EFF1F3"/>
+          </w:tcPr>
+          <w:p>
+            <w:pPr>
+              <w:spacing w:before="40" w:after="40"/>
+            </w:pPr>
+            <w:r>
+              <w:rPr>
+                <w:b/>
+                <w:sz w:val="18"/>
+              </w:rPr>
+              <w:t xml:space="preserve">Analog products used</w:t>
+            </w:r>
+          </w:p>
+        </w:tc>
+        <w:tc>
+          <w:tcPr>
+            <w:tcW w:w="3360" w:type="dxa"/>
+            <w:shd w:val="clear" w:color="auto" w:fill="EFF1F3"/>
+          </w:tcPr>
+          <w:p>
+            <w:pPr>
+              <w:spacing w:before="40" w:after="40"/>
+            </w:pPr>
+            <w:r>
+              <w:rPr>
+                <w:b/>
+                <w:sz w:val="18"/>
+              </w:rPr>
+              <w:t xml:space="preserve">Critical reviews in window</w:t>
+            </w:r>
+          </w:p>
+        </w:tc>
+      </w:tr>
+      <w:tr>
+        <w:tc>
+          <w:tcPr>
+            <w:tcW w:w="3360" w:type="dxa"/>
+          </w:tcPr>
+          <w:p>
+            <w:pPr>
+              <w:spacing w:before="40" w:after="40"/>
+            </w:pPr>
+            <w:r>
+              <w:rPr>
+                <w:b/>
+                <w:sz w:val="18"/>
+              </w:rPr>
+              <w:t xml:space="preserve">Simulate a deal against a counterparty</w:t>
+            </w:r>
+          </w:p>
+        </w:tc>
+        <w:tc>
+          <w:tcPr>
+            <w:tcW w:w="3360" w:type="dxa"/>
+          </w:tcPr>
+          <w:p>
+            <w:pPr>
+              <w:spacing w:before="40" w:after="40"/>
+            </w:pPr>
+            <w:r>
+              <w:rPr>
+                <w:sz w:val="18"/>
+              </w:rPr>
+              <w:t xml:space="preserve">Madden NFL 26, Football Manager 26, OOTP 26, NBA 2K26, Front Office Football Nine, Franchise Hockey Manager 12 (Steam)</w:t>
+            </w:r>
+          </w:p>
+        </w:tc>
+        <w:tc>
+          <w:tcPr>
+            <w:tcW w:w="3360" w:type="dxa"/>
+          </w:tcPr>
+          <w:p>
+            <w:pPr>
+              <w:spacing w:before="40" w:after="40"/>
+            </w:pPr>
+            <w:r>
+              <w:rPr>
+                <w:b/>
+                <w:sz w:val="18"/>
+              </w:rPr>
+              <w:t xml:space="preserve">1,921</w:t>
+            </w:r>
+          </w:p>
+        </w:tc>
+      </w:tr>
+      <w:tr>
+        <w:tc>
+          <w:tcPr>
+            <w:tcW w:w="3360" w:type="dxa"/>
+          </w:tcPr>
+          <w:p>
+            <w:pPr>
+              <w:spacing w:before="40" w:after="40"/>
+            </w:pPr>
+            <w:r>
+              <w:rPr>
+                <w:b/>
+                <w:sz w:val="18"/>
+              </w:rPr>
+              <w:t xml:space="preserve">Let you run a front office or an agency on a phone</w:t>
+            </w:r>
+          </w:p>
+        </w:tc>
+        <w:tc>
+          <w:tcPr>
+            <w:tcW w:w="3360" w:type="dxa"/>
+          </w:tcPr>
+          <w:p>
+            <w:pPr>
+              <w:spacing w:before="40" w:after="40"/>
+            </w:pPr>
+            <w:r>
+              <w:rPr>
+                <w:sz w:val="18"/>
+              </w:rPr>
+              <w:t xml:space="preserve">Franchise Football/Basketball/Hockey: Pro GM, Ultimate Pro Basketball GM, Pocket GM, Basketball Agent Manager Star, MockOut, FM26 Mobile</w:t>
+            </w:r>
+          </w:p>
+        </w:tc>
+        <w:tc>
+          <w:tcPr>
+            <w:tcW w:w="3360" w:type="dxa"/>
+          </w:tcPr>
+          <w:p>
+            <w:pPr>
+              <w:spacing w:before="40" w:after="40"/>
+            </w:pPr>
+            <w:r>
+              <w:rPr>
+                <w:b/>
+                <w:sz w:val="18"/>
+              </w:rPr>
+              <w:t xml:space="preserve">211</w:t>
+            </w:r>
+          </w:p>
+        </w:tc>
+      </w:tr>
+      <w:tr>
+        <w:tc>
+          <w:tcPr>
+            <w:tcW w:w="3360" w:type="dxa"/>
+          </w:tcPr>
+          <w:p>
+            <w:pPr>
+              <w:spacing w:before="40" w:after="40"/>
+            </w:pPr>
+            <w:r>
+              <w:rPr>
+                <w:b/>
+                <w:sz w:val="18"/>
+              </w:rPr>
+              <w:t xml:space="preserve">Score your performance with AI</w:t>
+            </w:r>
+          </w:p>
+        </w:tc>
+        <w:tc>
+          <w:tcPr>
+            <w:tcW w:w="3360" w:type="dxa"/>
+          </w:tcPr>
+          <w:p>
+            <w:pPr>
+              <w:spacing w:before="40" w:after="40"/>
+            </w:pPr>
+            <w:r>
+              <w:rPr>
+                <w:sz w:val="18"/>
+              </w:rPr>
+              <w:t xml:space="preserve">CoachCraft: AI Sales Trainer</w:t>
+            </w:r>
+          </w:p>
+        </w:tc>
+        <w:tc>
+          <w:tcPr>
+            <w:tcW w:w="3360" w:type="dxa"/>
+          </w:tcPr>
+          <w:p>
+            <w:pPr>
+              <w:spacing w:before="40" w:after="40"/>
+            </w:pPr>
+            <w:r>
+              <w:rPr>
+                <w:b/>
+                <w:sz w:val="18"/>
+              </w:rPr>
+              <w:t xml:space="preserve">2</w:t>
+            </w:r>
+          </w:p>
+        </w:tc>
+      </w:tr>
+    </w:tbl>
+    <w:p>
+      <w:pPr>
+        <w:spacing w:after="0"/>
+      </w:pPr>
+    </w:p>
+    <w:p>
+      <w:pPr>
+        <w:pBdr>
+          <w:bottom w:val="single" w:sz="6" w:space="6" w:color="C9CCD1"/>
+        </w:pBdr>
+      </w:pPr>
+    </w:p>
+    <w:p>
+      <w:pPr>
+        <w:pStyle w:val="Heading1"/>
+      </w:pPr>
+      <w:r>
+        <w:t xml:space="preserve">The themes</w:t>
+      </w:r>
+    </w:p>
+    <w:tbl>
+      <w:tblPr>
+        <w:tblW w:w="10080" w:type="dxa"/>
+        <w:tblBorders>
+          <w:top w:val="single" w:sz="4" w:space="0" w:color="C9CCD1"/>
+          <w:left w:val="single" w:sz="4" w:space="0" w:color="C9CCD1"/>
+          <w:bottom w:val="single" w:sz="4" w:space="0" w:color="C9CCD1"/>
+          <w:right w:val="single" w:sz="4" w:space="0" w:color="C9CCD1"/>
+          <w:insideH w:val="single" w:sz="4" w:space="0" w:color="C9CCD1"/>
+          <w:insideV w:val="single" w:sz="4" w:space="0" w:color="C9CCD1"/>
+        </w:tblBorders>
+        <w:tblLayout w:type="fixed"/>
+      </w:tblPr>
+      <w:tblGrid>
+        <w:gridCol w:w="2520"/>
+        <w:gridCol w:w="2520"/>
+        <w:gridCol w:w="2520"/>
+        <w:gridCol w:w="2520"/>
+      </w:tblGrid>
+      <w:tr>
+        <w:trPr>
+          <w:tblHeader/>
+        </w:trPr>
+        <w:tc>
+          <w:tcPr>
+            <w:tcW w:w="2520" w:type="dxa"/>
+            <w:shd w:val="clear" w:color="auto" w:fill="EFF1F3"/>
+          </w:tcPr>
+          <w:p>
+            <w:pPr>
+              <w:spacing w:before="40" w:after="40"/>
+            </w:pPr>
+            <w:r>
+              <w:rPr>
+                <w:b/>
+                <w:sz w:val="18"/>
+              </w:rPr>
+              <w:t xml:space="preserve">#</w:t>
+            </w:r>
+          </w:p>
+        </w:tc>
+        <w:tc>
+          <w:tcPr>
+            <w:tcW w:w="2520" w:type="dxa"/>
+            <w:shd w:val="clear" w:color="auto" w:fill="EFF1F3"/>
+          </w:tcPr>
+          <w:p>
+            <w:pPr>
+              <w:spacing w:before="40" w:after="40"/>
+            </w:pPr>
+            <w:r>
+              <w:rPr>
+                <w:b/>
+                <w:sz w:val="18"/>
+              </w:rPr>
+              <w:t xml:space="preserve">Theme</w:t>
+            </w:r>
+          </w:p>
+        </w:tc>
+        <w:tc>
+          <w:tcPr>
+            <w:tcW w:w="2520" w:type="dxa"/>
+            <w:shd w:val="clear" w:color="auto" w:fill="EFF1F3"/>
+          </w:tcPr>
+          <w:p>
+            <w:pPr>
+              <w:spacing w:before="40" w:after="40"/>
+            </w:pPr>
+            <w:r>
+              <w:rPr>
+                <w:b/>
+                <w:sz w:val="18"/>
+              </w:rPr>
+              <w:t xml:space="preserve">Where it shows up</w:t>
+            </w:r>
+          </w:p>
+        </w:tc>
+        <w:tc>
+          <w:tcPr>
+            <w:tcW w:w="2520" w:type="dxa"/>
+            <w:shd w:val="clear" w:color="auto" w:fill="EFF1F3"/>
+          </w:tcPr>
+          <w:p>
+            <w:pPr>
+              <w:spacing w:before="40" w:after="40"/>
+            </w:pPr>
+            <w:r>
+              <w:rPr>
+                <w:b/>
+                <w:sz w:val="18"/>
+              </w:rPr>
+              <w:t xml:space="preserve">Type</w:t>
+            </w:r>
+          </w:p>
+        </w:tc>
+      </w:tr>
+      <w:tr>
+        <w:tc>
+          <w:tcPr>
+            <w:tcW w:w="2520" w:type="dxa"/>
+          </w:tcPr>
+          <w:p>
+            <w:pPr>
+              <w:spacing w:before="40" w:after="40"/>
+            </w:pPr>
+            <w:r>
+              <w:rPr>
+                <w:sz w:val="18"/>
+              </w:rPr>
+              <w:t xml:space="preserve">1</w:t>
+            </w:r>
+          </w:p>
+        </w:tc>
+        <w:tc>
+          <w:tcPr>
+            <w:tcW w:w="2520" w:type="dxa"/>
+          </w:tcPr>
+          <w:p>
+            <w:pPr>
+              <w:spacing w:before="40" w:after="40"/>
+            </w:pPr>
+            <w:r>
+              <w:rPr>
+                <w:b/>
+                <w:sz w:val="18"/>
+              </w:rPr>
+              <w:t xml:space="preserve">Monetization changes — ads, passes, pay-to-win</w:t>
+            </w:r>
+          </w:p>
+        </w:tc>
+        <w:tc>
+          <w:tcPr>
+            <w:tcW w:w="2520" w:type="dxa"/>
+          </w:tcPr>
+          <w:p>
+            <w:pPr>
+              <w:spacing w:before="40" w:after="40"/>
+            </w:pPr>
+            <w:r>
+              <w:rPr>
+                <w:b/>
+                <w:sz w:val="18"/>
+              </w:rPr>
+              <w:t xml:space="preserve">29% of mobile reviews (61/213)</w:t>
+            </w:r>
+          </w:p>
+        </w:tc>
+        <w:tc>
+          <w:tcPr>
+            <w:tcW w:w="2520" w:type="dxa"/>
+          </w:tcPr>
+          <w:p>
+            <w:pPr>
+              <w:spacing w:before="40" w:after="40"/>
+            </w:pPr>
+            <w:r>
+              <w:rPr>
+                <w:b/>
+                <w:sz w:val="18"/>
+              </w:rPr>
+              <w:t xml:space="preserve">Pricing</w:t>
+            </w:r>
+          </w:p>
+        </w:tc>
+      </w:tr>
+      <w:tr>
+        <w:tc>
+          <w:tcPr>
+            <w:tcW w:w="2520" w:type="dxa"/>
+          </w:tcPr>
+          <w:p>
+            <w:pPr>
+              <w:spacing w:before="40" w:after="40"/>
+            </w:pPr>
+            <w:r>
+              <w:rPr>
+                <w:sz w:val="18"/>
+              </w:rPr>
+              <w:t xml:space="preserve">2</w:t>
+            </w:r>
+          </w:p>
+        </w:tc>
+        <w:tc>
+          <w:tcPr>
+            <w:tcW w:w="2520" w:type="dxa"/>
+          </w:tcPr>
+          <w:p>
+            <w:pPr>
+              <w:spacing w:before="40" w:after="40"/>
+            </w:pPr>
+            <w:r>
+              <w:rPr>
+                <w:b/>
+                <w:sz w:val="18"/>
+              </w:rPr>
+              <w:t xml:space="preserve">Trade and negotiation AI is unrealistic</w:t>
+            </w:r>
+          </w:p>
+        </w:tc>
+        <w:tc>
+          <w:tcPr>
+            <w:tcW w:w="2520" w:type="dxa"/>
+          </w:tcPr>
+          <w:p>
+            <w:pPr>
+              <w:spacing w:before="40" w:after="40"/>
+            </w:pPr>
+            <w:r>
+              <w:rPr>
+                <w:b/>
+                <w:sz w:val="18"/>
+              </w:rPr>
+              <w:t xml:space="preserve">35% of mobile reviews (74/213)</w:t>
+            </w:r>
+            <w:r>
+              <w:rPr>
+                <w:sz w:val="18"/>
+              </w:rPr>
+              <w:t xml:space="preserve">; the top franchise complaint on Steam</w:t>
+            </w:r>
+          </w:p>
+        </w:tc>
+        <w:tc>
+          <w:tcPr>
+            <w:tcW w:w="2520" w:type="dxa"/>
+          </w:tcPr>
+          <w:p>
+            <w:pPr>
+              <w:spacing w:before="40" w:after="40"/>
+            </w:pPr>
+            <w:r>
+              <w:rPr>
+                <w:sz w:val="18"/>
+              </w:rPr>
+              <w:t xml:space="preserve">Product</w:t>
+            </w:r>
+          </w:p>
+        </w:tc>
+      </w:tr>
+      <w:tr>
+        <w:tc>
+          <w:tcPr>
+            <w:tcW w:w="2520" w:type="dxa"/>
+          </w:tcPr>
+          <w:p>
+            <w:pPr>
+              <w:spacing w:before="40" w:after="40"/>
+            </w:pPr>
+            <w:r>
+              <w:rPr>
+                <w:sz w:val="18"/>
+              </w:rPr>
+              <w:t xml:space="preserve">3</w:t>
+            </w:r>
+          </w:p>
+        </w:tc>
+        <w:tc>
+          <w:tcPr>
+            <w:tcW w:w="2520" w:type="dxa"/>
+          </w:tcPr>
+          <w:p>
+            <w:pPr>
+              <w:spacing w:before="40" w:after="40"/>
+            </w:pPr>
+            <w:r>
+              <w:rPr>
+                <w:b/>
+                <w:sz w:val="18"/>
+              </w:rPr>
+              <w:t xml:space="preserve">You can't actually propose a deal</w:t>
+            </w:r>
+          </w:p>
+        </w:tc>
+        <w:tc>
+          <w:tcPr>
+            <w:tcW w:w="2520" w:type="dxa"/>
+          </w:tcPr>
+          <w:p>
+            <w:pPr>
+              <w:spacing w:before="40" w:after="40"/>
+            </w:pPr>
+            <w:r>
+              <w:rPr>
+                <w:sz w:val="18"/>
+              </w:rPr>
+              <w:t xml:space="preserve">Steam + mobile, repeated</w:t>
+            </w:r>
+          </w:p>
+        </w:tc>
+        <w:tc>
+          <w:tcPr>
+            <w:tcW w:w="2520" w:type="dxa"/>
+          </w:tcPr>
+          <w:p>
+            <w:pPr>
+              <w:spacing w:before="40" w:after="40"/>
+            </w:pPr>
+            <w:r>
+              <w:rPr>
+                <w:sz w:val="18"/>
+              </w:rPr>
+              <w:t xml:space="preserve">Product</w:t>
+            </w:r>
+          </w:p>
+        </w:tc>
+      </w:tr>
+      <w:tr>
+        <w:tc>
+          <w:tcPr>
+            <w:tcW w:w="2520" w:type="dxa"/>
+          </w:tcPr>
+          <w:p>
+            <w:pPr>
+              <w:spacing w:before="40" w:after="40"/>
+            </w:pPr>
+            <w:r>
+              <w:rPr>
+                <w:sz w:val="18"/>
+              </w:rPr>
+              <w:t xml:space="preserve">4</w:t>
+            </w:r>
+          </w:p>
+        </w:tc>
+        <w:tc>
+          <w:tcPr>
+            <w:tcW w:w="2520" w:type="dxa"/>
+          </w:tcPr>
+          <w:p>
+            <w:pPr>
+              <w:spacing w:before="40" w:after="40"/>
+            </w:pPr>
+            <w:r>
+              <w:rPr>
+                <w:b/>
+                <w:sz w:val="18"/>
+              </w:rPr>
+              <w:t xml:space="preserve">Negotiation is a menu or a text box</w:t>
+            </w:r>
+          </w:p>
+        </w:tc>
+        <w:tc>
+          <w:tcPr>
+            <w:tcW w:w="2520" w:type="dxa"/>
+          </w:tcPr>
+          <w:p>
+            <w:pPr>
+              <w:spacing w:before="40" w:after="40"/>
+            </w:pPr>
+            <w:r>
+              <w:rPr>
+                <w:sz w:val="18"/>
+              </w:rPr>
+              <w:t xml:space="preserve">Steam, Football Manager</w:t>
+            </w:r>
+          </w:p>
+        </w:tc>
+        <w:tc>
+          <w:tcPr>
+            <w:tcW w:w="2520" w:type="dxa"/>
+          </w:tcPr>
+          <w:p>
+            <w:pPr>
+              <w:spacing w:before="40" w:after="40"/>
+            </w:pPr>
+            <w:r>
+              <w:rPr>
+                <w:sz w:val="18"/>
+              </w:rPr>
+              <w:t xml:space="preserve">Product</w:t>
+            </w:r>
+          </w:p>
+        </w:tc>
+      </w:tr>
+      <w:tr>
+        <w:tc>
+          <w:tcPr>
+            <w:tcW w:w="2520" w:type="dxa"/>
+          </w:tcPr>
+          <w:p>
+            <w:pPr>
+              <w:spacing w:before="40" w:after="40"/>
+            </w:pPr>
+            <w:r>
+              <w:rPr>
+                <w:sz w:val="18"/>
+              </w:rPr>
+              <w:t xml:space="preserve">5</w:t>
+            </w:r>
+          </w:p>
+        </w:tc>
+        <w:tc>
+          <w:tcPr>
+            <w:tcW w:w="2520" w:type="dxa"/>
+          </w:tcPr>
+          <w:p>
+            <w:pPr>
+              <w:spacing w:before="40" w:after="40"/>
+            </w:pPr>
+            <w:r>
+              <w:rPr>
+                <w:b/>
+                <w:sz w:val="18"/>
+              </w:rPr>
+              <w:t xml:space="preserve">The cap and the rules break</w:t>
+            </w:r>
+          </w:p>
+        </w:tc>
+        <w:tc>
+          <w:tcPr>
+            <w:tcW w:w="2520" w:type="dxa"/>
+          </w:tcPr>
+          <w:p>
+            <w:pPr>
+              <w:spacing w:before="40" w:after="40"/>
+            </w:pPr>
+            <w:r>
+              <w:rPr>
+                <w:sz w:val="18"/>
+              </w:rPr>
+              <w:t xml:space="preserve">Steam + mobile</w:t>
+            </w:r>
+          </w:p>
+        </w:tc>
+        <w:tc>
+          <w:tcPr>
+            <w:tcW w:w="2520" w:type="dxa"/>
+          </w:tcPr>
+          <w:p>
+            <w:pPr>
+              <w:spacing w:before="40" w:after="40"/>
+            </w:pPr>
+            <w:r>
+              <w:rPr>
+                <w:sz w:val="18"/>
+              </w:rPr>
+              <w:t xml:space="preserve">Product</w:t>
+            </w:r>
+          </w:p>
+        </w:tc>
+      </w:tr>
+      <w:tr>
+        <w:tc>
+          <w:tcPr>
+            <w:tcW w:w="2520" w:type="dxa"/>
+          </w:tcPr>
+          <w:p>
+            <w:pPr>
+              <w:spacing w:before="40" w:after="40"/>
+            </w:pPr>
+            <w:r>
+              <w:rPr>
+                <w:sz w:val="18"/>
+              </w:rPr>
+              <w:t xml:space="preserve">6</w:t>
+            </w:r>
+          </w:p>
+        </w:tc>
+        <w:tc>
+          <w:tcPr>
+            <w:tcW w:w="2520" w:type="dxa"/>
+          </w:tcPr>
+          <w:p>
+            <w:pPr>
+              <w:spacing w:before="40" w:after="40"/>
+            </w:pPr>
+            <w:r>
+              <w:rPr>
+                <w:b/>
+                <w:sz w:val="18"/>
+              </w:rPr>
+              <w:t xml:space="preserve">AI scoring can't be trusted</w:t>
+            </w:r>
+          </w:p>
+        </w:tc>
+        <w:tc>
+          <w:tcPr>
+            <w:tcW w:w="2520" w:type="dxa"/>
+          </w:tcPr>
+          <w:p>
+            <w:pPr>
+              <w:spacing w:before="40" w:after="40"/>
+            </w:pPr>
+            <w:r>
+              <w:rPr>
+                <w:sz w:val="18"/>
+              </w:rPr>
+              <w:t xml:space="preserve">AI-trainer analog</w:t>
+            </w:r>
+          </w:p>
+        </w:tc>
+        <w:tc>
+          <w:tcPr>
+            <w:tcW w:w="2520" w:type="dxa"/>
+          </w:tcPr>
+          <w:p>
+            <w:pPr>
+              <w:spacing w:before="40" w:after="40"/>
+            </w:pPr>
+            <w:r>
+              <w:rPr>
+                <w:sz w:val="18"/>
+              </w:rPr>
+              <w:t xml:space="preserve">Product</w:t>
+            </w:r>
+          </w:p>
+        </w:tc>
+      </w:tr>
+    </w:tbl>
+    <w:p>
+      <w:pPr>
+        <w:spacing w:after="0"/>
+      </w:pPr>
+    </w:p>
+    <w:p>
+      <w:r>
+        <w:rPr>
+          <w:b/>
+        </w:rPr>
+        <w:t xml:space="preserve">Split: one clear pricing theme, five product themes.</w:t>
+      </w:r>
+      <w:r>
+        <w:t xml:space="preserve"> But note the ordering — </w:t>
+      </w:r>
+      <w:r>
+        <w:rPr>
+          <w:b/>
+        </w:rPr>
+        <w:t xml:space="preserve">the loudest complaints in the whole set are about money, not about deal-making.</w:t>
+      </w:r>
+    </w:p>
+    <w:p>
+      <w:pPr>
+        <w:pBdr>
+          <w:bottom w:val="single" w:sz="6" w:space="6" w:color="C9CCD1"/>
+        </w:pBdr>
+      </w:pPr>
+    </w:p>
+    <w:p>
+      <w:pPr>
+        <w:pStyle w:val="Heading2"/>
+      </w:pPr>
+      <w:r>
+        <w:t xml:space="preserve">Theme 1 — Monetization changes — 61/213 mobile reviews (29%) — </w:t>
+      </w:r>
+      <w:r>
+        <w:rPr>
+          <w:b/>
+        </w:rPr>
+        <w:t xml:space="preserve">PRICING problem</w:t>
+      </w:r>
+    </w:p>
+    <w:p>
+      <w:r>
+        <w:t xml:space="preserve">Franchise Hockey: Pro GM changed its monetization in late summer 2026 and its review page collapsed. Roughly a dozen one-star reviews in the first ten days of September 2026 alone.</w:t>
+      </w:r>
+    </w:p>
+    <w:p>
+      <w:r>
+        <w:t xml:space="preserve">1. **Franchise Hockey: Pro GM, 1★, Sept 10 2026 (*Easygoing 10*)** — the latest update makes you watch ads for everything; after years of playing they're considering deleting it, and note the developer's reply admitted things that were free are now behind paywalls or ad walls. (</w:t>
+      </w:r>
+      <w:hyperlink r:id="rHl25">
+        <w:r>
+          <w:rPr>
+            <w:rStyle w:val="Hyperlink"/>
+          </w:rPr>
+          <w:t xml:space="preserve">App Store</w:t>
+        </w:r>
+      </w:hyperlink>
+      <w:r>
+        <w:t xml:space="preserve">)</w:t>
+      </w:r>
+    </w:p>
+    <w:p>
+      <w:r>
+        <w:t xml:space="preserve">2. **Franchise Hockey: Pro GM, 1★, Sept 5 2026 (*Dherman718*)** — minute-long ads now required for training and packs that used to be instant, on top of a $4 subscription.</w:t>
+      </w:r>
+    </w:p>
+    <w:p>
+      <w:r>
+        <w:t xml:space="preserve">3. **FM26 Mobile, 1★, Aug 31 2026 (*wkjshdhebwksuabdbbfdkh*)** — requires a ~$20/month Netflix subscription to play; listing it as "free" is called a lie. (</w:t>
+      </w:r>
+      <w:hyperlink r:id="rHl26">
+        <w:r>
+          <w:rPr>
+            <w:rStyle w:val="Hyperlink"/>
+          </w:rPr>
+          <w:t xml:space="preserve">App Store</w:t>
+        </w:r>
+      </w:hyperlink>
+      <w:r>
+        <w:t xml:space="preserve">)</w:t>
+      </w:r>
+    </w:p>
+    <w:p>
+      <w:pPr>
+        <w:ind w:left="360"/>
+        <w:pBdr>
+          <w:left w:val="single" w:sz="18" w:space="8" w:color="9AA0A6"/>
+        </w:pBdr>
+      </w:pPr>
+      <w:r>
+        <w:rPr>
+          <w:b/>
+        </w:rPr>
+        <w:t xml:space="preserve">Also:</w:t>
+      </w:r>
+      <w:r>
+        <w:t xml:space="preserve"> Ultimate Pro Basketball GM, 1★, Jul 28 2026 (*Lilkd1233*) — bought the premium edition and still </w:t>
+      </w:r>
+      <w:r>
+        <w:rPr>
+          <w:b/>
+        </w:rPr>
+        <w:t xml:space="preserve">"can't even make trades without TP"</w:t>
+      </w:r>
+      <w:r>
+        <w:t xml:space="preserve"> (the in-game currency). </w:t>
+      </w:r>
+      <w:r>
+        <w:rPr>
+          <w:b/>
+        </w:rPr>
+        <w:t xml:space="preserve">That is the negotiation itself being paywalled.</w:t>
+      </w:r>
+    </w:p>
+    <w:p>
+      <w:pPr>
+        <w:pBdr>
+          <w:bottom w:val="single" w:sz="6" w:space="6" w:color="C9CCD1"/>
+        </w:pBdr>
+      </w:pPr>
+    </w:p>
+    <w:p>
+      <w:pPr>
+        <w:pStyle w:val="Heading2"/>
+      </w:pPr>
+      <w:r>
+        <w:t xml:space="preserve">Theme 2 — Trade and negotiation AI is unrealistic — 74/213 mobile (35%), and the top franchise complaint on Steam — </w:t>
+      </w:r>
+      <w:r>
+        <w:rPr>
+          <w:b/>
+        </w:rPr>
+        <w:t xml:space="preserve">PRODUCT problem</w:t>
+      </w:r>
+    </w:p>
+    <w:p>
+      <w:r>
+        <w:t xml:space="preserve">1. </w:t>
+      </w:r>
+      <w:r>
+        <w:rPr>
+          <w:b/>
+        </w:rPr>
+        <w:t xml:space="preserve">Franchise Hockey Manager 12, Jun 1 2026, 187h, +14 (Steam)</w:t>
+      </w:r>
+      <w:r>
+        <w:t xml:space="preserve"> — the AI "makes the dumbest trades in history and will also offer you pennies on the dollar"; a point-per-game star drew a </w:t>
+      </w:r>
+      <w:r>
+        <w:rPr>
+          <w:b/>
+        </w:rPr>
+        <w:t xml:space="preserve">7th-round pick</w:t>
+      </w:r>
+      <w:r>
+        <w:t xml:space="preserve">. (</w:t>
+      </w:r>
+      <w:hyperlink r:id="rHl15">
+        <w:r>
+          <w:rPr>
+            <w:rStyle w:val="Hyperlink"/>
+          </w:rPr>
+          <w:t xml:space="preserve">Steam</w:t>
+        </w:r>
+      </w:hyperlink>
+      <w:r>
+        <w:t xml:space="preserve">)</w:t>
+      </w:r>
+    </w:p>
+    <w:p>
+      <w:r>
+        <w:t xml:space="preserve">2. </w:t>
+      </w:r>
+      <w:r>
+        <w:rPr>
+          <w:b/>
+        </w:rPr>
+        <w:t xml:space="preserve">OOTP 26, Jan 26 2026 (Steam)</w:t>
+      </w:r>
+      <w:r>
+        <w:t xml:space="preserve"> — returned after two years hoping the trade engine had improved; top players are still traded </w:t>
+      </w:r>
+      <w:r>
+        <w:rPr>
+          <w:b/>
+        </w:rPr>
+        <w:t xml:space="preserve">with 100% salary retention for scrap prospects</w:t>
+      </w:r>
+      <w:r>
+        <w:t xml:space="preserve"> — "completely breaks the immersion."</w:t>
+      </w:r>
+    </w:p>
+    <w:p>
+      <w:r>
+        <w:t xml:space="preserve">3. **Ultimate Pro Basketball GM, 1★, Mar 21 2026 (*TheMarshEffect*)** — "The trades are super one sided… A great concept to bring to phones just a horrible execution." (</w:t>
+      </w:r>
+      <w:hyperlink r:id="rHl27">
+        <w:r>
+          <w:rPr>
+            <w:rStyle w:val="Hyperlink"/>
+          </w:rPr>
+          <w:t xml:space="preserve">App Store</w:t>
+        </w:r>
+      </w:hyperlink>
+      <w:r>
+        <w:t xml:space="preserve">)</w:t>
+      </w:r>
+    </w:p>
+    <w:p>
+      <w:pPr>
+        <w:ind w:left="360"/>
+        <w:pBdr>
+          <w:left w:val="single" w:sz="18" w:space="8" w:color="9AA0A6"/>
+        </w:pBdr>
+      </w:pPr>
+      <w:r>
+        <w:rPr>
+          <w:b/>
+        </w:rPr>
+        <w:t xml:space="preserve">Also:</w:t>
+      </w:r>
+      <w:r>
+        <w:t xml:space="preserve"> MockOut (NFL draft sim), 3★, Apr 1 2025 (*MoMentum 100*) — wants the app to </w:t>
+      </w:r>
+      <w:r>
+        <w:rPr>
+          <w:b/>
+        </w:rPr>
+        <w:t xml:space="preserve">"use the NFL trade charts to validate trades"</w:t>
+      </w:r>
+      <w:r>
+        <w:t xml:space="preserve"> rather than produce implausible ones. </w:t>
+      </w:r>
+      <w:r>
+        <w:rPr>
+          <w:b/>
+        </w:rPr>
+        <w:t xml:space="preserve">That reviewer is asking for exactly the leverage model your app proposes.</w:t>
+      </w:r>
+    </w:p>
+    <w:p>
+      <w:pPr>
+        <w:pBdr>
+          <w:bottom w:val="single" w:sz="6" w:space="6" w:color="C9CCD1"/>
+        </w:pBdr>
+      </w:pPr>
+    </w:p>
+    <w:p>
+      <w:pPr>
+        <w:pStyle w:val="Heading2"/>
+      </w:pPr>
+      <w:r>
+        <w:t xml:space="preserve">Theme 3 — You can't actually propose a deal — </w:t>
+      </w:r>
+      <w:r>
+        <w:rPr>
+          <w:b/>
+        </w:rPr>
+        <w:t xml:space="preserve">PRODUCT problem</w:t>
+      </w:r>
+    </w:p>
+    <w:p>
+      <w:r>
+        <w:t xml:space="preserve">The single most on-point theme for this project: the products don't let the user *make an offer*.</w:t>
+      </w:r>
+    </w:p>
+    <w:p>
+      <w:r>
+        <w:t xml:space="preserve">1. </w:t>
+      </w:r>
+      <w:r>
+        <w:rPr>
+          <w:b/>
+        </w:rPr>
+        <w:t xml:space="preserve">Front Office Football Nine, Dec 15 2025, +8 (Steam)</w:t>
+      </w:r>
+      <w:r>
+        <w:t xml:space="preserve"> — "</w:t>
+      </w:r>
+      <w:r>
+        <w:rPr>
+          <w:b/>
+        </w:rPr>
+        <w:t xml:space="preserve">You are unable to actually create your own trades</w:t>
+      </w:r>
+      <w:r>
+        <w:t xml:space="preserve"> — you simply select a team and a draft pick/player, then hit [a button]." Teams with 100% interest and the assets still can't complete the deal. (</w:t>
+      </w:r>
+      <w:hyperlink r:id="rHl17">
+        <w:r>
+          <w:rPr>
+            <w:rStyle w:val="Hyperlink"/>
+          </w:rPr>
+          <w:t xml:space="preserve">Steam</w:t>
+        </w:r>
+      </w:hyperlink>
+      <w:r>
+        <w:t xml:space="preserve">)</w:t>
+      </w:r>
+    </w:p>
+    <w:p>
+      <w:r>
+        <w:t xml:space="preserve">2. **MockOut, 2★, Apr 14 2025 (*BrockSlibun*)</w:t>
+      </w:r>
+      <w:r>
+        <w:rPr>
+          <w:b/>
+        </w:rPr>
+        <w:t xml:space="preserve"> — "This app was outstanding until suddenly I </w:t>
+      </w:r>
+      <w:r>
+        <w:t xml:space="preserve">can't force trades** in my mock drafts anymore… with forced trades it is a five star app."</w:t>
+      </w:r>
+    </w:p>
+    <w:p>
+      <w:r>
+        <w:t xml:space="preserve">3. </w:t>
+      </w:r>
+      <w:r>
+        <w:rPr>
+          <w:b/>
+        </w:rPr>
+        <w:t xml:space="preserve">Madden NFL 26, Apr 21 2026, 392h, +52 (Steam)</w:t>
+      </w:r>
+      <w:r>
+        <w:t xml:space="preserve"> — </w:t>
+      </w:r>
+      <w:r>
+        <w:rPr>
+          <w:b/>
+        </w:rPr>
+        <w:t xml:space="preserve">GM mode was removed after purchase</w:t>
+      </w:r>
+      <w:r>
+        <w:t xml:space="preserve">: "They took away GM Mode... AFTER I PAID $70 FOR THIS GAME."</w:t>
+      </w:r>
+    </w:p>
+    <w:p>
+      <w:pPr>
+        <w:pBdr>
+          <w:bottom w:val="single" w:sz="6" w:space="6" w:color="C9CCD1"/>
+        </w:pBdr>
+      </w:pPr>
+    </w:p>
+    <w:p>
+      <w:pPr>
+        <w:pStyle w:val="Heading2"/>
+      </w:pPr>
+      <w:r>
+        <w:t xml:space="preserve">Theme 4 — Negotiation is a menu or a text box — </w:t>
+      </w:r>
+      <w:r>
+        <w:rPr>
+          <w:b/>
+        </w:rPr>
+        <w:t xml:space="preserve">PRODUCT problem</w:t>
+      </w:r>
+    </w:p>
+    <w:p>
+      <w:r>
+        <w:t xml:space="preserve">1. </w:t>
+      </w:r>
+      <w:r>
+        <w:rPr>
+          <w:b/>
+        </w:rPr>
+        <w:t xml:space="preserve">Football Manager 26, Aug 23 2026, 191h, +33 (Steam)</w:t>
+      </w:r>
+      <w:r>
+        <w:t xml:space="preserve"> — interviews, meetings, </w:t>
+      </w:r>
+      <w:r>
+        <w:rPr>
+          <w:b/>
+        </w:rPr>
+        <w:t xml:space="preserve">contract negotiations</w:t>
+      </w:r>
+      <w:r>
+        <w:t xml:space="preserve"> and press conferences are "all done by text message," which makes it "sterile" and "just serves to remind me that I'm playing a fancy spreadsheet." (</w:t>
+      </w:r>
+      <w:hyperlink r:id="rHl13">
+        <w:r>
+          <w:rPr>
+            <w:rStyle w:val="Hyperlink"/>
+          </w:rPr>
+          <w:t xml:space="preserve">Steam</w:t>
+        </w:r>
+      </w:hyperlink>
+      <w:r>
+        <w:t xml:space="preserve">)</w:t>
+      </w:r>
+    </w:p>
+    <w:p>
+      <w:r>
+        <w:t xml:space="preserve">2. </w:t>
+      </w:r>
+      <w:r>
+        <w:rPr>
+          <w:b/>
+        </w:rPr>
+        <w:t xml:space="preserve">Front Office Football Nine, Oct 22 2025, +18 (Steam)</w:t>
+      </w:r>
+      <w:r>
+        <w:t xml:space="preserve"> — "feels more like an </w:t>
+      </w:r>
+      <w:r>
+        <w:rPr>
+          <w:b/>
+        </w:rPr>
+        <w:t xml:space="preserve">Excel simulator</w:t>
+      </w:r>
+      <w:r>
+        <w:t xml:space="preserve"> than a game… text, stats, and endless clicking through confusing menus."</w:t>
+      </w:r>
+    </w:p>
+    <w:p>
+      <w:r>
+        <w:t xml:space="preserve">3. **Basketball Agent Manager Star, 3★, Dec 16 2025 (*Maxboogi3*)</w:t>
+      </w:r>
+      <w:r>
+        <w:rPr>
+          <w:b/>
+        </w:rPr>
+        <w:t xml:space="preserve"> — endorsement and </w:t>
+      </w:r>
+      <w:r>
+        <w:t xml:space="preserve">contract deals "need some work."** (</w:t>
+      </w:r>
+      <w:hyperlink r:id="rHl28">
+        <w:r>
+          <w:rPr>
+            <w:rStyle w:val="Hyperlink"/>
+          </w:rPr>
+          <w:t xml:space="preserve">App Store</w:t>
+        </w:r>
+      </w:hyperlink>
+      <w:r>
+        <w:t xml:space="preserve">)</w:t>
+      </w:r>
+    </w:p>
+    <w:p>
+      <w:r>
+        <w:rPr>
+          <w:b/>
+        </w:rPr>
+        <w:t xml:space="preserve">This theme is the premise of your app, stated by paying customers of the incumbents.</w:t>
+      </w:r>
+    </w:p>
+    <w:p>
+      <w:pPr>
+        <w:pBdr>
+          <w:bottom w:val="single" w:sz="6" w:space="6" w:color="C9CCD1"/>
+        </w:pBdr>
+      </w:pPr>
+    </w:p>
+    <w:p>
+      <w:pPr>
+        <w:pStyle w:val="Heading2"/>
+      </w:pPr>
+      <w:r>
+        <w:t xml:space="preserve">Theme 5 — The cap and the rules break — </w:t>
+      </w:r>
+      <w:r>
+        <w:rPr>
+          <w:b/>
+        </w:rPr>
+        <w:t xml:space="preserve">PRODUCT problem</w:t>
+      </w:r>
+    </w:p>
+    <w:p>
+      <w:r>
+        <w:t xml:space="preserve">1. </w:t>
+      </w:r>
+      <w:r>
+        <w:rPr>
+          <w:b/>
+        </w:rPr>
+        <w:t xml:space="preserve">Football Manager 26, Sept 13 2026, 154h (Steam)</w:t>
+      </w:r>
+      <w:r>
+        <w:t xml:space="preserve"> — an MLS </w:t>
+      </w:r>
+      <w:r>
+        <w:rPr>
+          <w:b/>
+        </w:rPr>
+        <w:t xml:space="preserve">salary-cap bug during contract negotiations</w:t>
+      </w:r>
+      <w:r>
+        <w:t xml:space="preserve">: the Budget Adjustments screen shows incorrect figures and fails to recognise available GAM/TAM, making the negotiation unusable.</w:t>
+      </w:r>
+    </w:p>
+    <w:p>
+      <w:r>
+        <w:t xml:space="preserve">2. **Pocket GM: Basketball Sim, 2★, Jan 15 2026 (*Bdon022*)</w:t>
+      </w:r>
+      <w:r>
+        <w:rPr>
+          <w:b/>
+        </w:rPr>
+        <w:t xml:space="preserve"> — 10–15 seasons in, salaries max out every team's cap, so top free agents go unsigned and </w:t>
+      </w:r>
+      <w:r>
+        <w:t xml:space="preserve">trades become near impossible**. (</w:t>
+      </w:r>
+      <w:hyperlink r:id="rHl29">
+        <w:r>
+          <w:rPr>
+            <w:rStyle w:val="Hyperlink"/>
+          </w:rPr>
+          <w:t xml:space="preserve">App Store</w:t>
+        </w:r>
+      </w:hyperlink>
+      <w:r>
+        <w:t xml:space="preserve">)</w:t>
+      </w:r>
+    </w:p>
+    <w:p>
+      <w:r>
+        <w:t xml:space="preserve">3. **Ultimate Pro Basketball GM, 1★, Mar 21 2026 (*TheMarshEffect*)** — "How do I compete with teams who have over 200mil in players while I'm limited to 130m cap space?"</w:t>
+      </w:r>
+    </w:p>
+    <w:p>
+      <w:r>
+        <w:rPr>
+          <w:b/>
+        </w:rPr>
+        <w:t xml:space="preserve">If the cap maths is wrong, the practice is worthless — you are teaching leverage against a broken rulebook.</w:t>
+      </w:r>
+    </w:p>
+    <w:p>
+      <w:pPr>
+        <w:pBdr>
+          <w:bottom w:val="single" w:sz="6" w:space="6" w:color="C9CCD1"/>
+        </w:pBdr>
+      </w:pPr>
+    </w:p>
+    <w:p>
+      <w:pPr>
+        <w:pStyle w:val="Heading2"/>
+      </w:pPr>
+      <w:r>
+        <w:t xml:space="preserve">Theme 6 — AI scoring can't be trusted — </w:t>
+      </w:r>
+      <w:r>
+        <w:rPr>
+          <w:b/>
+        </w:rPr>
+        <w:t xml:space="preserve">PRODUCT problem, and the one to worry about</w:t>
+      </w:r>
+    </w:p>
+    <w:p>
+      <w:r>
+        <w:t xml:space="preserve">Only two reviews exist for the AI-trainer analog, but one is devastating:</w:t>
+      </w:r>
+    </w:p>
+    <w:p>
+      <w:r>
+        <w:t xml:space="preserve">1. **CoachCraft: AI Sales Trainer, 1★, Dec 11 2025 (*JKRNH*)</w:t>
+      </w:r>
+      <w:r>
+        <w:rPr>
+          <w:b/>
+        </w:rPr>
+        <w:t xml:space="preserve"> — "Did one lesson. </w:t>
+      </w:r>
+      <w:r>
+        <w:t xml:space="preserve">Did a poor job on purpose. It said I did great.**" (</w:t>
+      </w:r>
+      <w:hyperlink r:id="rHl30">
+        <w:r>
+          <w:rPr>
+            <w:rStyle w:val="Hyperlink"/>
+          </w:rPr>
+          <w:t xml:space="preserve">App Store</w:t>
+        </w:r>
+      </w:hyperlink>
+      <w:r>
+        <w:t xml:space="preserve">)</w:t>
+      </w:r>
+    </w:p>
+    <w:p>
+      <w:r>
+        <w:t xml:space="preserve">2. **CoachCraft, 1★, Dec 5 2025 (*CarloskiDaGreat*)** — the app never got past the first screen after signup.</w:t>
+      </w:r>
+    </w:p>
+    <w:p>
+      <w:r>
+        <w:rPr>
+          <w:b/>
+        </w:rPr>
+        <w:t xml:space="preserve">An AI trainer that praises a deliberately bad performance is worse than no trainer</w:t>
+      </w:r>
+      <w:r>
+        <w:t xml:space="preserve"> — and if your product's value is "prove the skill," that single failure mode destroys the entire proposition.</w:t>
+      </w:r>
+    </w:p>
+    <w:p>
+      <w:pPr>
+        <w:pBdr>
+          <w:bottom w:val="single" w:sz="6" w:space="6" w:color="C9CCD1"/>
+        </w:pBdr>
+      </w:pPr>
+    </w:p>
+    <w:p>
+      <w:pPr>
+        <w:pStyle w:val="Heading1"/>
+      </w:pPr>
+      <w:r>
+        <w:t xml:space="preserve">What companies pay humans to negotiate sports deals</w:t>
+      </w:r>
+    </w:p>
+    <w:p>
+      <w:pPr>
+        <w:pStyle w:val="Heading2"/>
+      </w:pPr>
+      <w:r>
+        <w:t xml:space="preserve">The commission structure — what the work is actually worth</w:t>
+      </w:r>
+    </w:p>
+    <w:tbl>
+      <w:tblPr>
+        <w:tblW w:w="10080" w:type="dxa"/>
+        <w:tblBorders>
+          <w:top w:val="single" w:sz="4" w:space="0" w:color="C9CCD1"/>
+          <w:left w:val="single" w:sz="4" w:space="0" w:color="C9CCD1"/>
+          <w:bottom w:val="single" w:sz="4" w:space="0" w:color="C9CCD1"/>
+          <w:right w:val="single" w:sz="4" w:space="0" w:color="C9CCD1"/>
+          <w:insideH w:val="single" w:sz="4" w:space="0" w:color="C9CCD1"/>
+          <w:insideV w:val="single" w:sz="4" w:space="0" w:color="C9CCD1"/>
+        </w:tblBorders>
+        <w:tblLayout w:type="fixed"/>
+      </w:tblPr>
+      <w:tblGrid>
+        <w:gridCol w:w="3360"/>
+        <w:gridCol w:w="3360"/>
+        <w:gridCol w:w="3360"/>
+      </w:tblGrid>
+      <w:tr>
+        <w:trPr>
+          <w:tblHeader/>
+        </w:trPr>
+        <w:tc>
+          <w:tcPr>
+            <w:tcW w:w="3360" w:type="dxa"/>
+            <w:shd w:val="clear" w:color="auto" w:fill="EFF1F3"/>
+          </w:tcPr>
+          <w:p>
+            <w:pPr>
+              <w:spacing w:before="40" w:after="40"/>
+            </w:pPr>
+            <w:r>
+              <w:rPr>
+                <w:b/>
+                <w:sz w:val="18"/>
+              </w:rPr>
+              <w:t xml:space="preserve">League</w:t>
+            </w:r>
+          </w:p>
+        </w:tc>
+        <w:tc>
+          <w:tcPr>
+            <w:tcW w:w="3360" w:type="dxa"/>
+            <w:shd w:val="clear" w:color="auto" w:fill="EFF1F3"/>
+          </w:tcPr>
+          <w:p>
+            <w:pPr>
+              <w:spacing w:before="40" w:after="40"/>
+            </w:pPr>
+            <w:r>
+              <w:rPr>
+                <w:b/>
+                <w:sz w:val="18"/>
+              </w:rPr>
+              <w:t xml:space="preserve">Agent commission on playing contracts</w:t>
+            </w:r>
+          </w:p>
+        </w:tc>
+        <w:tc>
+          <w:tcPr>
+            <w:tcW w:w="3360" w:type="dxa"/>
+            <w:shd w:val="clear" w:color="auto" w:fill="EFF1F3"/>
+          </w:tcPr>
+          <w:p>
+            <w:pPr>
+              <w:spacing w:before="40" w:after="40"/>
+            </w:pPr>
+            <w:r>
+              <w:rPr>
+                <w:b/>
+                <w:sz w:val="18"/>
+              </w:rPr>
+              <w:t xml:space="preserve">Source</w:t>
+            </w:r>
+          </w:p>
+        </w:tc>
+      </w:tr>
+      <w:tr>
+        <w:tc>
+          <w:tcPr>
+            <w:tcW w:w="3360" w:type="dxa"/>
+          </w:tcPr>
+          <w:p>
+            <w:pPr>
+              <w:spacing w:before="40" w:after="40"/>
+            </w:pPr>
+            <w:r>
+              <w:rPr>
+                <w:b/>
+                <w:sz w:val="18"/>
+              </w:rPr>
+              <w:t xml:space="preserve">NFL</w:t>
+            </w:r>
+          </w:p>
+        </w:tc>
+        <w:tc>
+          <w:tcPr>
+            <w:tcW w:w="3360" w:type="dxa"/>
+          </w:tcPr>
+          <w:p>
+            <w:pPr>
+              <w:spacing w:before="40" w:after="40"/>
+            </w:pPr>
+            <w:r>
+              <w:rPr>
+                <w:b/>
+                <w:sz w:val="18"/>
+              </w:rPr>
+              <w:t xml:space="preserve">Capped at 3%</w:t>
+            </w:r>
+            <w:r>
+              <w:rPr>
+                <w:sz w:val="18"/>
+              </w:rPr>
+              <w:t xml:space="preserve"> by the NFLPA</w:t>
+            </w:r>
+          </w:p>
+        </w:tc>
+        <w:tc>
+          <w:tcPr>
+            <w:tcW w:w="3360" w:type="dxa"/>
+          </w:tcPr>
+          <w:p>
+            <w:pPr>
+              <w:spacing w:before="40" w:after="40"/>
+            </w:pPr>
+            <w:hyperlink r:id="rHl31">
+              <w:r>
+                <w:rPr>
+                  <w:rStyle w:val="Hyperlink"/>
+                  <w:sz w:val="18"/>
+                </w:rPr>
+                <w:t xml:space="preserve">Front Office Sports</w:t>
+              </w:r>
+            </w:hyperlink>
+          </w:p>
+        </w:tc>
+      </w:tr>
+      <w:tr>
+        <w:tc>
+          <w:tcPr>
+            <w:tcW w:w="3360" w:type="dxa"/>
+          </w:tcPr>
+          <w:p>
+            <w:pPr>
+              <w:spacing w:before="40" w:after="40"/>
+            </w:pPr>
+            <w:r>
+              <w:rPr>
+                <w:b/>
+                <w:sz w:val="18"/>
+              </w:rPr>
+              <w:t xml:space="preserve">NBA</w:t>
+            </w:r>
+          </w:p>
+        </w:tc>
+        <w:tc>
+          <w:tcPr>
+            <w:tcW w:w="3360" w:type="dxa"/>
+          </w:tcPr>
+          <w:p>
+            <w:pPr>
+              <w:spacing w:before="40" w:after="40"/>
+            </w:pPr>
+            <w:r>
+              <w:rPr>
+                <w:b/>
+                <w:sz w:val="18"/>
+              </w:rPr>
+              <w:t xml:space="preserve">Capped at 4%</w:t>
+            </w:r>
+            <w:r>
+              <w:rPr>
+                <w:sz w:val="18"/>
+              </w:rPr>
+              <w:t xml:space="preserve"> by the NBPA; 3% common for established players</w:t>
+            </w:r>
+          </w:p>
+        </w:tc>
+        <w:tc>
+          <w:tcPr>
+            <w:tcW w:w="3360" w:type="dxa"/>
+          </w:tcPr>
+          <w:p>
+            <w:pPr>
+              <w:spacing w:before="40" w:after="40"/>
+            </w:pPr>
+            <w:hyperlink r:id="rHl31">
+              <w:r>
+                <w:rPr>
+                  <w:rStyle w:val="Hyperlink"/>
+                  <w:sz w:val="18"/>
+                </w:rPr>
+                <w:t xml:space="preserve">Front Office Sports</w:t>
+              </w:r>
+            </w:hyperlink>
+          </w:p>
+        </w:tc>
+      </w:tr>
+      <w:tr>
+        <w:tc>
+          <w:tcPr>
+            <w:tcW w:w="3360" w:type="dxa"/>
+          </w:tcPr>
+          <w:p>
+            <w:pPr>
+              <w:spacing w:before="40" w:after="40"/>
+            </w:pPr>
+            <w:r>
+              <w:rPr>
+                <w:b/>
+                <w:sz w:val="18"/>
+              </w:rPr>
+              <w:t xml:space="preserve">MLB</w:t>
+            </w:r>
+          </w:p>
+        </w:tc>
+        <w:tc>
+          <w:tcPr>
+            <w:tcW w:w="3360" w:type="dxa"/>
+          </w:tcPr>
+          <w:p>
+            <w:pPr>
+              <w:spacing w:before="40" w:after="40"/>
+            </w:pPr>
+            <w:r>
+              <w:rPr>
+                <w:b/>
+                <w:sz w:val="18"/>
+              </w:rPr>
+              <w:t xml:space="preserve">No cap</w:t>
+            </w:r>
+            <w:r>
+              <w:rPr>
+                <w:sz w:val="18"/>
+              </w:rPr>
+              <w:t xml:space="preserve">; 4–5% is the industry standard</w:t>
+            </w:r>
+          </w:p>
+        </w:tc>
+        <w:tc>
+          <w:tcPr>
+            <w:tcW w:w="3360" w:type="dxa"/>
+          </w:tcPr>
+          <w:p>
+            <w:pPr>
+              <w:spacing w:before="40" w:after="40"/>
+            </w:pPr>
+            <w:hyperlink r:id="rHl31">
+              <w:r>
+                <w:rPr>
+                  <w:rStyle w:val="Hyperlink"/>
+                  <w:sz w:val="18"/>
+                </w:rPr>
+                <w:t xml:space="preserve">Front Office Sports</w:t>
+              </w:r>
+            </w:hyperlink>
+          </w:p>
+        </w:tc>
+      </w:tr>
+      <w:tr>
+        <w:tc>
+          <w:tcPr>
+            <w:tcW w:w="3360" w:type="dxa"/>
+          </w:tcPr>
+          <w:p>
+            <w:pPr>
+              <w:spacing w:before="40" w:after="40"/>
+            </w:pPr>
+            <w:r>
+              <w:rPr>
+                <w:b/>
+                <w:sz w:val="18"/>
+              </w:rPr>
+              <w:t xml:space="preserve">Endorsements (all sports)</w:t>
+            </w:r>
+          </w:p>
+        </w:tc>
+        <w:tc>
+          <w:tcPr>
+            <w:tcW w:w="3360" w:type="dxa"/>
+          </w:tcPr>
+          <w:p>
+            <w:pPr>
+              <w:spacing w:before="40" w:after="40"/>
+            </w:pPr>
+            <w:r>
+              <w:rPr>
+                <w:b/>
+                <w:sz w:val="18"/>
+              </w:rPr>
+              <w:t xml:space="preserve">10–20%</w:t>
+            </w:r>
+            <w:r>
+              <w:rPr>
+                <w:sz w:val="18"/>
+              </w:rPr>
+              <w:t xml:space="preserve"> — unregulated, because the contract isn't with a team</w:t>
+            </w:r>
+          </w:p>
+        </w:tc>
+        <w:tc>
+          <w:tcPr>
+            <w:tcW w:w="3360" w:type="dxa"/>
+          </w:tcPr>
+          <w:p>
+            <w:pPr>
+              <w:spacing w:before="40" w:after="40"/>
+            </w:pPr>
+            <w:hyperlink r:id="rHl31">
+              <w:r>
+                <w:rPr>
+                  <w:rStyle w:val="Hyperlink"/>
+                  <w:sz w:val="18"/>
+                </w:rPr>
+                <w:t xml:space="preserve">Front Office Sports</w:t>
+              </w:r>
+            </w:hyperlink>
+          </w:p>
+        </w:tc>
+      </w:tr>
+    </w:tbl>
+    <w:p>
+      <w:pPr>
+        <w:spacing w:after="0"/>
+      </w:pPr>
+    </w:p>
+    <w:p>
+      <w:r>
+        <w:rPr>
+          <w:b/>
+        </w:rPr>
+        <w:t xml:space="preserve">Do the arithmetic:</w:t>
+      </w:r>
+      <w:r>
+        <w:t xml:space="preserve"> a 3% commission on a single $5M NFL contract is </w:t>
+      </w:r>
+      <w:r>
+        <w:rPr>
+          <w:b/>
+        </w:rPr>
+        <w:t xml:space="preserve">$150,000</w:t>
+      </w:r>
+      <w:r>
+        <w:t xml:space="preserve"> for one negotiation. </w:t>
+      </w:r>
+      <w:r>
+        <w:rPr>
+          <w:b/>
+        </w:rPr>
+        <w:t xml:space="preserve">This is a skill with enormous variance — nearly worthless at the bottom and extremely valuable at the top.</w:t>
+      </w:r>
+    </w:p>
+    <w:p>
+      <w:pPr>
+        <w:pStyle w:val="Heading2"/>
+      </w:pPr>
+      <w:r>
+        <w:t xml:space="preserve">The salaries</w:t>
+      </w:r>
+    </w:p>
+    <w:tbl>
+      <w:tblPr>
+        <w:tblW w:w="10080" w:type="dxa"/>
+        <w:tblBorders>
+          <w:top w:val="single" w:sz="4" w:space="0" w:color="C9CCD1"/>
+          <w:left w:val="single" w:sz="4" w:space="0" w:color="C9CCD1"/>
+          <w:bottom w:val="single" w:sz="4" w:space="0" w:color="C9CCD1"/>
+          <w:right w:val="single" w:sz="4" w:space="0" w:color="C9CCD1"/>
+          <w:insideH w:val="single" w:sz="4" w:space="0" w:color="C9CCD1"/>
+          <w:insideV w:val="single" w:sz="4" w:space="0" w:color="C9CCD1"/>
+        </w:tblBorders>
+        <w:tblLayout w:type="fixed"/>
+      </w:tblPr>
+      <w:tblGrid>
+        <w:gridCol w:w="3360"/>
+        <w:gridCol w:w="3360"/>
+        <w:gridCol w:w="3360"/>
+      </w:tblGrid>
+      <w:tr>
+        <w:trPr>
+          <w:tblHeader/>
+        </w:trPr>
+        <w:tc>
+          <w:tcPr>
+            <w:tcW w:w="3360" w:type="dxa"/>
+            <w:shd w:val="clear" w:color="auto" w:fill="EFF1F3"/>
+          </w:tcPr>
+          <w:p>
+            <w:pPr>
+              <w:spacing w:before="40" w:after="40"/>
+            </w:pPr>
+            <w:r>
+              <w:rPr>
+                <w:b/>
+                <w:sz w:val="18"/>
+              </w:rPr>
+              <w:t xml:space="preserve">Role</w:t>
+            </w:r>
+          </w:p>
+        </w:tc>
+        <w:tc>
+          <w:tcPr>
+            <w:tcW w:w="3360" w:type="dxa"/>
+            <w:shd w:val="clear" w:color="auto" w:fill="EFF1F3"/>
+          </w:tcPr>
+          <w:p>
+            <w:pPr>
+              <w:spacing w:before="40" w:after="40"/>
+            </w:pPr>
+            <w:r>
+              <w:rPr>
+                <w:b/>
+                <w:sz w:val="18"/>
+              </w:rPr>
+              <w:t xml:space="preserve">Pay</w:t>
+            </w:r>
+          </w:p>
+        </w:tc>
+        <w:tc>
+          <w:tcPr>
+            <w:tcW w:w="3360" w:type="dxa"/>
+            <w:shd w:val="clear" w:color="auto" w:fill="EFF1F3"/>
+          </w:tcPr>
+          <w:p>
+            <w:pPr>
+              <w:spacing w:before="40" w:after="40"/>
+            </w:pPr>
+            <w:r>
+              <w:rPr>
+                <w:b/>
+                <w:sz w:val="18"/>
+              </w:rPr>
+              <w:t xml:space="preserve">Source</w:t>
+            </w:r>
+          </w:p>
+        </w:tc>
+      </w:tr>
+      <w:tr>
+        <w:tc>
+          <w:tcPr>
+            <w:tcW w:w="3360" w:type="dxa"/>
+          </w:tcPr>
+          <w:p>
+            <w:pPr>
+              <w:spacing w:before="40" w:after="40"/>
+            </w:pPr>
+            <w:r>
+              <w:rPr>
+                <w:b/>
+                <w:sz w:val="18"/>
+              </w:rPr>
+              <w:t xml:space="preserve">Sports agent (average)</w:t>
+            </w:r>
+          </w:p>
+        </w:tc>
+        <w:tc>
+          <w:tcPr>
+            <w:tcW w:w="3360" w:type="dxa"/>
+          </w:tcPr>
+          <w:p>
+            <w:pPr>
+              <w:spacing w:before="40" w:after="40"/>
+            </w:pPr>
+            <w:r>
+              <w:rPr>
+                <w:b/>
+                <w:sz w:val="18"/>
+              </w:rPr>
+              <w:t xml:space="preserve">$49,833/yr ($23.96/hr)</w:t>
+            </w:r>
+          </w:p>
+        </w:tc>
+        <w:tc>
+          <w:tcPr>
+            <w:tcW w:w="3360" w:type="dxa"/>
+          </w:tcPr>
+          <w:p>
+            <w:pPr>
+              <w:spacing w:before="40" w:after="40"/>
+            </w:pPr>
+            <w:hyperlink r:id="rHl32">
+              <w:r>
+                <w:rPr>
+                  <w:rStyle w:val="Hyperlink"/>
+                  <w:sz w:val="18"/>
+                </w:rPr>
+                <w:t xml:space="preserve">ZipRecruiter</w:t>
+              </w:r>
+            </w:hyperlink>
+          </w:p>
+        </w:tc>
+      </w:tr>
+      <w:tr>
+        <w:tc>
+          <w:tcPr>
+            <w:tcW w:w="3360" w:type="dxa"/>
+          </w:tcPr>
+          <w:p>
+            <w:pPr>
+              <w:spacing w:before="40" w:after="40"/>
+            </w:pPr>
+            <w:r>
+              <w:rPr>
+                <w:sz w:val="18"/>
+              </w:rPr>
+              <w:t xml:space="preserve">Sports agent, entry level</w:t>
+            </w:r>
+          </w:p>
+        </w:tc>
+        <w:tc>
+          <w:tcPr>
+            <w:tcW w:w="3360" w:type="dxa"/>
+          </w:tcPr>
+          <w:p>
+            <w:pPr>
+              <w:spacing w:before="40" w:after="40"/>
+            </w:pPr>
+            <w:r>
+              <w:rPr>
+                <w:b/>
+                <w:sz w:val="18"/>
+              </w:rPr>
+              <w:t xml:space="preserve">$53,304/yr</w:t>
+            </w:r>
+            <w:r>
+              <w:rPr>
+                <w:sz w:val="18"/>
+              </w:rPr>
+              <w:t xml:space="preserve">; $36,000–$70,000 typical, $88,500 at the 90th percentile</w:t>
+            </w:r>
+          </w:p>
+        </w:tc>
+        <w:tc>
+          <w:tcPr>
+            <w:tcW w:w="3360" w:type="dxa"/>
+          </w:tcPr>
+          <w:p>
+            <w:pPr>
+              <w:spacing w:before="40" w:after="40"/>
+            </w:pPr>
+            <w:hyperlink r:id="rHl33">
+              <w:r>
+                <w:rPr>
+                  <w:rStyle w:val="Hyperlink"/>
+                  <w:sz w:val="18"/>
+                </w:rPr>
+                <w:t xml:space="preserve">ZipRecruiter</w:t>
+              </w:r>
+            </w:hyperlink>
+          </w:p>
+        </w:tc>
+      </w:tr>
+      <w:tr>
+        <w:tc>
+          <w:tcPr>
+            <w:tcW w:w="3360" w:type="dxa"/>
+          </w:tcPr>
+          <w:p>
+            <w:pPr>
+              <w:spacing w:before="40" w:after="40"/>
+            </w:pPr>
+            <w:r>
+              <w:rPr>
+                <w:b/>
+                <w:sz w:val="18"/>
+              </w:rPr>
+              <w:t xml:space="preserve">NFL sports agent</w:t>
+            </w:r>
+          </w:p>
+        </w:tc>
+        <w:tc>
+          <w:tcPr>
+            <w:tcW w:w="3360" w:type="dxa"/>
+          </w:tcPr>
+          <w:p>
+            <w:pPr>
+              <w:spacing w:before="40" w:after="40"/>
+            </w:pPr>
+            <w:r>
+              <w:rPr>
+                <w:b/>
+                <w:sz w:val="18"/>
+              </w:rPr>
+              <w:t xml:space="preserve">$72,458/yr</w:t>
+            </w:r>
+          </w:p>
+        </w:tc>
+        <w:tc>
+          <w:tcPr>
+            <w:tcW w:w="3360" w:type="dxa"/>
+          </w:tcPr>
+          <w:p>
+            <w:pPr>
+              <w:spacing w:before="40" w:after="40"/>
+            </w:pPr>
+            <w:hyperlink r:id="rHl34">
+              <w:r>
+                <w:rPr>
+                  <w:rStyle w:val="Hyperlink"/>
+                  <w:sz w:val="18"/>
+                </w:rPr>
+                <w:t xml:space="preserve">ZipRecruiter</w:t>
+              </w:r>
+            </w:hyperlink>
+          </w:p>
+        </w:tc>
+      </w:tr>
+      <w:tr>
+        <w:tc>
+          <w:tcPr>
+            <w:tcW w:w="3360" w:type="dxa"/>
+          </w:tcPr>
+          <w:p>
+            <w:pPr>
+              <w:spacing w:before="40" w:after="40"/>
+            </w:pPr>
+            <w:r>
+              <w:rPr>
+                <w:b/>
+                <w:sz w:val="18"/>
+              </w:rPr>
+              <w:t xml:space="preserve">Agents &amp; business managers of athletes (BLS 13-1011)</w:t>
+            </w:r>
+          </w:p>
+        </w:tc>
+        <w:tc>
+          <w:tcPr>
+            <w:tcW w:w="3360" w:type="dxa"/>
+          </w:tcPr>
+          <w:p>
+            <w:pPr>
+              <w:spacing w:before="40" w:after="40"/>
+            </w:pPr>
+            <w:r>
+              <w:rPr>
+                <w:b/>
+                <w:sz w:val="18"/>
+              </w:rPr>
+              <w:t xml:space="preserve">median $84,900</w:t>
+            </w:r>
+            <w:r>
+              <w:rPr>
+                <w:sz w:val="18"/>
+              </w:rPr>
+              <w:t xml:space="preserve">; 12,870 employed nationally</w:t>
+            </w:r>
+          </w:p>
+        </w:tc>
+        <w:tc>
+          <w:tcPr>
+            <w:tcW w:w="3360" w:type="dxa"/>
+          </w:tcPr>
+          <w:p>
+            <w:pPr>
+              <w:spacing w:before="40" w:after="40"/>
+            </w:pPr>
+            <w:hyperlink r:id="rHl6">
+              <w:r>
+                <w:rPr>
+                  <w:rStyle w:val="Hyperlink"/>
+                  <w:sz w:val="18"/>
+                </w:rPr>
+                <w:t xml:space="preserve">BLS OEWS, May 2023</w:t>
+              </w:r>
+            </w:hyperlink>
+          </w:p>
+        </w:tc>
+      </w:tr>
+      <w:tr>
+        <w:tc>
+          <w:tcPr>
+            <w:tcW w:w="3360" w:type="dxa"/>
+          </w:tcPr>
+          <w:p>
+            <w:pPr>
+              <w:spacing w:before="40" w:after="40"/>
+            </w:pPr>
+            <w:r>
+              <w:rPr>
+                <w:b/>
+                <w:sz w:val="18"/>
+              </w:rPr>
+              <w:t xml:space="preserve">Sports lawyer</w:t>
+            </w:r>
+          </w:p>
+        </w:tc>
+        <w:tc>
+          <w:tcPr>
+            <w:tcW w:w="3360" w:type="dxa"/>
+          </w:tcPr>
+          <w:p>
+            <w:pPr>
+              <w:spacing w:before="40" w:after="40"/>
+            </w:pPr>
+            <w:r>
+              <w:rPr>
+                <w:b/>
+                <w:sz w:val="18"/>
+              </w:rPr>
+              <w:t xml:space="preserve">$100,626/yr average</w:t>
+            </w:r>
+            <w:r>
+              <w:rPr>
+                <w:sz w:val="18"/>
+              </w:rPr>
+              <w:t xml:space="preserve">; $79,000–$103,000 typical; $131,000 at the 90th percentile</w:t>
+            </w:r>
+          </w:p>
+        </w:tc>
+        <w:tc>
+          <w:tcPr>
+            <w:tcW w:w="3360" w:type="dxa"/>
+          </w:tcPr>
+          <w:p>
+            <w:pPr>
+              <w:spacing w:before="40" w:after="40"/>
+            </w:pPr>
+            <w:hyperlink r:id="rHl35">
+              <w:r>
+                <w:rPr>
+                  <w:rStyle w:val="Hyperlink"/>
+                  <w:sz w:val="18"/>
+                </w:rPr>
+                <w:t xml:space="preserve">ZipRecruiter</w:t>
+              </w:r>
+            </w:hyperlink>
+          </w:p>
+        </w:tc>
+      </w:tr>
+      <w:tr>
+        <w:tc>
+          <w:tcPr>
+            <w:tcW w:w="3360" w:type="dxa"/>
+          </w:tcPr>
+          <w:p>
+            <w:pPr>
+              <w:spacing w:before="40" w:after="40"/>
+            </w:pPr>
+            <w:r>
+              <w:rPr>
+                <w:sz w:val="18"/>
+              </w:rPr>
+              <w:t xml:space="preserve">Sports team general counsel</w:t>
+            </w:r>
+          </w:p>
+        </w:tc>
+        <w:tc>
+          <w:tcPr>
+            <w:tcW w:w="3360" w:type="dxa"/>
+          </w:tcPr>
+          <w:p>
+            <w:pPr>
+              <w:spacing w:before="40" w:after="40"/>
+            </w:pPr>
+            <w:r>
+              <w:rPr>
+                <w:b/>
+                <w:sz w:val="18"/>
+              </w:rPr>
+              <w:t xml:space="preserve">$148,465/yr</w:t>
+            </w:r>
+          </w:p>
+        </w:tc>
+        <w:tc>
+          <w:tcPr>
+            <w:tcW w:w="3360" w:type="dxa"/>
+          </w:tcPr>
+          <w:p>
+            <w:pPr>
+              <w:spacing w:before="40" w:after="40"/>
+            </w:pPr>
+            <w:hyperlink r:id="rHl36">
+              <w:r>
+                <w:rPr>
+                  <w:rStyle w:val="Hyperlink"/>
+                  <w:sz w:val="18"/>
+                </w:rPr>
+                <w:t xml:space="preserve">Indeed careers guide</w:t>
+              </w:r>
+            </w:hyperlink>
+          </w:p>
+        </w:tc>
+      </w:tr>
+      <w:tr>
+        <w:tc>
+          <w:tcPr>
+            <w:tcW w:w="3360" w:type="dxa"/>
+          </w:tcPr>
+          <w:p>
+            <w:pPr>
+              <w:spacing w:before="40" w:after="40"/>
+            </w:pPr>
+            <w:r>
+              <w:rPr>
+                <w:sz w:val="18"/>
+              </w:rPr>
+              <w:t xml:space="preserve">Lawyers at teams, leagues or agencies</w:t>
+            </w:r>
+          </w:p>
+        </w:tc>
+        <w:tc>
+          <w:tcPr>
+            <w:tcW w:w="3360" w:type="dxa"/>
+          </w:tcPr>
+          <w:p>
+            <w:pPr>
+              <w:spacing w:before="40" w:after="40"/>
+            </w:pPr>
+            <w:r>
+              <w:rPr>
+                <w:b/>
+                <w:sz w:val="18"/>
+              </w:rPr>
+              <w:t xml:space="preserve">$100,000–$250,000</w:t>
+            </w:r>
+            <w:r>
+              <w:rPr>
+                <w:sz w:val="18"/>
+              </w:rPr>
+              <w:t xml:space="preserve"> depending on organisation size</w:t>
+            </w:r>
+          </w:p>
+        </w:tc>
+        <w:tc>
+          <w:tcPr>
+            <w:tcW w:w="3360" w:type="dxa"/>
+          </w:tcPr>
+          <w:p>
+            <w:pPr>
+              <w:spacing w:before="40" w:after="40"/>
+            </w:pPr>
+            <w:hyperlink r:id="rHl36">
+              <w:r>
+                <w:rPr>
+                  <w:rStyle w:val="Hyperlink"/>
+                  <w:sz w:val="18"/>
+                </w:rPr>
+                <w:t xml:space="preserve">Indeed</w:t>
+              </w:r>
+            </w:hyperlink>
+          </w:p>
+        </w:tc>
+      </w:tr>
+    </w:tbl>
+    <w:p>
+      <w:pPr>
+        <w:spacing w:after="0"/>
+      </w:pPr>
+    </w:p>
+    <w:p>
+      <w:pPr>
+        <w:pStyle w:val="Heading2"/>
+      </w:pPr>
+      <w:r>
+        <w:t xml:space="preserve">What this says about who could pay for the product</w:t>
+      </w:r>
+    </w:p>
+    <w:p>
+      <w:r>
+        <w:rPr>
+          <w:b/>
+        </w:rPr>
+        <w:t xml:space="preserve">The people who most need the practice are the ones with the least money.</w:t>
+      </w:r>
+      <w:r>
+        <w:t xml:space="preserve"> The average sports agent earns </w:t>
+      </w:r>
+      <w:r>
+        <w:rPr>
+          <w:b/>
+        </w:rPr>
+        <w:t xml:space="preserve">$49,833</w:t>
+      </w:r>
+      <w:r>
+        <w:t xml:space="preserve"> — below the US median household income — while the deal-making skill itself pays $150,000 on one good contract. The money is concentrated in a few hundred people at the top.</w:t>
+      </w:r>
+    </w:p>
+    <w:p>
+      <w:r>
+        <w:t xml:space="preserve">Three consequences:</w:t>
+      </w:r>
+    </w:p>
+    <w:p>
+      <w:r>
+        <w:t xml:space="preserve">1. </w:t>
+      </w:r>
+      <w:r>
+        <w:rPr>
+          <w:b/>
+        </w:rPr>
+        <w:t xml:space="preserve">Students can't pay much</w:t>
+      </w:r>
+      <w:r>
+        <w:t xml:space="preserve">, and they're the core user in Section 1's sizing.</w:t>
+      </w:r>
+    </w:p>
+    <w:p>
+      <w:r>
+        <w:t xml:space="preserve">2. </w:t>
+      </w:r>
+      <w:r>
+        <w:rPr>
+          <w:b/>
+        </w:rPr>
+        <w:t xml:space="preserve">The institutional buyer is the realistic one</w:t>
+      </w:r>
+      <w:r>
+        <w:t xml:space="preserve"> — the 441 programs teaching sport management, who buy curriculum, not the individual.</w:t>
+      </w:r>
+    </w:p>
+    <w:p>
+      <w:r>
+        <w:t xml:space="preserve">3. </w:t>
+      </w:r>
+      <w:r>
+        <w:rPr>
+          <w:b/>
+        </w:rPr>
+        <w:t xml:space="preserve">The high-value buyer is the law-school/agency track</w:t>
+      </w:r>
+      <w:r>
+        <w:t xml:space="preserve"> — sports lawyers at $100K+ and agencies whose associates negotiate real contracts. </w:t>
+      </w:r>
+      <w:r>
+        <w:rPr>
+          <w:b/>
+        </w:rPr>
+        <w:t xml:space="preserve">That is a smaller, richer audience than "aspiring sports business students," and nothing in this research says they want a simulator.</w:t>
+      </w:r>
+      <w:r>
+        <w:t xml:space="preserve"> </w:t>
+      </w:r>
+      <w:r>
+        <w:rPr>
+          <w:rFonts w:ascii="Consolas" w:hAnsi="Consolas"/>
+        </w:rPr>
+        <w:t xml:space="preserve">[UNVERIFIED — no evidence either way.]</w:t>
+      </w:r>
+    </w:p>
+    <w:p>
+      <w:pPr>
+        <w:pBdr>
+          <w:bottom w:val="single" w:sz="6" w:space="6" w:color="C9CCD1"/>
+        </w:pBdr>
+      </w:pPr>
+    </w:p>
+    <w:p>
+      <w:pPr>
+        <w:pStyle w:val="Heading1"/>
+      </w:pPr>
+      <w:r>
+        <w:t xml:space="preserve">Flags</w:t>
+      </w:r>
+    </w:p>
+    <w:tbl>
+      <w:tblPr>
+        <w:tblW w:w="10080" w:type="dxa"/>
+        <w:tblBorders>
+          <w:top w:val="single" w:sz="4" w:space="0" w:color="C9CCD1"/>
+          <w:left w:val="single" w:sz="4" w:space="0" w:color="C9CCD1"/>
+          <w:bottom w:val="single" w:sz="4" w:space="0" w:color="C9CCD1"/>
+          <w:right w:val="single" w:sz="4" w:space="0" w:color="C9CCD1"/>
+          <w:insideH w:val="single" w:sz="4" w:space="0" w:color="C9CCD1"/>
+          <w:insideV w:val="single" w:sz="4" w:space="0" w:color="C9CCD1"/>
+        </w:tblBorders>
+        <w:tblLayout w:type="fixed"/>
+      </w:tblPr>
+      <w:tblGrid>
+        <w:gridCol w:w="5040"/>
+        <w:gridCol w:w="5040"/>
+      </w:tblGrid>
+      <w:tr>
+        <w:trPr>
+          <w:tblHeader/>
+        </w:trPr>
+        <w:tc>
+          <w:tcPr>
+            <w:tcW w:w="5040" w:type="dxa"/>
+            <w:shd w:val="clear" w:color="auto" w:fill="EFF1F3"/>
+          </w:tcPr>
+          <w:p>
+            <w:pPr>
+              <w:spacing w:before="40" w:after="40"/>
+            </w:pPr>
+            <w:r>
+              <w:rPr>
+                <w:b/>
+                <w:sz w:val="18"/>
+              </w:rPr>
+              <w:t xml:space="preserve">Item</w:t>
+            </w:r>
+          </w:p>
+        </w:tc>
+        <w:tc>
+          <w:tcPr>
+            <w:tcW w:w="5040" w:type="dxa"/>
+            <w:shd w:val="clear" w:color="auto" w:fill="EFF1F3"/>
+          </w:tcPr>
+          <w:p>
+            <w:pPr>
+              <w:spacing w:before="40" w:after="40"/>
+            </w:pPr>
+            <w:r>
+              <w:rPr>
+                <w:b/>
+                <w:sz w:val="18"/>
+              </w:rPr>
+              <w:t xml:space="preserve">Status</w:t>
+            </w:r>
+          </w:p>
+        </w:tc>
+      </w:tr>
+      <w:tr>
+        <w:tc>
+          <w:tcPr>
+            <w:tcW w:w="5040" w:type="dxa"/>
+          </w:tcPr>
+          <w:p>
+            <w:pPr>
+              <w:spacing w:before="40" w:after="40"/>
+            </w:pPr>
+            <w:r>
+              <w:rPr>
+                <w:b/>
+                <w:sz w:val="18"/>
+              </w:rPr>
+              <w:t xml:space="preserve">No product matches the spec</w:t>
+            </w:r>
+          </w:p>
+        </w:tc>
+        <w:tc>
+          <w:tcPr>
+            <w:tcW w:w="5040" w:type="dxa"/>
+          </w:tcPr>
+          <w:p>
+            <w:pPr>
+              <w:spacing w:before="40" w:after="40"/>
+            </w:pPr>
+            <w:r>
+              <w:rPr>
+                <w:sz w:val="18"/>
+              </w:rPr>
+              <w:t xml:space="preserve">⚠️ All 2,134 reviews are </w:t>
+            </w:r>
+            <w:r>
+              <w:rPr>
+                <w:b/>
+                <w:sz w:val="18"/>
+              </w:rPr>
+              <w:t xml:space="preserve">analogs</w:t>
+            </w:r>
+            <w:r>
+              <w:rPr>
+                <w:sz w:val="18"/>
+              </w:rPr>
+              <w:t xml:space="preserve">, not competitors. Treat as a risk model.</w:t>
+            </w:r>
+          </w:p>
+        </w:tc>
+      </w:tr>
+      <w:tr>
+        <w:tc>
+          <w:tcPr>
+            <w:tcW w:w="5040" w:type="dxa"/>
+          </w:tcPr>
+          <w:p>
+            <w:pPr>
+              <w:spacing w:before="40" w:after="40"/>
+            </w:pPr>
+            <w:r>
+              <w:rPr>
+                <w:b/>
+                <w:sz w:val="18"/>
+              </w:rPr>
+              <w:t xml:space="preserve">Reddit</w:t>
+            </w:r>
+          </w:p>
+        </w:tc>
+        <w:tc>
+          <w:tcPr>
+            <w:tcW w:w="5040" w:type="dxa"/>
+          </w:tcPr>
+          <w:p>
+            <w:pPr>
+              <w:spacing w:before="40" w:after="40"/>
+            </w:pPr>
+            <w:r>
+              <w:rPr>
+                <w:sz w:val="18"/>
+              </w:rPr>
+              <w:t xml:space="preserve">❌ Blocked. This audience argues on r/Madden, r/OOTP, r/footballmanager and r/sportsbook-adjacent forums; none of it is here.</w:t>
+            </w:r>
+          </w:p>
+        </w:tc>
+      </w:tr>
+      <w:tr>
+        <w:tc>
+          <w:tcPr>
+            <w:tcW w:w="5040" w:type="dxa"/>
+          </w:tcPr>
+          <w:p>
+            <w:pPr>
+              <w:spacing w:before="40" w:after="40"/>
+            </w:pPr>
+            <w:r>
+              <w:rPr>
+                <w:b/>
+                <w:sz w:val="18"/>
+              </w:rPr>
+              <w:t xml:space="preserve">G2 / Capterra</w:t>
+            </w:r>
+          </w:p>
+        </w:tc>
+        <w:tc>
+          <w:tcPr>
+            <w:tcW w:w="5040" w:type="dxa"/>
+          </w:tcPr>
+          <w:p>
+            <w:pPr>
+              <w:spacing w:before="40" w:after="40"/>
+            </w:pPr>
+            <w:r>
+              <w:rPr>
+                <w:sz w:val="18"/>
+              </w:rPr>
+              <w:t xml:space="preserve">❌ Neither lists games, fan tools or consumer sims. No reviews exist to pull.</w:t>
+            </w:r>
+          </w:p>
+        </w:tc>
+      </w:tr>
+      <w:tr>
+        <w:tc>
+          <w:tcPr>
+            <w:tcW w:w="5040" w:type="dxa"/>
+          </w:tcPr>
+          <w:p>
+            <w:pPr>
+              <w:spacing w:before="40" w:after="40"/>
+            </w:pPr>
+            <w:r>
+              <w:rPr>
+                <w:b/>
+                <w:sz w:val="18"/>
+              </w:rPr>
+              <w:t xml:space="preserve">Steam sample</w:t>
+            </w:r>
+          </w:p>
+        </w:tc>
+        <w:tc>
+          <w:tcPr>
+            <w:tcW w:w="5040" w:type="dxa"/>
+          </w:tcPr>
+          <w:p>
+            <w:pPr>
+              <w:spacing w:before="40" w:after="40"/>
+            </w:pPr>
+            <w:r>
+              <w:rPr>
+                <w:sz w:val="18"/>
+              </w:rPr>
+              <w:t xml:space="preserve">⚠️ Negative-only, English-only, PC-only. Console players — most of Madden's and NBA 2K's audience — are absent entirely.</w:t>
+            </w:r>
+          </w:p>
+        </w:tc>
+      </w:tr>
+      <w:tr>
+        <w:tc>
+          <w:tcPr>
+            <w:tcW w:w="5040" w:type="dxa"/>
+          </w:tcPr>
+          <w:p>
+            <w:pPr>
+              <w:spacing w:before="40" w:after="40"/>
+            </w:pPr>
+            <w:r>
+              <w:rPr>
+                <w:b/>
+                <w:sz w:val="18"/>
+              </w:rPr>
+              <w:t xml:space="preserve">Mobile sample</w:t>
+            </w:r>
+          </w:p>
+        </w:tc>
+        <w:tc>
+          <w:tcPr>
+            <w:tcW w:w="5040" w:type="dxa"/>
+          </w:tcPr>
+          <w:p>
+            <w:pPr>
+              <w:spacing w:before="40" w:after="40"/>
+            </w:pPr>
+            <w:r>
+              <w:rPr>
+                <w:sz w:val="18"/>
+              </w:rPr>
+              <w:t xml:space="preserve">⚠️ 213 reviews, heavily weighted by one app's monetization revolt (Franchise Hockey: Pro GM, Sept 2026). That skews the pricing theme upward.</w:t>
+            </w:r>
+          </w:p>
+        </w:tc>
+      </w:tr>
+      <w:tr>
+        <w:tc>
+          <w:tcPr>
+            <w:tcW w:w="5040" w:type="dxa"/>
+          </w:tcPr>
+          <w:p>
+            <w:pPr>
+              <w:spacing w:before="40" w:after="40"/>
+            </w:pPr>
+            <w:r>
+              <w:rPr>
+                <w:b/>
+                <w:sz w:val="18"/>
+              </w:rPr>
+              <w:t xml:space="preserve">AI-trainer evidence</w:t>
+            </w:r>
+          </w:p>
+        </w:tc>
+        <w:tc>
+          <w:tcPr>
+            <w:tcW w:w="5040" w:type="dxa"/>
+          </w:tcPr>
+          <w:p>
+            <w:pPr>
+              <w:spacing w:before="40" w:after="40"/>
+            </w:pPr>
+            <w:r>
+              <w:rPr>
+                <w:sz w:val="18"/>
+              </w:rPr>
+              <w:t xml:space="preserve">⚠️ </w:t>
+            </w:r>
+            <w:r>
+              <w:rPr>
+                <w:b/>
+                <w:sz w:val="18"/>
+              </w:rPr>
+              <w:t xml:space="preserve">Two reviews.</w:t>
+            </w:r>
+            <w:r>
+              <w:rPr>
+                <w:sz w:val="18"/>
+              </w:rPr>
+              <w:t xml:space="preserve"> Directionally alarming, statistically nothing.</w:t>
+            </w:r>
+          </w:p>
+        </w:tc>
+      </w:tr>
+      <w:tr>
+        <w:tc>
+          <w:tcPr>
+            <w:tcW w:w="5040" w:type="dxa"/>
+          </w:tcPr>
+          <w:p>
+            <w:pPr>
+              <w:spacing w:before="40" w:after="40"/>
+            </w:pPr>
+            <w:r>
+              <w:rPr>
+                <w:b/>
+                <w:sz w:val="18"/>
+              </w:rPr>
+              <w:t xml:space="preserve">Theme counts</w:t>
+            </w:r>
+          </w:p>
+        </w:tc>
+        <w:tc>
+          <w:tcPr>
+            <w:tcW w:w="5040" w:type="dxa"/>
+          </w:tcPr>
+          <w:p>
+            <w:pPr>
+              <w:spacing w:before="40" w:after="40"/>
+            </w:pPr>
+            <w:r>
+              <w:rPr>
+                <w:sz w:val="18"/>
+              </w:rPr>
+              <w:t xml:space="preserve">⚠️ Keyword matching over review text, spot-checked by reading; reviews can count in several themes.</w:t>
+            </w:r>
+          </w:p>
+        </w:tc>
+      </w:tr>
+      <w:tr>
+        <w:tc>
+          <w:tcPr>
+            <w:tcW w:w="5040" w:type="dxa"/>
+          </w:tcPr>
+          <w:p>
+            <w:pPr>
+              <w:spacing w:before="40" w:after="40"/>
+            </w:pPr>
+            <w:r>
+              <w:rPr>
+                <w:b/>
+                <w:sz w:val="18"/>
+              </w:rPr>
+              <w:t xml:space="preserve">ZipRecruiter salary figures</w:t>
+            </w:r>
+          </w:p>
+        </w:tc>
+        <w:tc>
+          <w:tcPr>
+            <w:tcW w:w="5040" w:type="dxa"/>
+          </w:tcPr>
+          <w:p>
+            <w:pPr>
+              <w:spacing w:before="40" w:after="40"/>
+            </w:pPr>
+            <w:r>
+              <w:rPr>
+                <w:sz w:val="18"/>
+              </w:rPr>
+              <w:t xml:space="preserve">⚠️ Self-reported aggregator estimates. Note the oddity that their "entry level" average ($53,304) exceeds their overall average ($49,833) — a sign of thin data, not a real inversion.</w:t>
+            </w:r>
+          </w:p>
+        </w:tc>
+      </w:tr>
+      <w:tr>
+        <w:tc>
+          <w:tcPr>
+            <w:tcW w:w="5040" w:type="dxa"/>
+          </w:tcPr>
+          <w:p>
+            <w:pPr>
+              <w:spacing w:before="40" w:after="40"/>
+            </w:pPr>
+            <w:r>
+              <w:rPr>
+                <w:b/>
+                <w:sz w:val="18"/>
+              </w:rPr>
+              <w:t xml:space="preserve">Commission caps</w:t>
+            </w:r>
+          </w:p>
+        </w:tc>
+        <w:tc>
+          <w:tcPr>
+            <w:tcW w:w="5040" w:type="dxa"/>
+          </w:tcPr>
+          <w:p>
+            <w:pPr>
+              <w:spacing w:before="40" w:after="40"/>
+            </w:pPr>
+            <w:r>
+              <w:rPr>
+                <w:sz w:val="18"/>
+              </w:rPr>
+              <w:t xml:space="preserve">⚠️ From a Front Office Sports explainer, not the union regulations themselves. The NFLPA and NBPA publish their agent regulations; those are the primary sources to cite in a pitch.</w:t>
+            </w:r>
+          </w:p>
+        </w:tc>
+      </w:tr>
+      <w:tr>
+        <w:tc>
+          <w:tcPr>
+            <w:tcW w:w="5040" w:type="dxa"/>
+          </w:tcPr>
+          <w:p>
+            <w:pPr>
+              <w:spacing w:before="40" w:after="40"/>
+            </w:pPr>
+            <w:r>
+              <w:rPr>
+                <w:b/>
+                <w:sz w:val="18"/>
+              </w:rPr>
+              <w:t xml:space="preserve">Whether agencies or law schools would buy</w:t>
+            </w:r>
+          </w:p>
+        </w:tc>
+        <w:tc>
+          <w:tcPr>
+            <w:tcW w:w="5040" w:type="dxa"/>
+          </w:tcPr>
+          <w:p>
+            <w:pPr>
+              <w:spacing w:before="40" w:after="40"/>
+            </w:pPr>
+            <w:r>
+              <w:rPr>
+                <w:sz w:val="18"/>
+              </w:rPr>
+              <w:t xml:space="preserve">❌ No evidence found.</w:t>
             </w:r>
           </w:p>
         </w:tc>

</xml_diff>

<commit_message>
Add SportsNegotiationApp competitor teardown
Co-Authored-By: Claude Opus 5 <noreply@anthropic.com>
</commit_message>
<xml_diff>
--- a/12_SportsNegotiationApp/ResearchAgents/SportsNegotiationApp_Research.docx
+++ b/12_SportsNegotiationApp/ResearchAgents/SportsNegotiationApp_Research.docx
@@ -82,6 +82,17 @@
       </w:pPr>
       <w:r>
         <w:t xml:space="preserve">Section 2 — Complaint Themes &amp; What Humans Are Paid: six themes from 2,134 analog reviews, plus agent commission caps and negotiator salaries. *(Added Sept 25, 2026)*</w:t>
+      </w:r>
+    </w:p>
+    <w:p>
+      <w:pPr>
+        <w:numPr>
+          <w:ilvl w:val="0"/>
+          <w:numId w:val="1"/>
+        </w:numPr>
+      </w:pPr>
+      <w:r>
+        <w:t xml:space="preserve">Section 3 — Competitor Teardown: the five closest products, their pricing, ownership and complaints, plus the gaps nobody serves. *(Added Sept 25, 2026)*</w:t>
       </w:r>
     </w:p>
     <w:p>
@@ -6587,6 +6598,2380 @@
                 <w:sz w:val="18"/>
               </w:rPr>
               <w:t xml:space="preserve">❌ No evidence found.</w:t>
+            </w:r>
+          </w:p>
+        </w:tc>
+      </w:tr>
+    </w:tbl>
+    <w:p>
+      <w:pPr>
+        <w:spacing w:after="0"/>
+      </w:pPr>
+    </w:p>
+    <w:p>
+      <w:r>
+        <w:br w:type="page"/>
+      </w:r>
+    </w:p>
+    <w:p>
+      <w:pPr>
+        <w:pStyle w:val="Title"/>
+      </w:pPr>
+      <w:r>
+        <w:t xml:space="preserve">Competitor Teardown — Top 5 Products</w:t>
+      </w:r>
+    </w:p>
+    <w:p>
+      <w:r>
+        <w:rPr>
+          <w:b/>
+        </w:rPr>
+        <w:t xml:space="preserve">Prepared:</w:t>
+      </w:r>
+      <w:r>
+        <w:t xml:space="preserve"> September 25, 2026</w:t>
+      </w:r>
+    </w:p>
+    <w:p>
+      <w:r>
+        <w:rPr>
+          <w:b/>
+        </w:rPr>
+        <w:t xml:space="preserve">Selection:</w:t>
+      </w:r>
+      <w:r>
+        <w:t xml:space="preserve"> the five products that cover the most of the spec — simulate a deal, against a counterparty with its own interests, under real cap rules, with feedback on how you did. </w:t>
+      </w:r>
+      <w:r>
+        <w:rPr>
+          <w:b/>
+        </w:rPr>
+        <w:t xml:space="preserve">No product does all four.</w:t>
+      </w:r>
+    </w:p>
+    <w:p>
+      <w:r>
+        <w:rPr>
+          <w:b/>
+        </w:rPr>
+        <w:t xml:space="preserve">Anything inferred rather than read is tagged `[UNVERIFIED]`.</w:t>
+      </w:r>
+      <w:r>
+        <w:t xml:space="preserve"> Prices come from each product's own store or pricing page. Complaints are paraphrased with date, playtime and upvotes; originals are in </w:t>
+      </w:r>
+      <w:hyperlink r:id="rHl23">
+        <w:r>
+          <w:rPr>
+            <w:rStyle w:val="Hyperlink"/>
+          </w:rPr>
+          <w:t xml:space="preserve">steam-negative-reviews.json</w:t>
+        </w:r>
+      </w:hyperlink>
+      <w:r>
+        <w:t xml:space="preserve"> and </w:t>
+      </w:r>
+      <w:hyperlink r:id="rHl24">
+        <w:r>
+          <w:rPr>
+            <w:rStyle w:val="Hyperlink"/>
+          </w:rPr>
+          <w:t xml:space="preserve">appstore-reviews.json</w:t>
+        </w:r>
+      </w:hyperlink>
+      <w:r>
+        <w:t xml:space="preserve">.</w:t>
+      </w:r>
+    </w:p>
+    <w:p>
+      <w:pPr>
+        <w:pBdr>
+          <w:bottom w:val="single" w:sz="6" w:space="6" w:color="C9CCD1"/>
+        </w:pBdr>
+      </w:pPr>
+    </w:p>
+    <w:p>
+      <w:pPr>
+        <w:pStyle w:val="Heading1"/>
+      </w:pPr>
+      <w:r>
+        <w:t xml:space="preserve">Master comparison table</w:t>
+      </w:r>
+    </w:p>
+    <w:tbl>
+      <w:tblPr>
+        <w:tblW w:w="10080" w:type="dxa"/>
+        <w:tblBorders>
+          <w:top w:val="single" w:sz="4" w:space="0" w:color="C9CCD1"/>
+          <w:left w:val="single" w:sz="4" w:space="0" w:color="C9CCD1"/>
+          <w:bottom w:val="single" w:sz="4" w:space="0" w:color="C9CCD1"/>
+          <w:right w:val="single" w:sz="4" w:space="0" w:color="C9CCD1"/>
+          <w:insideH w:val="single" w:sz="4" w:space="0" w:color="C9CCD1"/>
+          <w:insideV w:val="single" w:sz="4" w:space="0" w:color="C9CCD1"/>
+        </w:tblBorders>
+        <w:tblLayout w:type="fixed"/>
+      </w:tblPr>
+      <w:tblGrid>
+        <w:gridCol w:w="1680"/>
+        <w:gridCol w:w="1680"/>
+        <w:gridCol w:w="1680"/>
+        <w:gridCol w:w="1680"/>
+        <w:gridCol w:w="1680"/>
+        <w:gridCol w:w="1680"/>
+      </w:tblGrid>
+      <w:tr>
+        <w:trPr>
+          <w:tblHeader/>
+        </w:trPr>
+        <w:tc>
+          <w:tcPr>
+            <w:tcW w:w="1680" w:type="dxa"/>
+            <w:shd w:val="clear" w:color="auto" w:fill="EFF1F3"/>
+          </w:tcPr>
+          <w:p>
+            <w:pPr>
+              <w:spacing w:before="40" w:after="40"/>
+            </w:pPr>
+            <w:r>
+              <w:rPr>
+                <w:b/>
+                <w:sz w:val="18"/>
+              </w:rPr>
+              <w:t xml:space="preserve">Product</w:t>
+            </w:r>
+          </w:p>
+        </w:tc>
+        <w:tc>
+          <w:tcPr>
+            <w:tcW w:w="1680" w:type="dxa"/>
+            <w:shd w:val="clear" w:color="auto" w:fill="EFF1F3"/>
+          </w:tcPr>
+          <w:p>
+            <w:pPr>
+              <w:spacing w:before="40" w:after="40"/>
+            </w:pPr>
+            <w:r>
+              <w:rPr>
+                <w:b/>
+                <w:sz w:val="18"/>
+              </w:rPr>
+              <w:t xml:space="preserve">Price (source)</w:t>
+            </w:r>
+          </w:p>
+        </w:tc>
+        <w:tc>
+          <w:tcPr>
+            <w:tcW w:w="1680" w:type="dxa"/>
+            <w:shd w:val="clear" w:color="auto" w:fill="EFF1F3"/>
+          </w:tcPr>
+          <w:p>
+            <w:pPr>
+              <w:spacing w:before="40" w:after="40"/>
+            </w:pPr>
+            <w:r>
+              <w:rPr>
+                <w:b/>
+                <w:sz w:val="18"/>
+              </w:rPr>
+              <w:t xml:space="preserve">Three core features</w:t>
+            </w:r>
+          </w:p>
+        </w:tc>
+        <w:tc>
+          <w:tcPr>
+            <w:tcW w:w="1680" w:type="dxa"/>
+            <w:shd w:val="clear" w:color="auto" w:fill="EFF1F3"/>
+          </w:tcPr>
+          <w:p>
+            <w:pPr>
+              <w:spacing w:before="40" w:after="40"/>
+            </w:pPr>
+            <w:r>
+              <w:rPr>
+                <w:b/>
+                <w:sz w:val="18"/>
+              </w:rPr>
+              <w:t xml:space="preserve">Target customer</w:t>
+            </w:r>
+          </w:p>
+        </w:tc>
+        <w:tc>
+          <w:tcPr>
+            <w:tcW w:w="1680" w:type="dxa"/>
+            <w:shd w:val="clear" w:color="auto" w:fill="EFF1F3"/>
+          </w:tcPr>
+          <w:p>
+            <w:pPr>
+              <w:spacing w:before="40" w:after="40"/>
+            </w:pPr>
+            <w:r>
+              <w:rPr>
+                <w:b/>
+                <w:sz w:val="18"/>
+              </w:rPr>
+              <w:t xml:space="preserve">Funding / ownership</w:t>
+            </w:r>
+          </w:p>
+        </w:tc>
+        <w:tc>
+          <w:tcPr>
+            <w:tcW w:w="1680" w:type="dxa"/>
+            <w:shd w:val="clear" w:color="auto" w:fill="EFF1F3"/>
+          </w:tcPr>
+          <w:p>
+            <w:pPr>
+              <w:spacing w:before="40" w:after="40"/>
+            </w:pPr>
+            <w:r>
+              <w:rPr>
+                <w:b/>
+                <w:sz w:val="18"/>
+              </w:rPr>
+              <w:t xml:space="preserve">Three most common complaints</w:t>
+            </w:r>
+          </w:p>
+        </w:tc>
+      </w:tr>
+      <w:tr>
+        <w:tc>
+          <w:tcPr>
+            <w:tcW w:w="1680" w:type="dxa"/>
+          </w:tcPr>
+          <w:p>
+            <w:pPr>
+              <w:spacing w:before="40" w:after="40"/>
+            </w:pPr>
+            <w:r>
+              <w:rPr>
+                <w:b/>
+                <w:sz w:val="18"/>
+              </w:rPr>
+              <w:t xml:space="preserve">1. Football Manager 26</w:t>
+            </w:r>
+          </w:p>
+        </w:tc>
+        <w:tc>
+          <w:tcPr>
+            <w:tcW w:w="1680" w:type="dxa"/>
+          </w:tcPr>
+          <w:p>
+            <w:pPr>
+              <w:spacing w:before="40" w:after="40"/>
+            </w:pPr>
+            <w:r>
+              <w:rPr>
+                <w:b/>
+                <w:sz w:val="18"/>
+              </w:rPr>
+              <w:t xml:space="preserve">$59.99</w:t>
+            </w:r>
+            <w:r>
+              <w:rPr>
+                <w:sz w:val="18"/>
+              </w:rPr>
+              <w:t xml:space="preserve"> — </w:t>
+            </w:r>
+            <w:hyperlink r:id="rHl37">
+              <w:r>
+                <w:rPr>
+                  <w:rStyle w:val="Hyperlink"/>
+                  <w:sz w:val="18"/>
+                </w:rPr>
+                <w:t xml:space="preserve">Steam store page</w:t>
+              </w:r>
+            </w:hyperlink>
+          </w:p>
+        </w:tc>
+        <w:tc>
+          <w:tcPr>
+            <w:tcW w:w="1680" w:type="dxa"/>
+          </w:tcPr>
+          <w:p>
+            <w:pPr>
+              <w:spacing w:before="40" w:after="40"/>
+            </w:pPr>
+            <w:r>
+              <w:rPr>
+                <w:sz w:val="18"/>
+              </w:rPr>
+              <w:t xml:space="preserve">1. Squad, contract and transfer management across real leagues 2. Contract negotiation with agents and players 3. Full financial and salary-cap modelling by competition</w:t>
+            </w:r>
+          </w:p>
+        </w:tc>
+        <w:tc>
+          <w:tcPr>
+            <w:tcW w:w="1680" w:type="dxa"/>
+          </w:tcPr>
+          <w:p>
+            <w:pPr>
+              <w:spacing w:before="40" w:after="40"/>
+            </w:pPr>
+            <w:r>
+              <w:rPr>
+                <w:sz w:val="18"/>
+              </w:rPr>
+              <w:t xml:space="preserve">Serious management-sim players; the deepest mainstream negotiation loop</w:t>
+            </w:r>
+          </w:p>
+        </w:tc>
+        <w:tc>
+          <w:tcPr>
+            <w:tcW w:w="1680" w:type="dxa"/>
+          </w:tcPr>
+          <w:p>
+            <w:pPr>
+              <w:spacing w:before="40" w:after="40"/>
+            </w:pPr>
+            <w:r>
+              <w:rPr>
+                <w:b/>
+                <w:sz w:val="18"/>
+              </w:rPr>
+              <w:t xml:space="preserve">SEGA</w:t>
+            </w:r>
+            <w:r>
+              <w:rPr>
+                <w:sz w:val="18"/>
+              </w:rPr>
+              <w:t xml:space="preserve"> (publisher) — acquired developer </w:t>
+            </w:r>
+            <w:r>
+              <w:rPr>
+                <w:b/>
+                <w:sz w:val="18"/>
+              </w:rPr>
+              <w:t xml:space="preserve">Sports Interactive in 2006</w:t>
+            </w:r>
+            <w:r>
+              <w:rPr>
+                <w:sz w:val="18"/>
+              </w:rPr>
+              <w:t xml:space="preserve">; SEGA Sammy is publicly listed in Japan (</w:t>
+            </w:r>
+            <w:hyperlink r:id="rHl38">
+              <w:r>
+                <w:rPr>
+                  <w:rStyle w:val="Hyperlink"/>
+                  <w:sz w:val="18"/>
+                </w:rPr>
+                <w:t xml:space="preserve">Game Developer</w:t>
+              </w:r>
+            </w:hyperlink>
+            <w:r>
+              <w:rPr>
+                <w:sz w:val="18"/>
+              </w:rPr>
+              <w:t xml:space="preserve">)</w:t>
+            </w:r>
+          </w:p>
+        </w:tc>
+        <w:tc>
+          <w:tcPr>
+            <w:tcW w:w="1680" w:type="dxa"/>
+          </w:tcPr>
+          <w:p>
+            <w:pPr>
+              <w:spacing w:before="40" w:after="40"/>
+            </w:pPr>
+            <w:r>
+              <w:rPr>
+                <w:sz w:val="18"/>
+              </w:rPr>
+              <w:t xml:space="preserve">Negotiations "all done by text message… a fancy spreadsheet" (Aug 23 2026, 191h, +33); </w:t>
+            </w:r>
+            <w:r>
+              <w:rPr>
+                <w:b/>
+                <w:sz w:val="18"/>
+              </w:rPr>
+              <w:t xml:space="preserve">MLS salary-cap bug during contract negotiation</w:t>
+            </w:r>
+            <w:r>
+              <w:rPr>
+                <w:sz w:val="18"/>
+              </w:rPr>
+              <w:t xml:space="preserve">, GAM/TAM not recognised (Sept 13 2026); game </w:t>
+            </w:r>
+            <w:r>
+              <w:rPr>
+                <w:b/>
+                <w:sz w:val="18"/>
+              </w:rPr>
+              <w:t xml:space="preserve">freezes on player negotiation pages</w:t>
+            </w:r>
+            <w:r>
+              <w:rPr>
+                <w:sz w:val="18"/>
+              </w:rPr>
+              <w:t xml:space="preserve">, 7–8 restarted saves in 71 hours (Jul 30 2026)</w:t>
+            </w:r>
+          </w:p>
+        </w:tc>
+      </w:tr>
+      <w:tr>
+        <w:tc>
+          <w:tcPr>
+            <w:tcW w:w="1680" w:type="dxa"/>
+          </w:tcPr>
+          <w:p>
+            <w:pPr>
+              <w:spacing w:before="40" w:after="40"/>
+            </w:pPr>
+            <w:r>
+              <w:rPr>
+                <w:b/>
+                <w:sz w:val="18"/>
+              </w:rPr>
+              <w:t xml:space="preserve">2. Out of the Park Baseball 26</w:t>
+            </w:r>
+          </w:p>
+        </w:tc>
+        <w:tc>
+          <w:tcPr>
+            <w:tcW w:w="1680" w:type="dxa"/>
+          </w:tcPr>
+          <w:p>
+            <w:pPr>
+              <w:spacing w:before="40" w:after="40"/>
+            </w:pPr>
+            <w:r>
+              <w:rPr>
+                <w:b/>
+                <w:sz w:val="18"/>
+              </w:rPr>
+              <w:t xml:space="preserve">$49.99</w:t>
+            </w:r>
+            <w:r>
+              <w:rPr>
+                <w:sz w:val="18"/>
+              </w:rPr>
+              <w:t xml:space="preserve"> — </w:t>
+            </w:r>
+            <w:hyperlink r:id="rHl39">
+              <w:r>
+                <w:rPr>
+                  <w:rStyle w:val="Hyperlink"/>
+                  <w:sz w:val="18"/>
+                </w:rPr>
+                <w:t xml:space="preserve">Steam store page</w:t>
+              </w:r>
+            </w:hyperlink>
+          </w:p>
+        </w:tc>
+        <w:tc>
+          <w:tcPr>
+            <w:tcW w:w="1680" w:type="dxa"/>
+          </w:tcPr>
+          <w:p>
+            <w:pPr>
+              <w:spacing w:before="40" w:after="40"/>
+            </w:pPr>
+            <w:r>
+              <w:rPr>
+                <w:sz w:val="18"/>
+              </w:rPr>
+              <w:t xml:space="preserve">1. Deepest contract/arbitration/option modelling in any sports sim 2. Full trade engine with salary retention 3. Historical leagues back to 1901</w:t>
+            </w:r>
+          </w:p>
+        </w:tc>
+        <w:tc>
+          <w:tcPr>
+            <w:tcW w:w="1680" w:type="dxa"/>
+          </w:tcPr>
+          <w:p>
+            <w:pPr>
+              <w:spacing w:before="40" w:after="40"/>
+            </w:pPr>
+            <w:r>
+              <w:rPr>
+                <w:sz w:val="18"/>
+              </w:rPr>
+              <w:t xml:space="preserve">Baseball simulation veterans (reviewers with 300–6,900 hours)</w:t>
+            </w:r>
+          </w:p>
+        </w:tc>
+        <w:tc>
+          <w:tcPr>
+            <w:tcW w:w="1680" w:type="dxa"/>
+          </w:tcPr>
+          <w:p>
+            <w:pPr>
+              <w:spacing w:before="40" w:after="40"/>
+            </w:pPr>
+            <w:r>
+              <w:rPr>
+                <w:b/>
+                <w:sz w:val="18"/>
+              </w:rPr>
+              <w:t xml:space="preserve">Out of the Park Developments — 100% acquired by Com2uS (Korea) on Oct 12, 2020</w:t>
+            </w:r>
+            <w:r>
+              <w:rPr>
+                <w:sz w:val="18"/>
+              </w:rPr>
+              <w:t xml:space="preserve"> (</w:t>
+            </w:r>
+            <w:hyperlink r:id="rHl40">
+              <w:r>
+                <w:rPr>
+                  <w:rStyle w:val="Hyperlink"/>
+                  <w:sz w:val="18"/>
+                </w:rPr>
+                <w:t xml:space="preserve">GM Games</w:t>
+              </w:r>
+            </w:hyperlink>
+            <w:r>
+              <w:rPr>
+                <w:sz w:val="18"/>
+              </w:rPr>
+              <w:t xml:space="preserve">)</w:t>
+            </w:r>
+          </w:p>
+        </w:tc>
+        <w:tc>
+          <w:tcPr>
+            <w:tcW w:w="1680" w:type="dxa"/>
+          </w:tcPr>
+          <w:p>
+            <w:pPr>
+              <w:spacing w:before="40" w:after="40"/>
+            </w:pPr>
+            <w:r>
+              <w:rPr>
+                <w:sz w:val="18"/>
+              </w:rPr>
+              <w:t xml:space="preserve">"</w:t>
+            </w:r>
+            <w:r>
+              <w:rPr>
+                <w:b/>
+                <w:sz w:val="18"/>
+              </w:rPr>
+              <w:t xml:space="preserve">The trade AI is still terrible</w:t>
+            </w:r>
+            <w:r>
+              <w:rPr>
+                <w:sz w:val="18"/>
+              </w:rPr>
+              <w:t xml:space="preserve">" (Mar 26 2025, +9); AI trades stars </w:t>
+            </w:r>
+            <w:r>
+              <w:rPr>
+                <w:b/>
+                <w:sz w:val="18"/>
+              </w:rPr>
+              <w:t xml:space="preserve">with 100% salary retention for scrap prospects</w:t>
+            </w:r>
+            <w:r>
+              <w:rPr>
+                <w:sz w:val="18"/>
+              </w:rPr>
+              <w:t xml:space="preserve"> (Jan 26 2026); development effort moved to the card-collecting mode — "Perfect Team is a financial success, but creatively the biggest misstep" (May 6 2025, 6,934h, +85)</w:t>
+            </w:r>
+          </w:p>
+        </w:tc>
+      </w:tr>
+      <w:tr>
+        <w:tc>
+          <w:tcPr>
+            <w:tcW w:w="1680" w:type="dxa"/>
+          </w:tcPr>
+          <w:p>
+            <w:pPr>
+              <w:spacing w:before="40" w:after="40"/>
+            </w:pPr>
+            <w:r>
+              <w:rPr>
+                <w:b/>
+                <w:sz w:val="18"/>
+              </w:rPr>
+              <w:t xml:space="preserve">3. Madden NFL 26</w:t>
+            </w:r>
+          </w:p>
+        </w:tc>
+        <w:tc>
+          <w:tcPr>
+            <w:tcW w:w="1680" w:type="dxa"/>
+          </w:tcPr>
+          <w:p>
+            <w:pPr>
+              <w:spacing w:before="40" w:after="40"/>
+            </w:pPr>
+            <w:r>
+              <w:rPr>
+                <w:b/>
+                <w:sz w:val="18"/>
+              </w:rPr>
+              <w:t xml:space="preserve">$69.99</w:t>
+            </w:r>
+            <w:r>
+              <w:rPr>
+                <w:sz w:val="18"/>
+              </w:rPr>
+              <w:t xml:space="preserve"> — </w:t>
+            </w:r>
+            <w:hyperlink r:id="rHl41">
+              <w:r>
+                <w:rPr>
+                  <w:rStyle w:val="Hyperlink"/>
+                  <w:sz w:val="18"/>
+                </w:rPr>
+                <w:t xml:space="preserve">Steam store page</w:t>
+              </w:r>
+            </w:hyperlink>
+          </w:p>
+        </w:tc>
+        <w:tc>
+          <w:tcPr>
+            <w:tcW w:w="1680" w:type="dxa"/>
+          </w:tcPr>
+          <w:p>
+            <w:pPr>
+              <w:spacing w:before="40" w:after="40"/>
+            </w:pPr>
+            <w:r>
+              <w:rPr>
+                <w:sz w:val="18"/>
+              </w:rPr>
+              <w:t xml:space="preserve">1. Franchise mode with cap, re-signings and the draft 2. Scouting and player progression 3. On-field play as the reward loop</w:t>
+            </w:r>
+          </w:p>
+        </w:tc>
+        <w:tc>
+          <w:tcPr>
+            <w:tcW w:w="1680" w:type="dxa"/>
+          </w:tcPr>
+          <w:p>
+            <w:pPr>
+              <w:spacing w:before="40" w:after="40"/>
+            </w:pPr>
+            <w:r>
+              <w:rPr>
+                <w:sz w:val="18"/>
+              </w:rPr>
+              <w:t xml:space="preserve">Mass-market NFL fans — by far the largest audience here</w:t>
+            </w:r>
+          </w:p>
+        </w:tc>
+        <w:tc>
+          <w:tcPr>
+            <w:tcW w:w="1680" w:type="dxa"/>
+          </w:tcPr>
+          <w:p>
+            <w:pPr>
+              <w:spacing w:before="40" w:after="40"/>
+            </w:pPr>
+            <w:r>
+              <w:rPr>
+                <w:b/>
+                <w:sz w:val="18"/>
+              </w:rPr>
+              <w:t xml:space="preserve">Electronic Arts</w:t>
+            </w:r>
+            <w:r>
+              <w:rPr>
+                <w:sz w:val="18"/>
+              </w:rPr>
+              <w:t xml:space="preserve"> — </w:t>
+            </w:r>
+            <w:r>
+              <w:rPr>
+                <w:b/>
+                <w:sz w:val="18"/>
+              </w:rPr>
+              <w:t xml:space="preserve">taken private on Aug 4, 2026 in a $55B all-cash deal by PIF, Silver Lake and Affinity Partners</w:t>
+            </w:r>
+            <w:r>
+              <w:rPr>
+                <w:sz w:val="18"/>
+              </w:rPr>
+              <w:t xml:space="preserve">, the largest sponsor take-private on record (</w:t>
+            </w:r>
+            <w:hyperlink r:id="rHl42">
+              <w:r>
+                <w:rPr>
+                  <w:rStyle w:val="Hyperlink"/>
+                  <w:sz w:val="18"/>
+                </w:rPr>
+                <w:t xml:space="preserve">EA</w:t>
+              </w:r>
+            </w:hyperlink>
+            <w:r>
+              <w:rPr>
+                <w:sz w:val="18"/>
+              </w:rPr>
+              <w:t xml:space="preserve">)</w:t>
+            </w:r>
+          </w:p>
+        </w:tc>
+        <w:tc>
+          <w:tcPr>
+            <w:tcW w:w="1680" w:type="dxa"/>
+          </w:tcPr>
+          <w:p>
+            <w:pPr>
+              <w:spacing w:before="40" w:after="40"/>
+            </w:pPr>
+            <w:r>
+              <w:rPr>
+                <w:b/>
+                <w:sz w:val="18"/>
+              </w:rPr>
+              <w:t xml:space="preserve">GM mode removed after purchase</w:t>
+            </w:r>
+            <w:r>
+              <w:rPr>
+                <w:sz w:val="18"/>
+              </w:rPr>
+              <w:t xml:space="preserve"> — "They took away GM Mode... AFTER I PAID $70" (Apr 21 2026, 392h, +52); franchise menus "insanely choppy and un-intuitive" (Feb 27 2026); AI that "stops blocking mid play" (Mar 26 2026, +19)</w:t>
+            </w:r>
+          </w:p>
+        </w:tc>
+      </w:tr>
+      <w:tr>
+        <w:tc>
+          <w:tcPr>
+            <w:tcW w:w="1680" w:type="dxa"/>
+          </w:tcPr>
+          <w:p>
+            <w:pPr>
+              <w:spacing w:before="40" w:after="40"/>
+            </w:pPr>
+            <w:r>
+              <w:rPr>
+                <w:b/>
+                <w:sz w:val="18"/>
+              </w:rPr>
+              <w:t xml:space="preserve">4. Front Office Football Nine</w:t>
+            </w:r>
+          </w:p>
+        </w:tc>
+        <w:tc>
+          <w:tcPr>
+            <w:tcW w:w="1680" w:type="dxa"/>
+          </w:tcPr>
+          <w:p>
+            <w:pPr>
+              <w:spacing w:before="40" w:after="40"/>
+            </w:pPr>
+            <w:r>
+              <w:rPr>
+                <w:b/>
+                <w:sz w:val="18"/>
+              </w:rPr>
+              <w:t xml:space="preserve">$29.99</w:t>
+            </w:r>
+            <w:r>
+              <w:rPr>
+                <w:sz w:val="18"/>
+              </w:rPr>
+              <w:t xml:space="preserve"> — </w:t>
+            </w:r>
+            <w:hyperlink r:id="rHl43">
+              <w:r>
+                <w:rPr>
+                  <w:rStyle w:val="Hyperlink"/>
+                  <w:sz w:val="18"/>
+                </w:rPr>
+                <w:t xml:space="preserve">Steam store page</w:t>
+              </w:r>
+            </w:hyperlink>
+          </w:p>
+        </w:tc>
+        <w:tc>
+          <w:tcPr>
+            <w:tcW w:w="1680" w:type="dxa"/>
+          </w:tcPr>
+          <w:p>
+            <w:pPr>
+              <w:spacing w:before="40" w:after="40"/>
+            </w:pPr>
+            <w:r>
+              <w:rPr>
+                <w:sz w:val="18"/>
+              </w:rPr>
+              <w:t xml:space="preserve">1. Front-office-only: no on-field play at all 2. Contract, cap and draft-pick management 3. Deep league financial modelling</w:t>
+            </w:r>
+          </w:p>
+        </w:tc>
+        <w:tc>
+          <w:tcPr>
+            <w:tcW w:w="1680" w:type="dxa"/>
+          </w:tcPr>
+          <w:p>
+            <w:pPr>
+              <w:spacing w:before="40" w:after="40"/>
+            </w:pPr>
+            <w:r>
+              <w:rPr>
+                <w:sz w:val="18"/>
+              </w:rPr>
+              <w:t xml:space="preserve">The closest existing product to "be the GM, not the coach"</w:t>
+            </w:r>
+          </w:p>
+        </w:tc>
+        <w:tc>
+          <w:tcPr>
+            <w:tcW w:w="1680" w:type="dxa"/>
+          </w:tcPr>
+          <w:p>
+            <w:pPr>
+              <w:spacing w:before="40" w:after="40"/>
+            </w:pPr>
+            <w:r>
+              <w:rPr>
+                <w:b/>
+                <w:sz w:val="18"/>
+              </w:rPr>
+              <w:t xml:space="preserve">Solecismic Software</w:t>
+            </w:r>
+            <w:r>
+              <w:rPr>
+                <w:sz w:val="18"/>
+              </w:rPr>
+              <w:t xml:space="preserve"> — a one-developer independent studio </w:t>
+            </w:r>
+            <w:r>
+              <w:rPr>
+                <w:rFonts w:ascii="Consolas" w:hAnsi="Consolas"/>
+                <w:sz w:val="18"/>
+              </w:rPr>
+              <w:t xml:space="preserve">[no outside funding found]</w:t>
+            </w:r>
+          </w:p>
+        </w:tc>
+        <w:tc>
+          <w:tcPr>
+            <w:tcW w:w="1680" w:type="dxa"/>
+          </w:tcPr>
+          <w:p>
+            <w:pPr>
+              <w:spacing w:before="40" w:after="40"/>
+            </w:pPr>
+            <w:r>
+              <w:rPr>
+                <w:sz w:val="18"/>
+              </w:rPr>
+              <w:t xml:space="preserve">"</w:t>
+            </w:r>
+            <w:r>
+              <w:rPr>
+                <w:b/>
+                <w:sz w:val="18"/>
+              </w:rPr>
+              <w:t xml:space="preserve">You are unable to actually create your own trades</w:t>
+            </w:r>
+            <w:r>
+              <w:rPr>
+                <w:sz w:val="18"/>
+              </w:rPr>
+              <w:t xml:space="preserve">" (Dec 15 2025, +8); "feels more like an </w:t>
+            </w:r>
+            <w:r>
+              <w:rPr>
+                <w:b/>
+                <w:sz w:val="18"/>
+              </w:rPr>
+              <w:t xml:space="preserve">Excel simulator</w:t>
+            </w:r>
+            <w:r>
+              <w:rPr>
+                <w:sz w:val="18"/>
+              </w:rPr>
+              <w:t xml:space="preserve"> than a game" (Oct 22 2025, +18); teams give away every draft pick and cripple themselves for years (Dec 15 2025)</w:t>
+            </w:r>
+          </w:p>
+        </w:tc>
+      </w:tr>
+      <w:tr>
+        <w:tc>
+          <w:tcPr>
+            <w:tcW w:w="1680" w:type="dxa"/>
+          </w:tcPr>
+          <w:p>
+            <w:pPr>
+              <w:spacing w:before="40" w:after="40"/>
+            </w:pPr>
+            <w:r>
+              <w:rPr>
+                <w:b/>
+                <w:sz w:val="18"/>
+              </w:rPr>
+              <w:t xml:space="preserve">5. Hyperbound</w:t>
+            </w:r>
+            <w:r>
+              <w:rPr>
+                <w:sz w:val="18"/>
+              </w:rPr>
+              <w:t xml:space="preserve"> *(the AI-roleplay analog — practice against a counterparty, then get scored)*</w:t>
+            </w:r>
+          </w:p>
+        </w:tc>
+        <w:tc>
+          <w:tcPr>
+            <w:tcW w:w="1680" w:type="dxa"/>
+          </w:tcPr>
+          <w:p>
+            <w:pPr>
+              <w:spacing w:before="40" w:after="40"/>
+            </w:pPr>
+            <w:r>
+              <w:rPr>
+                <w:b/>
+                <w:sz w:val="18"/>
+              </w:rPr>
+              <w:t xml:space="preserve">Free tier</w:t>
+            </w:r>
+            <w:r>
+              <w:rPr>
+                <w:sz w:val="18"/>
+              </w:rPr>
+              <w:t xml:space="preserve"> (45 prebuilt AI roleplays, example scorecards); </w:t>
+            </w:r>
+            <w:r>
+              <w:rPr>
+                <w:b/>
+                <w:sz w:val="18"/>
+              </w:rPr>
+              <w:t xml:space="preserve">Practice Enterprise and Perform Enterprise are quote-only</w:t>
+            </w:r>
+            <w:r>
+              <w:rPr>
+                <w:sz w:val="18"/>
+              </w:rPr>
+              <w:t xml:space="preserve"> — </w:t>
+            </w:r>
+            <w:hyperlink r:id="rHl44">
+              <w:r>
+                <w:rPr>
+                  <w:rStyle w:val="Hyperlink"/>
+                  <w:sz w:val="18"/>
+                </w:rPr>
+                <w:t xml:space="preserve">pricing page</w:t>
+              </w:r>
+            </w:hyperlink>
+          </w:p>
+        </w:tc>
+        <w:tc>
+          <w:tcPr>
+            <w:tcW w:w="1680" w:type="dxa"/>
+          </w:tcPr>
+          <w:p>
+            <w:pPr>
+              <w:spacing w:before="40" w:after="40"/>
+            </w:pPr>
+            <w:r>
+              <w:rPr>
+                <w:sz w:val="18"/>
+              </w:rPr>
+              <w:t xml:space="preserve">1. AI personas trained on </w:t>
+            </w:r>
+            <w:r>
+              <w:rPr>
+                <w:b/>
+                <w:sz w:val="18"/>
+              </w:rPr>
+              <w:t xml:space="preserve">2M+ hours of real B2B call data</w:t>
+            </w:r>
+            <w:r>
+              <w:rPr>
+                <w:sz w:val="18"/>
+              </w:rPr>
+              <w:t xml:space="preserve"> 2. Multiparty deal scenarios 3. Scorecards, analytics and real-call scoring</w:t>
+            </w:r>
+          </w:p>
+        </w:tc>
+        <w:tc>
+          <w:tcPr>
+            <w:tcW w:w="1680" w:type="dxa"/>
+          </w:tcPr>
+          <w:p>
+            <w:pPr>
+              <w:spacing w:before="40" w:after="40"/>
+            </w:pPr>
+            <w:r>
+              <w:rPr>
+                <w:sz w:val="18"/>
+              </w:rPr>
+              <w:t xml:space="preserve">B2B sales teams — </w:t>
+            </w:r>
+            <w:r>
+              <w:rPr>
+                <w:b/>
+                <w:sz w:val="18"/>
+              </w:rPr>
+              <w:t xml:space="preserve">not sport</w:t>
+            </w:r>
+          </w:p>
+        </w:tc>
+        <w:tc>
+          <w:tcPr>
+            <w:tcW w:w="1680" w:type="dxa"/>
+          </w:tcPr>
+          <w:p>
+            <w:pPr>
+              <w:spacing w:before="40" w:after="40"/>
+            </w:pPr>
+            <w:r>
+              <w:rPr>
+                <w:b/>
+                <w:sz w:val="18"/>
+              </w:rPr>
+              <w:t xml:space="preserve">$15M Series A, September 2025, led by Peak XV Partners</w:t>
+            </w:r>
+            <w:r>
+              <w:rPr>
+                <w:sz w:val="18"/>
+              </w:rPr>
+              <w:t xml:space="preserve"> (</w:t>
+            </w:r>
+            <w:hyperlink r:id="rHl19">
+              <w:r>
+                <w:rPr>
+                  <w:rStyle w:val="Hyperlink"/>
+                  <w:sz w:val="18"/>
+                </w:rPr>
+                <w:t xml:space="preserve">Hyperbound</w:t>
+              </w:r>
+            </w:hyperlink>
+            <w:r>
+              <w:rPr>
+                <w:sz w:val="18"/>
+              </w:rPr>
+              <w:t xml:space="preserve">)</w:t>
+            </w:r>
+          </w:p>
+        </w:tc>
+        <w:tc>
+          <w:tcPr>
+            <w:tcW w:w="1680" w:type="dxa"/>
+          </w:tcPr>
+          <w:p>
+            <w:pPr>
+              <w:spacing w:before="40" w:after="40"/>
+            </w:pPr>
+            <w:r>
+              <w:rPr>
+                <w:sz w:val="18"/>
+              </w:rPr>
+              <w:t xml:space="preserve">No public review base found on G2, Capterra or the App Store. </w:t>
+            </w:r>
+            <w:r>
+              <w:rPr>
+                <w:b/>
+                <w:sz w:val="18"/>
+              </w:rPr>
+              <w:t xml:space="preserve">The nearest analog with reviews, CoachCraft, drew:</w:t>
+            </w:r>
+            <w:r>
+              <w:rPr>
+                <w:sz w:val="18"/>
+              </w:rPr>
+              <w:t xml:space="preserve"> "Did a poor job </w:t>
+            </w:r>
+            <w:r>
+              <w:rPr>
+                <w:b/>
+                <w:sz w:val="18"/>
+              </w:rPr>
+              <w:t xml:space="preserve">on purpose</w:t>
+            </w:r>
+            <w:r>
+              <w:rPr>
+                <w:sz w:val="18"/>
+              </w:rPr>
+              <w:t xml:space="preserve">. It said I did great" (1★, Dec 11 2025); app never got past the first screen after signup (1★, Dec 5 2025)</w:t>
+            </w:r>
+          </w:p>
+        </w:tc>
+      </w:tr>
+    </w:tbl>
+    <w:p>
+      <w:pPr>
+        <w:spacing w:after="0"/>
+      </w:pPr>
+    </w:p>
+    <w:p>
+      <w:pPr>
+        <w:pStyle w:val="Heading2"/>
+      </w:pPr>
+      <w:r>
+        <w:t xml:space="preserve">Runners-up</w:t>
+      </w:r>
+    </w:p>
+    <w:tbl>
+      <w:tblPr>
+        <w:tblW w:w="10080" w:type="dxa"/>
+        <w:tblBorders>
+          <w:top w:val="single" w:sz="4" w:space="0" w:color="C9CCD1"/>
+          <w:left w:val="single" w:sz="4" w:space="0" w:color="C9CCD1"/>
+          <w:bottom w:val="single" w:sz="4" w:space="0" w:color="C9CCD1"/>
+          <w:right w:val="single" w:sz="4" w:space="0" w:color="C9CCD1"/>
+          <w:insideH w:val="single" w:sz="4" w:space="0" w:color="C9CCD1"/>
+          <w:insideV w:val="single" w:sz="4" w:space="0" w:color="C9CCD1"/>
+        </w:tblBorders>
+        <w:tblLayout w:type="fixed"/>
+      </w:tblPr>
+      <w:tblGrid>
+        <w:gridCol w:w="3360"/>
+        <w:gridCol w:w="3360"/>
+        <w:gridCol w:w="3360"/>
+      </w:tblGrid>
+      <w:tr>
+        <w:trPr>
+          <w:tblHeader/>
+        </w:trPr>
+        <w:tc>
+          <w:tcPr>
+            <w:tcW w:w="3360" w:type="dxa"/>
+            <w:shd w:val="clear" w:color="auto" w:fill="EFF1F3"/>
+          </w:tcPr>
+          <w:p>
+            <w:pPr>
+              <w:spacing w:before="40" w:after="40"/>
+            </w:pPr>
+            <w:r>
+              <w:rPr>
+                <w:b/>
+                <w:sz w:val="18"/>
+              </w:rPr>
+              <w:t xml:space="preserve">Product</w:t>
+            </w:r>
+          </w:p>
+        </w:tc>
+        <w:tc>
+          <w:tcPr>
+            <w:tcW w:w="3360" w:type="dxa"/>
+            <w:shd w:val="clear" w:color="auto" w:fill="EFF1F3"/>
+          </w:tcPr>
+          <w:p>
+            <w:pPr>
+              <w:spacing w:before="40" w:after="40"/>
+            </w:pPr>
+            <w:r>
+              <w:rPr>
+                <w:b/>
+                <w:sz w:val="18"/>
+              </w:rPr>
+              <w:t xml:space="preserve">Price</w:t>
+            </w:r>
+          </w:p>
+        </w:tc>
+        <w:tc>
+          <w:tcPr>
+            <w:tcW w:w="3360" w:type="dxa"/>
+            <w:shd w:val="clear" w:color="auto" w:fill="EFF1F3"/>
+          </w:tcPr>
+          <w:p>
+            <w:pPr>
+              <w:spacing w:before="40" w:after="40"/>
+            </w:pPr>
+            <w:r>
+              <w:rPr>
+                <w:b/>
+                <w:sz w:val="18"/>
+              </w:rPr>
+              <w:t xml:space="preserve">Why it matters</w:t>
+            </w:r>
+          </w:p>
+        </w:tc>
+      </w:tr>
+      <w:tr>
+        <w:tc>
+          <w:tcPr>
+            <w:tcW w:w="3360" w:type="dxa"/>
+          </w:tcPr>
+          <w:p>
+            <w:pPr>
+              <w:spacing w:before="40" w:after="40"/>
+            </w:pPr>
+            <w:r>
+              <w:rPr>
+                <w:b/>
+                <w:sz w:val="18"/>
+              </w:rPr>
+              <w:t xml:space="preserve">Spotrac</w:t>
+            </w:r>
+          </w:p>
+        </w:tc>
+        <w:tc>
+          <w:tcPr>
+            <w:tcW w:w="3360" w:type="dxa"/>
+          </w:tcPr>
+          <w:p>
+            <w:pPr>
+              <w:spacing w:before="40" w:after="40"/>
+            </w:pPr>
+            <w:r>
+              <w:rPr>
+                <w:b/>
+                <w:sz w:val="18"/>
+              </w:rPr>
+              <w:t xml:space="preserve">$30/year</w:t>
+            </w:r>
+            <w:r>
+              <w:rPr>
+                <w:sz w:val="18"/>
+              </w:rPr>
+              <w:t xml:space="preserve"> premium (</w:t>
+            </w:r>
+            <w:hyperlink r:id="rHl45">
+              <w:r>
+                <w:rPr>
+                  <w:rStyle w:val="Hyperlink"/>
+                  <w:sz w:val="18"/>
+                </w:rPr>
+                <w:t xml:space="preserve">Spotrac</w:t>
+              </w:r>
+            </w:hyperlink>
+            <w:r>
+              <w:rPr>
+                <w:sz w:val="18"/>
+              </w:rPr>
+              <w:t xml:space="preserve">) </w:t>
+            </w:r>
+            <w:r>
+              <w:rPr>
+                <w:rFonts w:ascii="Consolas" w:hAnsi="Consolas"/>
+                <w:sz w:val="18"/>
+              </w:rPr>
+              <w:t xml:space="preserve">[price from the company's own post, not a pricing page]</w:t>
+            </w:r>
+          </w:p>
+        </w:tc>
+        <w:tc>
+          <w:tcPr>
+            <w:tcW w:w="3360" w:type="dxa"/>
+          </w:tcPr>
+          <w:p>
+            <w:pPr>
+              <w:spacing w:before="40" w:after="40"/>
+            </w:pPr>
+            <w:r>
+              <w:rPr>
+                <w:sz w:val="18"/>
+              </w:rPr>
+              <w:t xml:space="preserve">The contract data layer, priced. Static — no counterparty</w:t>
+            </w:r>
+          </w:p>
+        </w:tc>
+      </w:tr>
+      <w:tr>
+        <w:tc>
+          <w:tcPr>
+            <w:tcW w:w="3360" w:type="dxa"/>
+          </w:tcPr>
+          <w:p>
+            <w:pPr>
+              <w:spacing w:before="40" w:after="40"/>
+            </w:pPr>
+            <w:r>
+              <w:rPr>
+                <w:b/>
+                <w:sz w:val="18"/>
+              </w:rPr>
+              <w:t xml:space="preserve">Over The Cap</w:t>
+            </w:r>
+          </w:p>
+        </w:tc>
+        <w:tc>
+          <w:tcPr>
+            <w:tcW w:w="3360" w:type="dxa"/>
+          </w:tcPr>
+          <w:p>
+            <w:pPr>
+              <w:spacing w:before="40" w:after="40"/>
+            </w:pPr>
+            <w:r>
+              <w:rPr>
+                <w:sz w:val="18"/>
+              </w:rPr>
+              <w:t xml:space="preserve">Annual flat fee, </w:t>
+            </w:r>
+            <w:r>
+              <w:rPr>
+                <w:b/>
+                <w:sz w:val="18"/>
+              </w:rPr>
+              <w:t xml:space="preserve">price not published</w:t>
+            </w:r>
+            <w:r>
+              <w:rPr>
+                <w:sz w:val="18"/>
+              </w:rPr>
+              <w:t xml:space="preserve"> (</w:t>
+            </w:r>
+            <w:hyperlink r:id="rHl46">
+              <w:r>
+                <w:rPr>
+                  <w:rStyle w:val="Hyperlink"/>
+                  <w:sz w:val="18"/>
+                </w:rPr>
+                <w:t xml:space="preserve">OTC Premium</w:t>
+              </w:r>
+            </w:hyperlink>
+            <w:r>
+              <w:rPr>
+                <w:sz w:val="18"/>
+              </w:rPr>
+              <w:t xml:space="preserve">)</w:t>
+            </w:r>
+          </w:p>
+        </w:tc>
+        <w:tc>
+          <w:tcPr>
+            <w:tcW w:w="3360" w:type="dxa"/>
+          </w:tcPr>
+          <w:p>
+            <w:pPr>
+              <w:spacing w:before="40" w:after="40"/>
+            </w:pPr>
+            <w:r>
+              <w:rPr>
+                <w:sz w:val="18"/>
+              </w:rPr>
+              <w:t xml:space="preserve">Same role for the NFL</w:t>
+            </w:r>
+          </w:p>
+        </w:tc>
+      </w:tr>
+      <w:tr>
+        <w:tc>
+          <w:tcPr>
+            <w:tcW w:w="3360" w:type="dxa"/>
+          </w:tcPr>
+          <w:p>
+            <w:pPr>
+              <w:spacing w:before="40" w:after="40"/>
+            </w:pPr>
+            <w:r>
+              <w:rPr>
+                <w:b/>
+                <w:sz w:val="18"/>
+              </w:rPr>
+              <w:t xml:space="preserve">NBA 2K26</w:t>
+            </w:r>
+          </w:p>
+        </w:tc>
+        <w:tc>
+          <w:tcPr>
+            <w:tcW w:w="3360" w:type="dxa"/>
+          </w:tcPr>
+          <w:p>
+            <w:pPr>
+              <w:spacing w:before="40" w:after="40"/>
+            </w:pPr>
+            <w:r>
+              <w:rPr>
+                <w:b/>
+                <w:sz w:val="18"/>
+              </w:rPr>
+              <w:t xml:space="preserve">$69.99</w:t>
+            </w:r>
+            <w:r>
+              <w:rPr>
+                <w:sz w:val="18"/>
+              </w:rPr>
+              <w:t xml:space="preserve"> (</w:t>
+            </w:r>
+            <w:hyperlink r:id="rHl47">
+              <w:r>
+                <w:rPr>
+                  <w:rStyle w:val="Hyperlink"/>
+                  <w:sz w:val="18"/>
+                </w:rPr>
+                <w:t xml:space="preserve">Steam</w:t>
+              </w:r>
+            </w:hyperlink>
+            <w:r>
+              <w:rPr>
+                <w:sz w:val="18"/>
+              </w:rPr>
+              <w:t xml:space="preserve">)</w:t>
+            </w:r>
+          </w:p>
+        </w:tc>
+        <w:tc>
+          <w:tcPr>
+            <w:tcW w:w="3360" w:type="dxa"/>
+          </w:tcPr>
+          <w:p>
+            <w:pPr>
+              <w:spacing w:before="40" w:after="40"/>
+            </w:pPr>
+            <w:r>
+              <w:rPr>
+                <w:sz w:val="18"/>
+              </w:rPr>
+              <w:t xml:space="preserve">MyGM/MyLEAGUE; negotiation behind a menu</w:t>
+            </w:r>
+          </w:p>
+        </w:tc>
+      </w:tr>
+      <w:tr>
+        <w:tc>
+          <w:tcPr>
+            <w:tcW w:w="3360" w:type="dxa"/>
+          </w:tcPr>
+          <w:p>
+            <w:pPr>
+              <w:spacing w:before="40" w:after="40"/>
+            </w:pPr>
+            <w:r>
+              <w:rPr>
+                <w:b/>
+                <w:sz w:val="18"/>
+              </w:rPr>
+              <w:t xml:space="preserve">Franchise Hockey Manager 12</w:t>
+            </w:r>
+          </w:p>
+        </w:tc>
+        <w:tc>
+          <w:tcPr>
+            <w:tcW w:w="3360" w:type="dxa"/>
+          </w:tcPr>
+          <w:p>
+            <w:pPr>
+              <w:spacing w:before="40" w:after="40"/>
+            </w:pPr>
+            <w:r>
+              <w:rPr>
+                <w:b/>
+                <w:sz w:val="18"/>
+              </w:rPr>
+              <w:t xml:space="preserve">$19.99</w:t>
+            </w:r>
+            <w:r>
+              <w:rPr>
+                <w:sz w:val="18"/>
+              </w:rPr>
+              <w:t xml:space="preserve"> (</w:t>
+            </w:r>
+            <w:hyperlink r:id="rHl48">
+              <w:r>
+                <w:rPr>
+                  <w:rStyle w:val="Hyperlink"/>
+                  <w:sz w:val="18"/>
+                </w:rPr>
+                <w:t xml:space="preserve">Steam</w:t>
+              </w:r>
+            </w:hyperlink>
+            <w:r>
+              <w:rPr>
+                <w:sz w:val="18"/>
+              </w:rPr>
+              <w:t xml:space="preserve">)</w:t>
+            </w:r>
+          </w:p>
+        </w:tc>
+        <w:tc>
+          <w:tcPr>
+            <w:tcW w:w="3360" w:type="dxa"/>
+          </w:tcPr>
+          <w:p>
+            <w:pPr>
+              <w:spacing w:before="40" w:after="40"/>
+            </w:pPr>
+            <w:r>
+              <w:rPr>
+                <w:sz w:val="18"/>
+              </w:rPr>
+              <w:t xml:space="preserve">Same publisher as OOTP; worst-rated trade AI in the set</w:t>
+            </w:r>
+          </w:p>
+        </w:tc>
+      </w:tr>
+      <w:tr>
+        <w:tc>
+          <w:tcPr>
+            <w:tcW w:w="3360" w:type="dxa"/>
+          </w:tcPr>
+          <w:p>
+            <w:pPr>
+              <w:spacing w:before="40" w:after="40"/>
+            </w:pPr>
+            <w:r>
+              <w:rPr>
+                <w:b/>
+                <w:sz w:val="18"/>
+              </w:rPr>
+              <w:t xml:space="preserve">Second Nature</w:t>
+            </w:r>
+          </w:p>
+        </w:tc>
+        <w:tc>
+          <w:tcPr>
+            <w:tcW w:w="3360" w:type="dxa"/>
+          </w:tcPr>
+          <w:p>
+            <w:pPr>
+              <w:spacing w:before="40" w:after="40"/>
+            </w:pPr>
+            <w:r>
+              <w:rPr>
+                <w:sz w:val="18"/>
+              </w:rPr>
+              <w:t xml:space="preserve">Quote-only</w:t>
+            </w:r>
+          </w:p>
+        </w:tc>
+        <w:tc>
+          <w:tcPr>
+            <w:tcW w:w="3360" w:type="dxa"/>
+          </w:tcPr>
+          <w:p>
+            <w:pPr>
+              <w:spacing w:before="40" w:after="40"/>
+            </w:pPr>
+            <w:r>
+              <w:rPr>
+                <w:b/>
+                <w:sz w:val="18"/>
+              </w:rPr>
+              <w:t xml:space="preserve">$22M Series B, Oct 2025</w:t>
+            </w:r>
+            <w:r>
+              <w:rPr>
+                <w:sz w:val="18"/>
+              </w:rPr>
+              <w:t xml:space="preserve"> — the category is funded twice over</w:t>
+            </w:r>
+          </w:p>
+        </w:tc>
+      </w:tr>
+      <w:tr>
+        <w:tc>
+          <w:tcPr>
+            <w:tcW w:w="3360" w:type="dxa"/>
+          </w:tcPr>
+          <w:p>
+            <w:pPr>
+              <w:spacing w:before="40" w:after="40"/>
+            </w:pPr>
+            <w:r>
+              <w:rPr>
+                <w:b/>
+                <w:sz w:val="18"/>
+              </w:rPr>
+              <w:t xml:space="preserve">Tulane International Baseball Arbitration Competition</w:t>
+            </w:r>
+          </w:p>
+        </w:tc>
+        <w:tc>
+          <w:tcPr>
+            <w:tcW w:w="3360" w:type="dxa"/>
+          </w:tcPr>
+          <w:p>
+            <w:pPr>
+              <w:spacing w:before="40" w:after="40"/>
+            </w:pPr>
+            <w:r>
+              <w:rPr>
+                <w:sz w:val="18"/>
+              </w:rPr>
+              <w:t xml:space="preserve">Free to enter</w:t>
+            </w:r>
+          </w:p>
+        </w:tc>
+        <w:tc>
+          <w:tcPr>
+            <w:tcW w:w="3360" w:type="dxa"/>
+          </w:tcPr>
+          <w:p>
+            <w:pPr>
+              <w:spacing w:before="40" w:after="40"/>
+            </w:pPr>
+            <w:r>
+              <w:rPr>
+                <w:b/>
+                <w:sz w:val="18"/>
+              </w:rPr>
+              <w:t xml:space="preserve">40 law-school teams a year</w:t>
+            </w:r>
+            <w:r>
+              <w:rPr>
+                <w:sz w:val="18"/>
+              </w:rPr>
+              <w:t xml:space="preserve">, judged by MLB executives — the only judged venue that exists</w:t>
+            </w:r>
+          </w:p>
+        </w:tc>
+      </w:tr>
+    </w:tbl>
+    <w:p>
+      <w:pPr>
+        <w:spacing w:after="0"/>
+      </w:pPr>
+    </w:p>
+    <w:p>
+      <w:pPr>
+        <w:pBdr>
+          <w:bottom w:val="single" w:sz="6" w:space="6" w:color="C9CCD1"/>
+        </w:pBdr>
+      </w:pPr>
+    </w:p>
+    <w:p>
+      <w:pPr>
+        <w:pStyle w:val="Heading1"/>
+      </w:pPr>
+      <w:r>
+        <w:t xml:space="preserve">Per-product notes</w:t>
+      </w:r>
+    </w:p>
+    <w:p>
+      <w:pPr>
+        <w:pStyle w:val="Heading2"/>
+      </w:pPr>
+      <w:r>
+        <w:t xml:space="preserve">1. Football Manager 26 — the deepest negotiation loop, and it's a text box</w:t>
+      </w:r>
+    </w:p>
+    <w:p>
+      <w:r>
+        <w:t xml:space="preserve">It models agents, contract clauses, wage structures and competition-specific cap rules better than anything else on the list. And its own players say the negotiation *experience* is lifeless — "text message," "fancy spreadsheet." </w:t>
+      </w:r>
+      <w:r>
+        <w:rPr>
+          <w:b/>
+        </w:rPr>
+        <w:t xml:space="preserve">The depth exists; the encounter doesn't.</w:t>
+      </w:r>
+    </w:p>
+    <w:p>
+      <w:pPr>
+        <w:pStyle w:val="Heading2"/>
+      </w:pPr>
+      <w:r>
+        <w:t xml:space="preserve">2. Out of the Park Baseball 26 — the best rules engine, the worst counterparty</w:t>
+      </w:r>
+    </w:p>
+    <w:p>
+      <w:r>
+        <w:t xml:space="preserve">Arbitration, options, salary retention, 40-man rosters — the mechanics are all there, which is why 1,000-hour veterans stay. </w:t>
+      </w:r>
+      <w:r>
+        <w:rPr>
+          <w:b/>
+        </w:rPr>
+        <w:t xml:space="preserve">The complaint that recurs across three consecutive annual releases is that the AI on the other side of the trade doesn't behave like a rational team.</w:t>
+      </w:r>
+      <w:r>
+        <w:t xml:space="preserve"> That is precisely the thing your product would have to get right.</w:t>
+      </w:r>
+    </w:p>
+    <w:p>
+      <w:pPr>
+        <w:pStyle w:val="Heading2"/>
+      </w:pPr>
+      <w:r>
+        <w:t xml:space="preserve">3. Madden NFL 26 — the audience, not the product</w:t>
+      </w:r>
+    </w:p>
+    <w:p>
+      <w:r>
+        <w:t xml:space="preserve">By far the biggest reach, and the one that most matches the premise's criticism: negotiation is decoration between games. It also demonstrates the platform risk — </w:t>
+      </w:r>
+      <w:r>
+        <w:rPr>
+          <w:b/>
+        </w:rPr>
+        <w:t xml:space="preserve">GM mode was removed from a $70 product after launch</w:t>
+      </w:r>
+      <w:r>
+        <w:t xml:space="preserve">, and the company is now privately held by a consortium with no obligation to explain roadmap decisions.</w:t>
+      </w:r>
+    </w:p>
+    <w:p>
+      <w:pPr>
+        <w:pStyle w:val="Heading2"/>
+      </w:pPr>
+      <w:r>
+        <w:t xml:space="preserve">4. Front Office Football Nine — proof the niche is real and proof it's hard</w:t>
+      </w:r>
+    </w:p>
+    <w:p>
+      <w:r>
+        <w:t xml:space="preserve">A one-person studio built the front-office-only game with no on-field play, and it has a real, if small, audience. It also shows the failure mode: without presentation, "front office simulation" reads as a spreadsheet, and its trade system </w:t>
+      </w:r>
+      <w:r>
+        <w:rPr>
+          <w:b/>
+        </w:rPr>
+        <w:t xml:space="preserve">won't let the user construct an offer at all.</w:t>
+      </w:r>
+    </w:p>
+    <w:p>
+      <w:pPr>
+        <w:pStyle w:val="Heading2"/>
+      </w:pPr>
+      <w:r>
+        <w:t xml:space="preserve">5. Hyperbound — the business model that works, in the wrong industry</w:t>
+      </w:r>
+    </w:p>
+    <w:p>
+      <w:r>
+        <w:t xml:space="preserve">Free tier for individuals, enterprise quotes for teams, $15M raised, AI personas trained on real call recordings, scorecards attached to outcomes. </w:t>
+      </w:r>
+      <w:r>
+        <w:rPr>
+          <w:b/>
+        </w:rPr>
+        <w:t xml:space="preserve">This is the shape of a viable version of your product — it just points at sales teams rather than sport,</w:t>
+      </w:r>
+      <w:r>
+        <w:t xml:space="preserve"> and it is the only product in this table with a working answer to "how do you get scored?"</w:t>
+      </w:r>
+    </w:p>
+    <w:p>
+      <w:pPr>
+        <w:pBdr>
+          <w:bottom w:val="single" w:sz="6" w:space="6" w:color="C9CCD1"/>
+        </w:pBdr>
+      </w:pPr>
+    </w:p>
+    <w:p>
+      <w:pPr>
+        <w:pStyle w:val="Heading1"/>
+      </w:pPr>
+      <w:r>
+        <w:t xml:space="preserve">What does nobody serve well?</w:t>
+      </w:r>
+    </w:p>
+    <w:p>
+      <w:r>
+        <w:rPr>
+          <w:b/>
+        </w:rPr>
+        <w:t xml:space="preserve">1. Nobody lets you make an offer and hear a reasoned counter.</w:t>
+      </w:r>
+      <w:r>
+        <w:t xml:space="preserve"> Front Office Football Nine literally won't let you construct a trade; Football Manager conducts negotiation by text message; Madden and 2K resolve it with a hidden check. </w:t>
+      </w:r>
+      <w:r>
+        <w:rPr>
+          <w:b/>
+        </w:rPr>
+        <w:t xml:space="preserve">The core interaction your premise describes — propose, get pushed back on, revise — does not exist in a commercial product.</w:t>
+      </w:r>
+    </w:p>
+    <w:p>
+      <w:r>
+        <w:rPr>
+          <w:b/>
+        </w:rPr>
+        <w:t xml:space="preserve">2. Nobody models leverage, only legality.</w:t>
+      </w:r>
+      <w:r>
+        <w:t xml:space="preserve"> Spotrac and Over The Cap tell you whether a deal fits under the cap. The sims tell you whether a random roll passed. **Nothing models *why* the other side would say yes** — roster needs, market comparables, deadline pressure, alternatives. A MockOut reviewer asked for exactly this: use "the NFL trade charts to validate trades."</w:t>
+      </w:r>
+    </w:p>
+    <w:p>
+      <w:r>
+        <w:rPr>
+          <w:b/>
+        </w:rPr>
+        <w:t xml:space="preserve">3. Nobody scores you in a way anyone would trust.</w:t>
+      </w:r>
+      <w:r>
+        <w:t xml:space="preserve"> The one AI trainer with public reviews </w:t>
+      </w:r>
+      <w:r>
+        <w:rPr>
+          <w:b/>
+        </w:rPr>
+        <w:t xml:space="preserve">told a user they did great after they deliberately performed badly.</w:t>
+      </w:r>
+      <w:r>
+        <w:t xml:space="preserve"> And no evidence exists that any front office or agency recognises a simulator score. </w:t>
+      </w:r>
+      <w:r>
+        <w:rPr>
+          <w:rFonts w:ascii="Consolas" w:hAnsi="Consolas"/>
+        </w:rPr>
+        <w:t xml:space="preserve">[UNVERIFIED — absence of evidence, not proof of absence.]</w:t>
+      </w:r>
+    </w:p>
+    <w:p>
+      <w:r>
+        <w:rPr>
+          <w:b/>
+        </w:rPr>
+        <w:t xml:space="preserve">4. Nobody puts you on the agent's side of the table.</w:t>
+      </w:r>
+      <w:r>
+        <w:t xml:space="preserve"> Every serious product casts you as the GM. The agent-side products are mobile idle games — Basketball Agent Manager Star's own reviewers say contract and endorsement deals "need some work." </w:t>
+      </w:r>
+      <w:r>
+        <w:rPr>
+          <w:b/>
+        </w:rPr>
+        <w:t xml:space="preserve">Half the negotiation has no simulator at all.</w:t>
+      </w:r>
+    </w:p>
+    <w:p>
+      <w:r>
+        <w:rPr>
+          <w:b/>
+        </w:rPr>
+        <w:t xml:space="preserve">5. Nobody connects practice to the credential.</w:t>
+      </w:r>
+      <w:r>
+        <w:t xml:space="preserve"> The Tulane arbitration competition is the only judged venue and it takes </w:t>
+      </w:r>
+      <w:r>
+        <w:rPr>
+          <w:b/>
+        </w:rPr>
+        <w:t xml:space="preserve">40 law-school teams once a year</w:t>
+      </w:r>
+      <w:r>
+        <w:t xml:space="preserve">. </w:t>
+      </w:r>
+      <w:r>
+        <w:rPr>
+          <w:rFonts w:ascii="Consolas" w:hAnsi="Consolas"/>
+        </w:rPr>
+        <w:t xml:space="preserve">[UNVERIFIED: whether employers would accept any alternative credential.]</w:t>
+      </w:r>
+    </w:p>
+    <w:p>
+      <w:r>
+        <w:rPr>
+          <w:b/>
+        </w:rPr>
+        <w:t xml:space="preserve">6. Nobody prices for the people who need it.</w:t>
+      </w:r>
+      <w:r>
+        <w:t xml:space="preserve"> The options are a $30–$70 one-time game or a quote-only enterprise sales platform. </w:t>
+      </w:r>
+      <w:r>
+        <w:rPr>
+          <w:b/>
+        </w:rPr>
+        <w:t xml:space="preserve">There is no student or program tier anywhere in this market</w:t>
+      </w:r>
+      <w:r>
+        <w:t xml:space="preserve"> — and Section 2 showed the mobile middle ground collapsing into ad walls and pay-to-trade.</w:t>
+      </w:r>
+    </w:p>
+    <w:p>
+      <w:r>
+        <w:rPr>
+          <w:b/>
+        </w:rPr>
+        <w:t xml:space="preserve">7. Nobody uses the real public data inside a simulation.</w:t>
+      </w:r>
+      <w:r>
+        <w:t xml:space="preserve"> Spotrac, Over The Cap and the CBAs are public; the sims use invented cap environments. </w:t>
+      </w:r>
+      <w:r>
+        <w:rPr>
+          <w:b/>
+        </w:rPr>
+        <w:t xml:space="preserve">Nothing lets you negotiate a real contract, at a real cap position, for a real player.</w:t>
+      </w:r>
+    </w:p>
+    <w:p>
+      <w:pPr>
+        <w:pStyle w:val="Heading2"/>
+      </w:pPr>
+      <w:r>
+        <w:t xml:space="preserve">The sharpest wedge</w:t>
+      </w:r>
+    </w:p>
+    <w:p>
+      <w:r>
+        <w:rPr>
+          <w:b/>
+        </w:rPr>
+        <w:t xml:space="preserve">An agent-side negotiation you can actually conduct — offer, counter, reasons — against a counterparty whose position comes from real public cap and comparable data, scored on a rubric a program can grade and an employer could read.</w:t>
+      </w:r>
+      <w:r>
+        <w:t xml:space="preserve"> Items 1, 2, 4 and 7 are all empty, and item 5 is where the value would have to be proven.</w:t>
+      </w:r>
+    </w:p>
+    <w:p>
+      <w:r>
+        <w:rPr>
+          <w:b/>
+        </w:rPr>
+        <w:t xml:space="preserve">The hard parts, in order:</w:t>
+      </w:r>
+      <w:r>
+        <w:t xml:space="preserve"> making the counterparty's reasoning defensible (OOTP has failed at this across three releases), making the score trustworthy (the AI-trainer analog failed instantly), and getting anyone to accept the credential (no evidence anyone would).</w:t>
+      </w:r>
+    </w:p>
+    <w:p>
+      <w:pPr>
+        <w:pBdr>
+          <w:bottom w:val="single" w:sz="6" w:space="6" w:color="C9CCD1"/>
+        </w:pBdr>
+      </w:pPr>
+    </w:p>
+    <w:p>
+      <w:pPr>
+        <w:pStyle w:val="Heading1"/>
+      </w:pPr>
+      <w:r>
+        <w:t xml:space="preserve">Flags</w:t>
+      </w:r>
+    </w:p>
+    <w:tbl>
+      <w:tblPr>
+        <w:tblW w:w="10080" w:type="dxa"/>
+        <w:tblBorders>
+          <w:top w:val="single" w:sz="4" w:space="0" w:color="C9CCD1"/>
+          <w:left w:val="single" w:sz="4" w:space="0" w:color="C9CCD1"/>
+          <w:bottom w:val="single" w:sz="4" w:space="0" w:color="C9CCD1"/>
+          <w:right w:val="single" w:sz="4" w:space="0" w:color="C9CCD1"/>
+          <w:insideH w:val="single" w:sz="4" w:space="0" w:color="C9CCD1"/>
+          <w:insideV w:val="single" w:sz="4" w:space="0" w:color="C9CCD1"/>
+        </w:tblBorders>
+        <w:tblLayout w:type="fixed"/>
+      </w:tblPr>
+      <w:tblGrid>
+        <w:gridCol w:w="5040"/>
+        <w:gridCol w:w="5040"/>
+      </w:tblGrid>
+      <w:tr>
+        <w:trPr>
+          <w:tblHeader/>
+        </w:trPr>
+        <w:tc>
+          <w:tcPr>
+            <w:tcW w:w="5040" w:type="dxa"/>
+            <w:shd w:val="clear" w:color="auto" w:fill="EFF1F3"/>
+          </w:tcPr>
+          <w:p>
+            <w:pPr>
+              <w:spacing w:before="40" w:after="40"/>
+            </w:pPr>
+            <w:r>
+              <w:rPr>
+                <w:b/>
+                <w:sz w:val="18"/>
+              </w:rPr>
+              <w:t xml:space="preserve">Item</w:t>
+            </w:r>
+          </w:p>
+        </w:tc>
+        <w:tc>
+          <w:tcPr>
+            <w:tcW w:w="5040" w:type="dxa"/>
+            <w:shd w:val="clear" w:color="auto" w:fill="EFF1F3"/>
+          </w:tcPr>
+          <w:p>
+            <w:pPr>
+              <w:spacing w:before="40" w:after="40"/>
+            </w:pPr>
+            <w:r>
+              <w:rPr>
+                <w:b/>
+                <w:sz w:val="18"/>
+              </w:rPr>
+              <w:t xml:space="preserve">Status</w:t>
+            </w:r>
+          </w:p>
+        </w:tc>
+      </w:tr>
+      <w:tr>
+        <w:tc>
+          <w:tcPr>
+            <w:tcW w:w="5040" w:type="dxa"/>
+          </w:tcPr>
+          <w:p>
+            <w:pPr>
+              <w:spacing w:before="40" w:after="40"/>
+            </w:pPr>
+            <w:r>
+              <w:rPr>
+                <w:b/>
+                <w:sz w:val="18"/>
+              </w:rPr>
+              <w:t xml:space="preserve">Prices</w:t>
+            </w:r>
+          </w:p>
+        </w:tc>
+        <w:tc>
+          <w:tcPr>
+            <w:tcW w:w="5040" w:type="dxa"/>
+          </w:tcPr>
+          <w:p>
+            <w:pPr>
+              <w:spacing w:before="40" w:after="40"/>
+            </w:pPr>
+            <w:r>
+              <w:rPr>
+                <w:sz w:val="18"/>
+              </w:rPr>
+              <w:t xml:space="preserve">✅ Verified — Steam store pages are the publishers' own listings. US pricing, standard editions, at the date of this research.</w:t>
+            </w:r>
+          </w:p>
+        </w:tc>
+      </w:tr>
+      <w:tr>
+        <w:tc>
+          <w:tcPr>
+            <w:tcW w:w="5040" w:type="dxa"/>
+          </w:tcPr>
+          <w:p>
+            <w:pPr>
+              <w:spacing w:before="40" w:after="40"/>
+            </w:pPr>
+            <w:r>
+              <w:rPr>
+                <w:b/>
+                <w:sz w:val="18"/>
+              </w:rPr>
+              <w:t xml:space="preserve">Spotrac's $30/year</w:t>
+            </w:r>
+          </w:p>
+        </w:tc>
+        <w:tc>
+          <w:tcPr>
+            <w:tcW w:w="5040" w:type="dxa"/>
+          </w:tcPr>
+          <w:p>
+            <w:pPr>
+              <w:spacing w:before="40" w:after="40"/>
+            </w:pPr>
+            <w:r>
+              <w:rPr>
+                <w:sz w:val="18"/>
+              </w:rPr>
+              <w:t xml:space="preserve">⚠️ From Spotrac's own social post, not a pricing page (their site returns 403 to this tool).</w:t>
+            </w:r>
+          </w:p>
+        </w:tc>
+      </w:tr>
+      <w:tr>
+        <w:tc>
+          <w:tcPr>
+            <w:tcW w:w="5040" w:type="dxa"/>
+          </w:tcPr>
+          <w:p>
+            <w:pPr>
+              <w:spacing w:before="40" w:after="40"/>
+            </w:pPr>
+            <w:r>
+              <w:rPr>
+                <w:b/>
+                <w:sz w:val="18"/>
+              </w:rPr>
+              <w:t xml:space="preserve">Over The Cap price</w:t>
+            </w:r>
+          </w:p>
+        </w:tc>
+        <w:tc>
+          <w:tcPr>
+            <w:tcW w:w="5040" w:type="dxa"/>
+          </w:tcPr>
+          <w:p>
+            <w:pPr>
+              <w:spacing w:before="40" w:after="40"/>
+            </w:pPr>
+            <w:r>
+              <w:rPr>
+                <w:sz w:val="18"/>
+              </w:rPr>
+              <w:t xml:space="preserve">❌ Not published.</w:t>
+            </w:r>
+          </w:p>
+        </w:tc>
+      </w:tr>
+      <w:tr>
+        <w:tc>
+          <w:tcPr>
+            <w:tcW w:w="5040" w:type="dxa"/>
+          </w:tcPr>
+          <w:p>
+            <w:pPr>
+              <w:spacing w:before="40" w:after="40"/>
+            </w:pPr>
+            <w:r>
+              <w:rPr>
+                <w:b/>
+                <w:sz w:val="18"/>
+              </w:rPr>
+              <w:t xml:space="preserve">SEGA / Com2uS listing status</w:t>
+            </w:r>
+          </w:p>
+        </w:tc>
+        <w:tc>
+          <w:tcPr>
+            <w:tcW w:w="5040" w:type="dxa"/>
+          </w:tcPr>
+          <w:p>
+            <w:pPr>
+              <w:spacing w:before="40" w:after="40"/>
+            </w:pPr>
+            <w:r>
+              <w:rPr>
+                <w:sz w:val="18"/>
+              </w:rPr>
+              <w:t xml:space="preserve">⚠️ Both are publicly traded in their home markets; I did not verify tickers or current financials. </w:t>
+            </w:r>
+            <w:r>
+              <w:rPr>
+                <w:rFonts w:ascii="Consolas" w:hAnsi="Consolas"/>
+                <w:sz w:val="18"/>
+              </w:rPr>
+              <w:t xml:space="preserve">[UNVERIFIED]</w:t>
+            </w:r>
+          </w:p>
+        </w:tc>
+      </w:tr>
+      <w:tr>
+        <w:tc>
+          <w:tcPr>
+            <w:tcW w:w="5040" w:type="dxa"/>
+          </w:tcPr>
+          <w:p>
+            <w:pPr>
+              <w:spacing w:before="40" w:after="40"/>
+            </w:pPr>
+            <w:r>
+              <w:rPr>
+                <w:b/>
+                <w:sz w:val="18"/>
+              </w:rPr>
+              <w:t xml:space="preserve">Front Office Football funding</w:t>
+            </w:r>
+          </w:p>
+        </w:tc>
+        <w:tc>
+          <w:tcPr>
+            <w:tcW w:w="5040" w:type="dxa"/>
+          </w:tcPr>
+          <w:p>
+            <w:pPr>
+              <w:spacing w:before="40" w:after="40"/>
+            </w:pPr>
+            <w:r>
+              <w:rPr>
+                <w:sz w:val="18"/>
+              </w:rPr>
+              <w:t xml:space="preserve">⚠️ No outside funding found; "one-developer studio" is inferred from the studio's own materials. </w:t>
+            </w:r>
+            <w:r>
+              <w:rPr>
+                <w:rFonts w:ascii="Consolas" w:hAnsi="Consolas"/>
+                <w:sz w:val="18"/>
+              </w:rPr>
+              <w:t xml:space="preserve">[UNVERIFIED]</w:t>
+            </w:r>
+          </w:p>
+        </w:tc>
+      </w:tr>
+      <w:tr>
+        <w:tc>
+          <w:tcPr>
+            <w:tcW w:w="5040" w:type="dxa"/>
+          </w:tcPr>
+          <w:p>
+            <w:pPr>
+              <w:spacing w:before="40" w:after="40"/>
+            </w:pPr>
+            <w:r>
+              <w:rPr>
+                <w:b/>
+                <w:sz w:val="18"/>
+              </w:rPr>
+              <w:t xml:space="preserve">Hyperbound as a competitor</w:t>
+            </w:r>
+          </w:p>
+        </w:tc>
+        <w:tc>
+          <w:tcPr>
+            <w:tcW w:w="5040" w:type="dxa"/>
+          </w:tcPr>
+          <w:p>
+            <w:pPr>
+              <w:spacing w:before="40" w:after="40"/>
+            </w:pPr>
+            <w:r>
+              <w:rPr>
+                <w:sz w:val="18"/>
+              </w:rPr>
+              <w:t xml:space="preserve">⚠️ </w:t>
+            </w:r>
+            <w:r>
+              <w:rPr>
+                <w:b/>
+                <w:sz w:val="18"/>
+              </w:rPr>
+              <w:t xml:space="preserve">It is not a sports product.</w:t>
+            </w:r>
+            <w:r>
+              <w:rPr>
+                <w:sz w:val="18"/>
+              </w:rPr>
+              <w:t xml:space="preserve"> Included because it is the only funded example of the mechanic your app depends on.</w:t>
+            </w:r>
+          </w:p>
+        </w:tc>
+      </w:tr>
+      <w:tr>
+        <w:tc>
+          <w:tcPr>
+            <w:tcW w:w="5040" w:type="dxa"/>
+          </w:tcPr>
+          <w:p>
+            <w:pPr>
+              <w:spacing w:before="40" w:after="40"/>
+            </w:pPr>
+            <w:r>
+              <w:rPr>
+                <w:b/>
+                <w:sz w:val="18"/>
+              </w:rPr>
+              <w:t xml:space="preserve">Hyperbound complaints</w:t>
+            </w:r>
+          </w:p>
+        </w:tc>
+        <w:tc>
+          <w:tcPr>
+            <w:tcW w:w="5040" w:type="dxa"/>
+          </w:tcPr>
+          <w:p>
+            <w:pPr>
+              <w:spacing w:before="40" w:after="40"/>
+            </w:pPr>
+            <w:r>
+              <w:rPr>
+                <w:sz w:val="18"/>
+              </w:rPr>
+              <w:t xml:space="preserve">❌ None found — no G2, Capterra or App Store review base. The CoachCraft quotes are from a </w:t>
+            </w:r>
+            <w:r>
+              <w:rPr>
+                <w:b/>
+                <w:sz w:val="18"/>
+              </w:rPr>
+              <w:t xml:space="preserve">different, much smaller</w:t>
+            </w:r>
+            <w:r>
+              <w:rPr>
+                <w:sz w:val="18"/>
+              </w:rPr>
+              <w:t xml:space="preserve"> AI trainer and are a proxy.</w:t>
+            </w:r>
+          </w:p>
+        </w:tc>
+      </w:tr>
+      <w:tr>
+        <w:tc>
+          <w:tcPr>
+            <w:tcW w:w="5040" w:type="dxa"/>
+          </w:tcPr>
+          <w:p>
+            <w:pPr>
+              <w:spacing w:before="40" w:after="40"/>
+            </w:pPr>
+            <w:r>
+              <w:rPr>
+                <w:b/>
+                <w:sz w:val="18"/>
+              </w:rPr>
+              <w:t xml:space="preserve">Employer recognition of simulator credentials</w:t>
+            </w:r>
+          </w:p>
+        </w:tc>
+        <w:tc>
+          <w:tcPr>
+            <w:tcW w:w="5040" w:type="dxa"/>
+          </w:tcPr>
+          <w:p>
+            <w:pPr>
+              <w:spacing w:before="40" w:after="40"/>
+            </w:pPr>
+            <w:r>
+              <w:rPr>
+                <w:sz w:val="18"/>
+              </w:rPr>
+              <w:t xml:space="preserve">❌ No evidence found in either direction.</w:t>
+            </w:r>
+          </w:p>
+        </w:tc>
+      </w:tr>
+      <w:tr>
+        <w:tc>
+          <w:tcPr>
+            <w:tcW w:w="5040" w:type="dxa"/>
+          </w:tcPr>
+          <w:p>
+            <w:pPr>
+              <w:spacing w:before="40" w:after="40"/>
+            </w:pPr>
+            <w:r>
+              <w:rPr>
+                <w:b/>
+                <w:sz w:val="18"/>
+              </w:rPr>
+              <w:t xml:space="preserve">Reddit / G2 / Capterra</w:t>
+            </w:r>
+          </w:p>
+        </w:tc>
+        <w:tc>
+          <w:tcPr>
+            <w:tcW w:w="5040" w:type="dxa"/>
+          </w:tcPr>
+          <w:p>
+            <w:pPr>
+              <w:spacing w:before="40" w:after="40"/>
+            </w:pPr>
+            <w:r>
+              <w:rPr>
+                <w:sz w:val="18"/>
+              </w:rPr>
+              <w:t xml:space="preserve">❌ Reddit blocked; G2 and Capterra list none of these products.</w:t>
+            </w:r>
+          </w:p>
+        </w:tc>
+      </w:tr>
+      <w:tr>
+        <w:tc>
+          <w:tcPr>
+            <w:tcW w:w="5040" w:type="dxa"/>
+          </w:tcPr>
+          <w:p>
+            <w:pPr>
+              <w:spacing w:before="40" w:after="40"/>
+            </w:pPr>
+            <w:r>
+              <w:rPr>
+                <w:b/>
+                <w:sz w:val="18"/>
+              </w:rPr>
+              <w:t xml:space="preserve">Console franchise modes</w:t>
+            </w:r>
+          </w:p>
+        </w:tc>
+        <w:tc>
+          <w:tcPr>
+            <w:tcW w:w="5040" w:type="dxa"/>
+          </w:tcPr>
+          <w:p>
+            <w:pPr>
+              <w:spacing w:before="40" w:after="40"/>
+            </w:pPr>
+            <w:r>
+              <w:rPr>
+                <w:sz w:val="18"/>
+              </w:rPr>
+              <w:t xml:space="preserve">⚠️ Madden and NBA 2K complaint evidence is </w:t>
+            </w:r>
+            <w:r>
+              <w:rPr>
+                <w:b/>
+                <w:sz w:val="18"/>
+              </w:rPr>
+              <w:t xml:space="preserve">PC-only</w:t>
+            </w:r>
+            <w:r>
+              <w:rPr>
+                <w:sz w:val="18"/>
+              </w:rPr>
+              <w:t xml:space="preserve">, and PC is the smaller share of both audiences.</w:t>
             </w:r>
           </w:p>
         </w:tc>

</xml_diff>

<commit_message>
Add bottom-up market sizing model to SportsNegotiationApp dossier
Co-Authored-By: Claude Opus 5 <noreply@anthropic.com>
</commit_message>
<xml_diff>
--- a/12_SportsNegotiationApp/ResearchAgents/SportsNegotiationApp_Research.docx
+++ b/12_SportsNegotiationApp/ResearchAgents/SportsNegotiationApp_Research.docx
@@ -93,6 +93,17 @@
       </w:pPr>
       <w:r>
         <w:t xml:space="preserve">Section 3 — Competitor Teardown: the five closest products, their pricing, ownership and complaints, plus the gaps nobody serves. *(Added Sept 25, 2026)*</w:t>
+      </w:r>
+    </w:p>
+    <w:p>
+      <w:pPr>
+        <w:numPr>
+          <w:ilvl w:val="0"/>
+          <w:numId w:val="1"/>
+        </w:numPr>
+      </w:pPr>
+      <w:r>
+        <w:t xml:space="preserve">Section 4 — Bottom-Up Market Size: three separate customer populations at $100/year, with conservative, base and optimistic cases and every assumption stated. *(Added Sept 25, 2026)*</w:t>
       </w:r>
     </w:p>
     <w:p>
@@ -8972,6 +8983,4837 @@
                 <w:sz w:val="18"/>
               </w:rPr>
               <w:t xml:space="preserve">, and PC is the smaller share of both audiences.</w:t>
+            </w:r>
+          </w:p>
+        </w:tc>
+      </w:tr>
+    </w:tbl>
+    <w:p>
+      <w:pPr>
+        <w:spacing w:after="0"/>
+      </w:pPr>
+    </w:p>
+    <w:p>
+      <w:r>
+        <w:br w:type="page"/>
+      </w:r>
+    </w:p>
+    <w:p>
+      <w:pPr>
+        <w:pStyle w:val="Title"/>
+      </w:pPr>
+      <w:r>
+        <w:t xml:space="preserve">Bottom-Up Market Size — $100/year Sports Negotiation App</w:t>
+      </w:r>
+    </w:p>
+    <w:p>
+      <w:r>
+        <w:rPr>
+          <w:b/>
+        </w:rPr>
+        <w:t xml:space="preserve">Prepared:</w:t>
+      </w:r>
+      <w:r>
+        <w:t xml:space="preserve"> September 25, 2026</w:t>
+      </w:r>
+    </w:p>
+    <w:p>
+      <w:r>
+        <w:rPr>
+          <w:b/>
+        </w:rPr>
+        <w:t xml:space="preserve">Method:</w:t>
+      </w:r>
+      <w:r>
+        <w:t xml:space="preserve"> Population → behavioral gates → adoption → revenue, for three separate customer groups. </w:t>
+      </w:r>
+      <w:r>
+        <w:rPr>
+          <w:b/>
+        </w:rPr>
+        <w:t xml:space="preserve">No top-down share of any sports or gaming market total is used.</w:t>
+      </w:r>
+    </w:p>
+    <w:p>
+      <w:pPr>
+        <w:pBdr>
+          <w:bottom w:val="single" w:sz="6" w:space="6" w:color="C9CCD1"/>
+        </w:pBdr>
+      </w:pPr>
+    </w:p>
+    <w:p>
+      <w:pPr>
+        <w:pStyle w:val="Heading1"/>
+      </w:pPr>
+      <w:r>
+        <w:t xml:space="preserve">Three populations, counted separately</w:t>
+      </w:r>
+    </w:p>
+    <w:p>
+      <w:r>
+        <w:t xml:space="preserve">The product has three plausible buyers and they are not the same people. Each is sized on its own.</w:t>
+      </w:r>
+    </w:p>
+    <w:tbl>
+      <w:tblPr>
+        <w:tblW w:w="10080" w:type="dxa"/>
+        <w:tblBorders>
+          <w:top w:val="single" w:sz="4" w:space="0" w:color="C9CCD1"/>
+          <w:left w:val="single" w:sz="4" w:space="0" w:color="C9CCD1"/>
+          <w:bottom w:val="single" w:sz="4" w:space="0" w:color="C9CCD1"/>
+          <w:right w:val="single" w:sz="4" w:space="0" w:color="C9CCD1"/>
+          <w:insideH w:val="single" w:sz="4" w:space="0" w:color="C9CCD1"/>
+          <w:insideV w:val="single" w:sz="4" w:space="0" w:color="C9CCD1"/>
+        </w:tblBorders>
+        <w:tblLayout w:type="fixed"/>
+      </w:tblPr>
+      <w:tblGrid>
+        <w:gridCol w:w="2520"/>
+        <w:gridCol w:w="2520"/>
+        <w:gridCol w:w="2520"/>
+        <w:gridCol w:w="2520"/>
+      </w:tblGrid>
+      <w:tr>
+        <w:trPr>
+          <w:tblHeader/>
+        </w:trPr>
+        <w:tc>
+          <w:tcPr>
+            <w:tcW w:w="2520" w:type="dxa"/>
+            <w:shd w:val="clear" w:color="auto" w:fill="EFF1F3"/>
+          </w:tcPr>
+          <w:p>
+            <w:pPr>
+              <w:spacing w:before="40" w:after="40"/>
+            </w:pPr>
+            <w:r>
+              <w:rPr>
+                <w:b/>
+                <w:sz w:val="18"/>
+              </w:rPr>
+              <w:t xml:space="preserve">Path</w:t>
+            </w:r>
+          </w:p>
+        </w:tc>
+        <w:tc>
+          <w:tcPr>
+            <w:tcW w:w="2520" w:type="dxa"/>
+            <w:shd w:val="clear" w:color="auto" w:fill="EFF1F3"/>
+          </w:tcPr>
+          <w:p>
+            <w:pPr>
+              <w:spacing w:before="40" w:after="40"/>
+            </w:pPr>
+            <w:r>
+              <w:rPr>
+                <w:b/>
+                <w:sz w:val="18"/>
+              </w:rPr>
+              <w:t xml:space="preserve">Who</w:t>
+            </w:r>
+          </w:p>
+        </w:tc>
+        <w:tc>
+          <w:tcPr>
+            <w:tcW w:w="2520" w:type="dxa"/>
+            <w:shd w:val="clear" w:color="auto" w:fill="EFF1F3"/>
+          </w:tcPr>
+          <w:p>
+            <w:pPr>
+              <w:spacing w:before="40" w:after="40"/>
+            </w:pPr>
+            <w:r>
+              <w:rPr>
+                <w:b/>
+                <w:sz w:val="18"/>
+              </w:rPr>
+              <w:t xml:space="preserve">Countable population</w:t>
+            </w:r>
+          </w:p>
+        </w:tc>
+        <w:tc>
+          <w:tcPr>
+            <w:tcW w:w="2520" w:type="dxa"/>
+            <w:shd w:val="clear" w:color="auto" w:fill="EFF1F3"/>
+          </w:tcPr>
+          <w:p>
+            <w:pPr>
+              <w:spacing w:before="40" w:after="40"/>
+            </w:pPr>
+            <w:r>
+              <w:rPr>
+                <w:b/>
+                <w:sz w:val="18"/>
+              </w:rPr>
+              <w:t xml:space="preserve">Source</w:t>
+            </w:r>
+          </w:p>
+        </w:tc>
+      </w:tr>
+      <w:tr>
+        <w:tc>
+          <w:tcPr>
+            <w:tcW w:w="2520" w:type="dxa"/>
+          </w:tcPr>
+          <w:p>
+            <w:pPr>
+              <w:spacing w:before="40" w:after="40"/>
+            </w:pPr>
+            <w:r>
+              <w:rPr>
+                <w:b/>
+                <w:sz w:val="18"/>
+              </w:rPr>
+              <w:t xml:space="preserve">A — Career</w:t>
+            </w:r>
+          </w:p>
+        </w:tc>
+        <w:tc>
+          <w:tcPr>
+            <w:tcW w:w="2520" w:type="dxa"/>
+          </w:tcPr>
+          <w:p>
+            <w:pPr>
+              <w:spacing w:before="40" w:after="40"/>
+            </w:pPr>
+            <w:r>
+              <w:rPr>
+                <w:sz w:val="18"/>
+              </w:rPr>
+              <w:t xml:space="preserve">Sport management students aiming at deal-side roles</w:t>
+            </w:r>
+          </w:p>
+        </w:tc>
+        <w:tc>
+          <w:tcPr>
+            <w:tcW w:w="2520" w:type="dxa"/>
+          </w:tcPr>
+          <w:p>
+            <w:pPr>
+              <w:spacing w:before="40" w:after="40"/>
+            </w:pPr>
+            <w:r>
+              <w:rPr>
+                <w:b/>
+                <w:sz w:val="18"/>
+              </w:rPr>
+              <w:t xml:space="preserve">~20,400</w:t>
+            </w:r>
+          </w:p>
+        </w:tc>
+        <w:tc>
+          <w:tcPr>
+            <w:tcW w:w="2520" w:type="dxa"/>
+          </w:tcPr>
+          <w:p>
+            <w:pPr>
+              <w:spacing w:before="40" w:after="40"/>
+            </w:pPr>
+            <w:r>
+              <w:rPr>
+                <w:sz w:val="18"/>
+              </w:rPr>
+              <w:t xml:space="preserve">Derived from degrees awarded</w:t>
+            </w:r>
+          </w:p>
+        </w:tc>
+      </w:tr>
+      <w:tr>
+        <w:tc>
+          <w:tcPr>
+            <w:tcW w:w="2520" w:type="dxa"/>
+          </w:tcPr>
+          <w:p>
+            <w:pPr>
+              <w:spacing w:before="40" w:after="40"/>
+            </w:pPr>
+            <w:r>
+              <w:rPr>
+                <w:b/>
+                <w:sz w:val="18"/>
+              </w:rPr>
+              <w:t xml:space="preserve">B — Enthusiast</w:t>
+            </w:r>
+          </w:p>
+        </w:tc>
+        <w:tc>
+          <w:tcPr>
+            <w:tcW w:w="2520" w:type="dxa"/>
+          </w:tcPr>
+          <w:p>
+            <w:pPr>
+              <w:spacing w:before="40" w:after="40"/>
+            </w:pPr>
+            <w:r>
+              <w:rPr>
+                <w:sz w:val="18"/>
+              </w:rPr>
+              <w:t xml:space="preserve">PC owners of deep sports-management sims</w:t>
+            </w:r>
+          </w:p>
+        </w:tc>
+        <w:tc>
+          <w:tcPr>
+            <w:tcW w:w="2520" w:type="dxa"/>
+          </w:tcPr>
+          <w:p>
+            <w:pPr>
+              <w:spacing w:before="40" w:after="40"/>
+            </w:pPr>
+            <w:r>
+              <w:rPr>
+                <w:b/>
+                <w:sz w:val="18"/>
+              </w:rPr>
+              <w:t xml:space="preserve">~305,000</w:t>
+            </w:r>
+          </w:p>
+        </w:tc>
+        <w:tc>
+          <w:tcPr>
+            <w:tcW w:w="2520" w:type="dxa"/>
+          </w:tcPr>
+          <w:p>
+            <w:pPr>
+              <w:spacing w:before="40" w:after="40"/>
+            </w:pPr>
+            <w:r>
+              <w:rPr>
+                <w:sz w:val="18"/>
+              </w:rPr>
+              <w:t xml:space="preserve">Derived from Steam review counts </w:t>
+            </w:r>
+            <w:r>
+              <w:rPr>
+                <w:rFonts w:ascii="Consolas" w:hAnsi="Consolas"/>
+                <w:sz w:val="18"/>
+              </w:rPr>
+              <w:t xml:space="preserve">[UNVERIFIED multiplier]</w:t>
+            </w:r>
+          </w:p>
+        </w:tc>
+      </w:tr>
+      <w:tr>
+        <w:tc>
+          <w:tcPr>
+            <w:tcW w:w="2520" w:type="dxa"/>
+          </w:tcPr>
+          <w:p>
+            <w:pPr>
+              <w:spacing w:before="40" w:after="40"/>
+            </w:pPr>
+            <w:r>
+              <w:rPr>
+                <w:b/>
+                <w:sz w:val="18"/>
+              </w:rPr>
+              <w:t xml:space="preserve">C — Institutional</w:t>
+            </w:r>
+          </w:p>
+        </w:tc>
+        <w:tc>
+          <w:tcPr>
+            <w:tcW w:w="2520" w:type="dxa"/>
+          </w:tcPr>
+          <w:p>
+            <w:pPr>
+              <w:spacing w:before="40" w:after="40"/>
+            </w:pPr>
+            <w:r>
+              <w:rPr>
+                <w:sz w:val="18"/>
+              </w:rPr>
+              <w:t xml:space="preserve">US programs teaching sport management</w:t>
+            </w:r>
+          </w:p>
+        </w:tc>
+        <w:tc>
+          <w:tcPr>
+            <w:tcW w:w="2520" w:type="dxa"/>
+          </w:tcPr>
+          <w:p>
+            <w:pPr>
+              <w:spacing w:before="40" w:after="40"/>
+            </w:pPr>
+            <w:r>
+              <w:rPr>
+                <w:b/>
+                <w:sz w:val="18"/>
+              </w:rPr>
+              <w:t xml:space="preserve">441</w:t>
+            </w:r>
+          </w:p>
+        </w:tc>
+        <w:tc>
+          <w:tcPr>
+            <w:tcW w:w="2520" w:type="dxa"/>
+          </w:tcPr>
+          <w:p>
+            <w:pPr>
+              <w:spacing w:before="40" w:after="40"/>
+            </w:pPr>
+            <w:hyperlink r:id="rHl2">
+              <w:r>
+                <w:rPr>
+                  <w:rStyle w:val="Hyperlink"/>
+                  <w:sz w:val="18"/>
+                </w:rPr>
+                <w:t xml:space="preserve">The Sport Journal</w:t>
+              </w:r>
+            </w:hyperlink>
+          </w:p>
+        </w:tc>
+      </w:tr>
+    </w:tbl>
+    <w:p>
+      <w:pPr>
+        <w:spacing w:after="0"/>
+      </w:pPr>
+    </w:p>
+    <w:p>
+      <w:pPr>
+        <w:pStyle w:val="Heading2"/>
+      </w:pPr>
+      <w:r>
+        <w:t xml:space="preserve">Path A funnel — the students</w:t>
+      </w:r>
+    </w:p>
+    <w:tbl>
+      <w:tblPr>
+        <w:tblW w:w="10080" w:type="dxa"/>
+        <w:tblBorders>
+          <w:top w:val="single" w:sz="4" w:space="0" w:color="C9CCD1"/>
+          <w:left w:val="single" w:sz="4" w:space="0" w:color="C9CCD1"/>
+          <w:bottom w:val="single" w:sz="4" w:space="0" w:color="C9CCD1"/>
+          <w:right w:val="single" w:sz="4" w:space="0" w:color="C9CCD1"/>
+          <w:insideH w:val="single" w:sz="4" w:space="0" w:color="C9CCD1"/>
+          <w:insideV w:val="single" w:sz="4" w:space="0" w:color="C9CCD1"/>
+        </w:tblBorders>
+        <w:tblLayout w:type="fixed"/>
+      </w:tblPr>
+      <w:tblGrid>
+        <w:gridCol w:w="2016"/>
+        <w:gridCol w:w="2016"/>
+        <w:gridCol w:w="2016"/>
+        <w:gridCol w:w="2016"/>
+        <w:gridCol w:w="2016"/>
+      </w:tblGrid>
+      <w:tr>
+        <w:trPr>
+          <w:tblHeader/>
+        </w:trPr>
+        <w:tc>
+          <w:tcPr>
+            <w:tcW w:w="2016" w:type="dxa"/>
+            <w:shd w:val="clear" w:color="auto" w:fill="EFF1F3"/>
+          </w:tcPr>
+          <w:p>
+            <w:pPr>
+              <w:spacing w:before="40" w:after="40"/>
+            </w:pPr>
+            <w:r>
+              <w:rPr>
+                <w:b/>
+                <w:sz w:val="18"/>
+              </w:rPr>
+              <w:t xml:space="preserve">Step</w:t>
+            </w:r>
+          </w:p>
+        </w:tc>
+        <w:tc>
+          <w:tcPr>
+            <w:tcW w:w="2016" w:type="dxa"/>
+            <w:shd w:val="clear" w:color="auto" w:fill="EFF1F3"/>
+          </w:tcPr>
+          <w:p>
+            <w:pPr>
+              <w:spacing w:before="40" w:after="40"/>
+            </w:pPr>
+            <w:r>
+              <w:rPr>
+                <w:b/>
+                <w:sz w:val="18"/>
+              </w:rPr>
+              <w:t xml:space="preserve">Filter</w:t>
+            </w:r>
+          </w:p>
+        </w:tc>
+        <w:tc>
+          <w:tcPr>
+            <w:tcW w:w="2016" w:type="dxa"/>
+            <w:shd w:val="clear" w:color="auto" w:fill="EFF1F3"/>
+          </w:tcPr>
+          <w:p>
+            <w:pPr>
+              <w:spacing w:before="40" w:after="40"/>
+            </w:pPr>
+            <w:r>
+              <w:rPr>
+                <w:b/>
+                <w:sz w:val="18"/>
+              </w:rPr>
+              <w:t xml:space="preserve">Multiplier</w:t>
+            </w:r>
+          </w:p>
+        </w:tc>
+        <w:tc>
+          <w:tcPr>
+            <w:tcW w:w="2016" w:type="dxa"/>
+            <w:shd w:val="clear" w:color="auto" w:fill="EFF1F3"/>
+          </w:tcPr>
+          <w:p>
+            <w:pPr>
+              <w:spacing w:before="40" w:after="40"/>
+            </w:pPr>
+            <w:r>
+              <w:rPr>
+                <w:b/>
+                <w:sz w:val="18"/>
+              </w:rPr>
+              <w:t xml:space="preserve">Remaining</w:t>
+            </w:r>
+          </w:p>
+        </w:tc>
+        <w:tc>
+          <w:tcPr>
+            <w:tcW w:w="2016" w:type="dxa"/>
+            <w:shd w:val="clear" w:color="auto" w:fill="EFF1F3"/>
+          </w:tcPr>
+          <w:p>
+            <w:pPr>
+              <w:spacing w:before="40" w:after="40"/>
+            </w:pPr>
+            <w:r>
+              <w:rPr>
+                <w:b/>
+                <w:sz w:val="18"/>
+              </w:rPr>
+              <w:t xml:space="preserve">Source</w:t>
+            </w:r>
+          </w:p>
+        </w:tc>
+      </w:tr>
+      <w:tr>
+        <w:tc>
+          <w:tcPr>
+            <w:tcW w:w="2016" w:type="dxa"/>
+          </w:tcPr>
+          <w:p>
+            <w:pPr>
+              <w:spacing w:before="40" w:after="40"/>
+            </w:pPr>
+            <w:r>
+              <w:rPr>
+                <w:sz w:val="18"/>
+              </w:rPr>
+              <w:t xml:space="preserve">1</w:t>
+            </w:r>
+          </w:p>
+        </w:tc>
+        <w:tc>
+          <w:tcPr>
+            <w:tcW w:w="2016" w:type="dxa"/>
+          </w:tcPr>
+          <w:p>
+            <w:pPr>
+              <w:spacing w:before="40" w:after="40"/>
+            </w:pPr>
+            <w:r>
+              <w:rPr>
+                <w:sz w:val="18"/>
+              </w:rPr>
+              <w:t xml:space="preserve">Sports management degrees awarded per year</w:t>
+            </w:r>
+          </w:p>
+        </w:tc>
+        <w:tc>
+          <w:tcPr>
+            <w:tcW w:w="2016" w:type="dxa"/>
+          </w:tcPr>
+          <w:p>
+            <w:pPr>
+              <w:spacing w:before="40" w:after="40"/>
+            </w:pPr>
+            <w:r>
+              <w:rPr>
+                <w:sz w:val="18"/>
+              </w:rPr>
+              <w:t xml:space="preserve">—</w:t>
+            </w:r>
+          </w:p>
+        </w:tc>
+        <w:tc>
+          <w:tcPr>
+            <w:tcW w:w="2016" w:type="dxa"/>
+          </w:tcPr>
+          <w:p>
+            <w:pPr>
+              <w:spacing w:before="40" w:after="40"/>
+            </w:pPr>
+            <w:r>
+              <w:rPr>
+                <w:b/>
+                <w:sz w:val="18"/>
+              </w:rPr>
+              <w:t xml:space="preserve">16,971</w:t>
+            </w:r>
+          </w:p>
+        </w:tc>
+        <w:tc>
+          <w:tcPr>
+            <w:tcW w:w="2016" w:type="dxa"/>
+          </w:tcPr>
+          <w:p>
+            <w:pPr>
+              <w:spacing w:before="40" w:after="40"/>
+            </w:pPr>
+            <w:hyperlink r:id="rHl1">
+              <w:r>
+                <w:rPr>
+                  <w:rStyle w:val="Hyperlink"/>
+                  <w:sz w:val="18"/>
+                </w:rPr>
+                <w:t xml:space="preserve">College Factual</w:t>
+              </w:r>
+            </w:hyperlink>
+            <w:r>
+              <w:rPr>
+                <w:sz w:val="18"/>
+              </w:rPr>
+              <w:t xml:space="preserve"> </w:t>
+            </w:r>
+            <w:r>
+              <w:rPr>
+                <w:rFonts w:ascii="Consolas" w:hAnsi="Consolas"/>
+                <w:sz w:val="18"/>
+              </w:rPr>
+              <w:t xml:space="preserve">[2020–21 data]</w:t>
+            </w:r>
+          </w:p>
+        </w:tc>
+      </w:tr>
+      <w:tr>
+        <w:tc>
+          <w:tcPr>
+            <w:tcW w:w="2016" w:type="dxa"/>
+          </w:tcPr>
+          <w:p>
+            <w:pPr>
+              <w:spacing w:before="40" w:after="40"/>
+            </w:pPr>
+            <w:r>
+              <w:rPr>
+                <w:sz w:val="18"/>
+              </w:rPr>
+              <w:t xml:space="preserve">2</w:t>
+            </w:r>
+          </w:p>
+        </w:tc>
+        <w:tc>
+          <w:tcPr>
+            <w:tcW w:w="2016" w:type="dxa"/>
+          </w:tcPr>
+          <w:p>
+            <w:pPr>
+              <w:spacing w:before="40" w:after="40"/>
+            </w:pPr>
+            <w:r>
+              <w:rPr>
+                <w:sz w:val="18"/>
+              </w:rPr>
+              <w:t xml:space="preserve">Students enrolled at any one time (4-year pipeline)</w:t>
+            </w:r>
+          </w:p>
+        </w:tc>
+        <w:tc>
+          <w:tcPr>
+            <w:tcW w:w="2016" w:type="dxa"/>
+          </w:tcPr>
+          <w:p>
+            <w:pPr>
+              <w:spacing w:before="40" w:after="40"/>
+            </w:pPr>
+            <w:r>
+              <w:rPr>
+                <w:sz w:val="18"/>
+              </w:rPr>
+              <w:t xml:space="preserve">×4</w:t>
+            </w:r>
+          </w:p>
+        </w:tc>
+        <w:tc>
+          <w:tcPr>
+            <w:tcW w:w="2016" w:type="dxa"/>
+          </w:tcPr>
+          <w:p>
+            <w:pPr>
+              <w:spacing w:before="40" w:after="40"/>
+            </w:pPr>
+            <w:r>
+              <w:rPr>
+                <w:b/>
+                <w:sz w:val="18"/>
+              </w:rPr>
+              <w:t xml:space="preserve">67,884</w:t>
+            </w:r>
+          </w:p>
+        </w:tc>
+        <w:tc>
+          <w:tcPr>
+            <w:tcW w:w="2016" w:type="dxa"/>
+          </w:tcPr>
+          <w:p>
+            <w:pPr>
+              <w:spacing w:before="40" w:after="40"/>
+            </w:pPr>
+            <w:r>
+              <w:rPr>
+                <w:rFonts w:ascii="Consolas" w:hAnsi="Consolas"/>
+                <w:sz w:val="18"/>
+              </w:rPr>
+              <w:t xml:space="preserve">[UNVERIFIED — my multiplication; no enrollment figure is published]</w:t>
+            </w:r>
+          </w:p>
+        </w:tc>
+      </w:tr>
+      <w:tr>
+        <w:tc>
+          <w:tcPr>
+            <w:tcW w:w="2016" w:type="dxa"/>
+          </w:tcPr>
+          <w:p>
+            <w:pPr>
+              <w:spacing w:before="40" w:after="40"/>
+            </w:pPr>
+            <w:r>
+              <w:rPr>
+                <w:sz w:val="18"/>
+              </w:rPr>
+              <w:t xml:space="preserve">3</w:t>
+            </w:r>
+          </w:p>
+        </w:tc>
+        <w:tc>
+          <w:tcPr>
+            <w:tcW w:w="2016" w:type="dxa"/>
+          </w:tcPr>
+          <w:p>
+            <w:pPr>
+              <w:spacing w:before="40" w:after="40"/>
+            </w:pPr>
+            <w:r>
+              <w:rPr>
+                <w:sz w:val="18"/>
+              </w:rPr>
+              <w:t xml:space="preserve">Aiming at deal-side roles (front office, agency, cap, contracts) rather than marketing, events, facilities or coaching</w:t>
+            </w:r>
+          </w:p>
+        </w:tc>
+        <w:tc>
+          <w:tcPr>
+            <w:tcW w:w="2016" w:type="dxa"/>
+          </w:tcPr>
+          <w:p>
+            <w:pPr>
+              <w:spacing w:before="40" w:after="40"/>
+            </w:pPr>
+            <w:r>
+              <w:rPr>
+                <w:sz w:val="18"/>
+              </w:rPr>
+              <w:t xml:space="preserve">×30%</w:t>
+            </w:r>
+          </w:p>
+        </w:tc>
+        <w:tc>
+          <w:tcPr>
+            <w:tcW w:w="2016" w:type="dxa"/>
+          </w:tcPr>
+          <w:p>
+            <w:pPr>
+              <w:spacing w:before="40" w:after="40"/>
+            </w:pPr>
+            <w:r>
+              <w:rPr>
+                <w:b/>
+                <w:sz w:val="18"/>
+              </w:rPr>
+              <w:t xml:space="preserve">20,365</w:t>
+            </w:r>
+          </w:p>
+        </w:tc>
+        <w:tc>
+          <w:tcPr>
+            <w:tcW w:w="2016" w:type="dxa"/>
+          </w:tcPr>
+          <w:p>
+            <w:pPr>
+              <w:spacing w:before="40" w:after="40"/>
+            </w:pPr>
+            <w:r>
+              <w:rPr>
+                <w:rFonts w:ascii="Consolas" w:hAnsi="Consolas"/>
+                <w:sz w:val="18"/>
+              </w:rPr>
+              <w:t xml:space="preserve">[UNVERIFIED — see A3]</w:t>
+            </w:r>
+          </w:p>
+        </w:tc>
+      </w:tr>
+    </w:tbl>
+    <w:p>
+      <w:pPr>
+        <w:spacing w:after="0"/>
+      </w:pPr>
+    </w:p>
+    <w:p>
+      <w:pPr>
+        <w:pStyle w:val="Heading2"/>
+      </w:pPr>
+      <w:r>
+        <w:t xml:space="preserve">Path B funnel — the enthusiasts</w:t>
+      </w:r>
+    </w:p>
+    <w:tbl>
+      <w:tblPr>
+        <w:tblW w:w="10080" w:type="dxa"/>
+        <w:tblBorders>
+          <w:top w:val="single" w:sz="4" w:space="0" w:color="C9CCD1"/>
+          <w:left w:val="single" w:sz="4" w:space="0" w:color="C9CCD1"/>
+          <w:bottom w:val="single" w:sz="4" w:space="0" w:color="C9CCD1"/>
+          <w:right w:val="single" w:sz="4" w:space="0" w:color="C9CCD1"/>
+          <w:insideH w:val="single" w:sz="4" w:space="0" w:color="C9CCD1"/>
+          <w:insideV w:val="single" w:sz="4" w:space="0" w:color="C9CCD1"/>
+        </w:tblBorders>
+        <w:tblLayout w:type="fixed"/>
+      </w:tblPr>
+      <w:tblGrid>
+        <w:gridCol w:w="2520"/>
+        <w:gridCol w:w="2520"/>
+        <w:gridCol w:w="2520"/>
+        <w:gridCol w:w="2520"/>
+      </w:tblGrid>
+      <w:tr>
+        <w:trPr>
+          <w:tblHeader/>
+        </w:trPr>
+        <w:tc>
+          <w:tcPr>
+            <w:tcW w:w="2520" w:type="dxa"/>
+            <w:shd w:val="clear" w:color="auto" w:fill="EFF1F3"/>
+          </w:tcPr>
+          <w:p>
+            <w:pPr>
+              <w:spacing w:before="40" w:after="40"/>
+            </w:pPr>
+            <w:r>
+              <w:rPr>
+                <w:b/>
+                <w:sz w:val="18"/>
+              </w:rPr>
+              <w:t xml:space="preserve">Step</w:t>
+            </w:r>
+          </w:p>
+        </w:tc>
+        <w:tc>
+          <w:tcPr>
+            <w:tcW w:w="2520" w:type="dxa"/>
+            <w:shd w:val="clear" w:color="auto" w:fill="EFF1F3"/>
+          </w:tcPr>
+          <w:p>
+            <w:pPr>
+              <w:spacing w:before="40" w:after="40"/>
+            </w:pPr>
+            <w:r>
+              <w:rPr>
+                <w:b/>
+                <w:sz w:val="18"/>
+              </w:rPr>
+              <w:t xml:space="preserve">Filter</w:t>
+            </w:r>
+          </w:p>
+        </w:tc>
+        <w:tc>
+          <w:tcPr>
+            <w:tcW w:w="2520" w:type="dxa"/>
+            <w:shd w:val="clear" w:color="auto" w:fill="EFF1F3"/>
+          </w:tcPr>
+          <w:p>
+            <w:pPr>
+              <w:spacing w:before="40" w:after="40"/>
+            </w:pPr>
+            <w:r>
+              <w:rPr>
+                <w:b/>
+                <w:sz w:val="18"/>
+              </w:rPr>
+              <w:t xml:space="preserve">Value</w:t>
+            </w:r>
+          </w:p>
+        </w:tc>
+        <w:tc>
+          <w:tcPr>
+            <w:tcW w:w="2520" w:type="dxa"/>
+            <w:shd w:val="clear" w:color="auto" w:fill="EFF1F3"/>
+          </w:tcPr>
+          <w:p>
+            <w:pPr>
+              <w:spacing w:before="40" w:after="40"/>
+            </w:pPr>
+            <w:r>
+              <w:rPr>
+                <w:b/>
+                <w:sz w:val="18"/>
+              </w:rPr>
+              <w:t xml:space="preserve">Source</w:t>
+            </w:r>
+          </w:p>
+        </w:tc>
+      </w:tr>
+      <w:tr>
+        <w:tc>
+          <w:tcPr>
+            <w:tcW w:w="2520" w:type="dxa"/>
+          </w:tcPr>
+          <w:p>
+            <w:pPr>
+              <w:spacing w:before="40" w:after="40"/>
+            </w:pPr>
+            <w:r>
+              <w:rPr>
+                <w:sz w:val="18"/>
+              </w:rPr>
+              <w:t xml:space="preserve">1</w:t>
+            </w:r>
+          </w:p>
+        </w:tc>
+        <w:tc>
+          <w:tcPr>
+            <w:tcW w:w="2520" w:type="dxa"/>
+          </w:tcPr>
+          <w:p>
+            <w:pPr>
+              <w:spacing w:before="40" w:after="40"/>
+            </w:pPr>
+            <w:r>
+              <w:rPr>
+                <w:sz w:val="18"/>
+              </w:rPr>
+              <w:t xml:space="preserve">Steam reviews across the four deep management sims (FM26 9,273 + OOTP 26 645 + FOF9 161 + FHM12 109)</w:t>
+            </w:r>
+          </w:p>
+        </w:tc>
+        <w:tc>
+          <w:tcPr>
+            <w:tcW w:w="2520" w:type="dxa"/>
+          </w:tcPr>
+          <w:p>
+            <w:pPr>
+              <w:spacing w:before="40" w:after="40"/>
+            </w:pPr>
+            <w:r>
+              <w:rPr>
+                <w:b/>
+                <w:sz w:val="18"/>
+              </w:rPr>
+              <w:t xml:space="preserve">10,188</w:t>
+            </w:r>
+          </w:p>
+        </w:tc>
+        <w:tc>
+          <w:tcPr>
+            <w:tcW w:w="2520" w:type="dxa"/>
+          </w:tcPr>
+          <w:p>
+            <w:pPr>
+              <w:spacing w:before="40" w:after="40"/>
+            </w:pPr>
+            <w:hyperlink r:id="rHl37">
+              <w:r>
+                <w:rPr>
+                  <w:rStyle w:val="Hyperlink"/>
+                  <w:sz w:val="18"/>
+                </w:rPr>
+                <w:t xml:space="preserve">Steam review API</w:t>
+              </w:r>
+            </w:hyperlink>
+          </w:p>
+        </w:tc>
+      </w:tr>
+      <w:tr>
+        <w:tc>
+          <w:tcPr>
+            <w:tcW w:w="2520" w:type="dxa"/>
+          </w:tcPr>
+          <w:p>
+            <w:pPr>
+              <w:spacing w:before="40" w:after="40"/>
+            </w:pPr>
+            <w:r>
+              <w:rPr>
+                <w:sz w:val="18"/>
+              </w:rPr>
+              <w:t xml:space="preserve">2</w:t>
+            </w:r>
+          </w:p>
+        </w:tc>
+        <w:tc>
+          <w:tcPr>
+            <w:tcW w:w="2520" w:type="dxa"/>
+          </w:tcPr>
+          <w:p>
+            <w:pPr>
+              <w:spacing w:before="40" w:after="40"/>
+            </w:pPr>
+            <w:r>
+              <w:rPr>
+                <w:sz w:val="18"/>
+              </w:rPr>
+              <w:t xml:space="preserve">Owners per review (industry rule of thumb, ~30×)</w:t>
+            </w:r>
+          </w:p>
+        </w:tc>
+        <w:tc>
+          <w:tcPr>
+            <w:tcW w:w="2520" w:type="dxa"/>
+          </w:tcPr>
+          <w:p>
+            <w:pPr>
+              <w:spacing w:before="40" w:after="40"/>
+            </w:pPr>
+            <w:r>
+              <w:rPr>
+                <w:sz w:val="18"/>
+              </w:rPr>
+              <w:t xml:space="preserve">×30</w:t>
+            </w:r>
+          </w:p>
+        </w:tc>
+        <w:tc>
+          <w:tcPr>
+            <w:tcW w:w="2520" w:type="dxa"/>
+          </w:tcPr>
+          <w:p>
+            <w:pPr>
+              <w:spacing w:before="40" w:after="40"/>
+            </w:pPr>
+            <w:r>
+              <w:rPr>
+                <w:rFonts w:ascii="Consolas" w:hAnsi="Consolas"/>
+                <w:sz w:val="18"/>
+              </w:rPr>
+              <w:t xml:space="preserve">[UNVERIFIED — a widely used heuristic, not a measurement]</w:t>
+            </w:r>
+          </w:p>
+        </w:tc>
+      </w:tr>
+      <w:tr>
+        <w:tc>
+          <w:tcPr>
+            <w:tcW w:w="2520" w:type="dxa"/>
+          </w:tcPr>
+          <w:p>
+            <w:pPr>
+              <w:spacing w:before="40" w:after="40"/>
+            </w:pPr>
+            <w:r>
+              <w:rPr>
+                <w:sz w:val="18"/>
+              </w:rPr>
+              <w:t xml:space="preserve">3</w:t>
+            </w:r>
+          </w:p>
+        </w:tc>
+        <w:tc>
+          <w:tcPr>
+            <w:tcW w:w="2520" w:type="dxa"/>
+          </w:tcPr>
+          <w:p>
+            <w:pPr>
+              <w:spacing w:before="40" w:after="40"/>
+            </w:pPr>
+            <w:r>
+              <w:rPr>
+                <w:sz w:val="18"/>
+              </w:rPr>
+              <w:t xml:space="preserve">Implied PC owners of deep management sims</w:t>
+            </w:r>
+          </w:p>
+        </w:tc>
+        <w:tc>
+          <w:tcPr>
+            <w:tcW w:w="2520" w:type="dxa"/>
+          </w:tcPr>
+          <w:p>
+            <w:pPr>
+              <w:spacing w:before="40" w:after="40"/>
+            </w:pPr>
+            <w:r>
+              <w:rPr>
+                <w:b/>
+                <w:sz w:val="18"/>
+              </w:rPr>
+              <w:t xml:space="preserve">~305,000</w:t>
+            </w:r>
+          </w:p>
+        </w:tc>
+        <w:tc>
+          <w:tcPr>
+            <w:tcW w:w="2520" w:type="dxa"/>
+          </w:tcPr>
+          <w:p>
+            <w:pPr>
+              <w:spacing w:before="40" w:after="40"/>
+            </w:pPr>
+            <w:r>
+              <w:rPr>
+                <w:sz w:val="18"/>
+              </w:rPr>
+              <w:t xml:space="preserve">Derived</w:t>
+            </w:r>
+          </w:p>
+        </w:tc>
+      </w:tr>
+    </w:tbl>
+    <w:p>
+      <w:pPr>
+        <w:spacing w:after="0"/>
+      </w:pPr>
+    </w:p>
+    <w:p>
+      <w:r>
+        <w:rPr>
+          <w:b/>
+        </w:rPr>
+        <w:t xml:space="preserve">Note what this excludes:</w:t>
+      </w:r>
+      <w:r>
+        <w:t xml:space="preserve"> Madden and NBA 2K's console audiences, which are far larger but whose players buy the games for on-field play. Their PC review counts (5,078 and 13,752) are not added, because a 2K player is not evidence of demand for contract negotiation.</w:t>
+      </w:r>
+    </w:p>
+    <w:p>
+      <w:pPr>
+        <w:pBdr>
+          <w:bottom w:val="single" w:sz="6" w:space="6" w:color="C9CCD1"/>
+        </w:pBdr>
+      </w:pPr>
+    </w:p>
+    <w:p>
+      <w:pPr>
+        <w:pStyle w:val="Heading1"/>
+      </w:pPr>
+      <w:r>
+        <w:t xml:space="preserve">Three cases</w:t>
+      </w:r>
+    </w:p>
+    <w:p>
+      <w:r>
+        <w:t xml:space="preserve">Adoption varies; price is held at $100/year throughout.</w:t>
+      </w:r>
+    </w:p>
+    <w:tbl>
+      <w:tblPr>
+        <w:tblW w:w="10080" w:type="dxa"/>
+        <w:tblBorders>
+          <w:top w:val="single" w:sz="4" w:space="0" w:color="C9CCD1"/>
+          <w:left w:val="single" w:sz="4" w:space="0" w:color="C9CCD1"/>
+          <w:bottom w:val="single" w:sz="4" w:space="0" w:color="C9CCD1"/>
+          <w:right w:val="single" w:sz="4" w:space="0" w:color="C9CCD1"/>
+          <w:insideH w:val="single" w:sz="4" w:space="0" w:color="C9CCD1"/>
+          <w:insideV w:val="single" w:sz="4" w:space="0" w:color="C9CCD1"/>
+        </w:tblBorders>
+        <w:tblLayout w:type="fixed"/>
+      </w:tblPr>
+      <w:tblGrid>
+        <w:gridCol w:w="2520"/>
+        <w:gridCol w:w="2520"/>
+        <w:gridCol w:w="2520"/>
+        <w:gridCol w:w="2520"/>
+      </w:tblGrid>
+      <w:tr>
+        <w:trPr>
+          <w:tblHeader/>
+        </w:trPr>
+        <w:tc>
+          <w:tcPr>
+            <w:tcW w:w="2520" w:type="dxa"/>
+            <w:shd w:val="clear" w:color="auto" w:fill="EFF1F3"/>
+          </w:tcPr>
+          <w:p>
+            <w:pPr>
+              <w:spacing w:before="40" w:after="40"/>
+            </w:pPr>
+          </w:p>
+        </w:tc>
+        <w:tc>
+          <w:tcPr>
+            <w:tcW w:w="2520" w:type="dxa"/>
+            <w:shd w:val="clear" w:color="auto" w:fill="EFF1F3"/>
+          </w:tcPr>
+          <w:p>
+            <w:pPr>
+              <w:spacing w:before="40" w:after="40"/>
+            </w:pPr>
+            <w:r>
+              <w:rPr>
+                <w:b/>
+                <w:sz w:val="18"/>
+              </w:rPr>
+              <w:t xml:space="preserve">Conservative</w:t>
+            </w:r>
+          </w:p>
+        </w:tc>
+        <w:tc>
+          <w:tcPr>
+            <w:tcW w:w="2520" w:type="dxa"/>
+            <w:shd w:val="clear" w:color="auto" w:fill="EFF1F3"/>
+          </w:tcPr>
+          <w:p>
+            <w:pPr>
+              <w:spacing w:before="40" w:after="40"/>
+            </w:pPr>
+            <w:r>
+              <w:rPr>
+                <w:b/>
+                <w:sz w:val="18"/>
+              </w:rPr>
+              <w:t xml:space="preserve">Base</w:t>
+            </w:r>
+          </w:p>
+        </w:tc>
+        <w:tc>
+          <w:tcPr>
+            <w:tcW w:w="2520" w:type="dxa"/>
+            <w:shd w:val="clear" w:color="auto" w:fill="EFF1F3"/>
+          </w:tcPr>
+          <w:p>
+            <w:pPr>
+              <w:spacing w:before="40" w:after="40"/>
+            </w:pPr>
+            <w:r>
+              <w:rPr>
+                <w:b/>
+                <w:sz w:val="18"/>
+              </w:rPr>
+              <w:t xml:space="preserve">Optimistic</w:t>
+            </w:r>
+          </w:p>
+        </w:tc>
+      </w:tr>
+      <w:tr>
+        <w:tc>
+          <w:tcPr>
+            <w:tcW w:w="2520" w:type="dxa"/>
+          </w:tcPr>
+          <w:p>
+            <w:pPr>
+              <w:spacing w:before="40" w:after="40"/>
+            </w:pPr>
+            <w:r>
+              <w:rPr>
+                <w:b/>
+                <w:sz w:val="18"/>
+              </w:rPr>
+              <w:t xml:space="preserve">Path A — students</w:t>
+            </w:r>
+            <w:r>
+              <w:rPr>
+                <w:sz w:val="18"/>
+              </w:rPr>
+              <w:t xml:space="preserve"> (SAM 20,365)</w:t>
+            </w:r>
+          </w:p>
+        </w:tc>
+        <w:tc>
+          <w:tcPr>
+            <w:tcW w:w="2520" w:type="dxa"/>
+          </w:tcPr>
+          <w:p>
+            <w:pPr>
+              <w:spacing w:before="40" w:after="40"/>
+            </w:pPr>
+            <w:r>
+              <w:rPr>
+                <w:sz w:val="18"/>
+              </w:rPr>
+              <w:t xml:space="preserve">2% = 407</w:t>
+            </w:r>
+          </w:p>
+        </w:tc>
+        <w:tc>
+          <w:tcPr>
+            <w:tcW w:w="2520" w:type="dxa"/>
+          </w:tcPr>
+          <w:p>
+            <w:pPr>
+              <w:spacing w:before="40" w:after="40"/>
+            </w:pPr>
+            <w:r>
+              <w:rPr>
+                <w:b/>
+                <w:sz w:val="18"/>
+              </w:rPr>
+              <w:t xml:space="preserve">5% = 1,018</w:t>
+            </w:r>
+          </w:p>
+        </w:tc>
+        <w:tc>
+          <w:tcPr>
+            <w:tcW w:w="2520" w:type="dxa"/>
+          </w:tcPr>
+          <w:p>
+            <w:pPr>
+              <w:spacing w:before="40" w:after="40"/>
+            </w:pPr>
+            <w:r>
+              <w:rPr>
+                <w:sz w:val="18"/>
+              </w:rPr>
+              <w:t xml:space="preserve">12% = 2,444</w:t>
+            </w:r>
+          </w:p>
+        </w:tc>
+      </w:tr>
+      <w:tr>
+        <w:tc>
+          <w:tcPr>
+            <w:tcW w:w="2520" w:type="dxa"/>
+          </w:tcPr>
+          <w:p>
+            <w:pPr>
+              <w:spacing w:before="40" w:after="40"/>
+            </w:pPr>
+            <w:r>
+              <w:rPr>
+                <w:b/>
+                <w:sz w:val="18"/>
+              </w:rPr>
+              <w:t xml:space="preserve">Path B — enthusiasts</w:t>
+            </w:r>
+            <w:r>
+              <w:rPr>
+                <w:sz w:val="18"/>
+              </w:rPr>
+              <w:t xml:space="preserve"> (SAM 305,000)</w:t>
+            </w:r>
+          </w:p>
+        </w:tc>
+        <w:tc>
+          <w:tcPr>
+            <w:tcW w:w="2520" w:type="dxa"/>
+          </w:tcPr>
+          <w:p>
+            <w:pPr>
+              <w:spacing w:before="40" w:after="40"/>
+            </w:pPr>
+            <w:r>
+              <w:rPr>
+                <w:sz w:val="18"/>
+              </w:rPr>
+              <w:t xml:space="preserve">0.5% = 1,525</w:t>
+            </w:r>
+          </w:p>
+        </w:tc>
+        <w:tc>
+          <w:tcPr>
+            <w:tcW w:w="2520" w:type="dxa"/>
+          </w:tcPr>
+          <w:p>
+            <w:pPr>
+              <w:spacing w:before="40" w:after="40"/>
+            </w:pPr>
+            <w:r>
+              <w:rPr>
+                <w:b/>
+                <w:sz w:val="18"/>
+              </w:rPr>
+              <w:t xml:space="preserve">1.5% = 4,575</w:t>
+            </w:r>
+          </w:p>
+        </w:tc>
+        <w:tc>
+          <w:tcPr>
+            <w:tcW w:w="2520" w:type="dxa"/>
+          </w:tcPr>
+          <w:p>
+            <w:pPr>
+              <w:spacing w:before="40" w:after="40"/>
+            </w:pPr>
+            <w:r>
+              <w:rPr>
+                <w:sz w:val="18"/>
+              </w:rPr>
+              <w:t xml:space="preserve">4% = 12,200</w:t>
+            </w:r>
+          </w:p>
+        </w:tc>
+      </w:tr>
+      <w:tr>
+        <w:tc>
+          <w:tcPr>
+            <w:tcW w:w="2520" w:type="dxa"/>
+          </w:tcPr>
+          <w:p>
+            <w:pPr>
+              <w:spacing w:before="40" w:after="40"/>
+            </w:pPr>
+            <w:r>
+              <w:rPr>
+                <w:b/>
+                <w:sz w:val="18"/>
+              </w:rPr>
+              <w:t xml:space="preserve">Path C — programs</w:t>
+            </w:r>
+            <w:r>
+              <w:rPr>
+                <w:sz w:val="18"/>
+              </w:rPr>
+              <w:t xml:space="preserve"> (SAM 441, at 40 seats × $100 = $4,000/program)</w:t>
+            </w:r>
+          </w:p>
+        </w:tc>
+        <w:tc>
+          <w:tcPr>
+            <w:tcW w:w="2520" w:type="dxa"/>
+          </w:tcPr>
+          <w:p>
+            <w:pPr>
+              <w:spacing w:before="40" w:after="40"/>
+            </w:pPr>
+            <w:r>
+              <w:rPr>
+                <w:sz w:val="18"/>
+              </w:rPr>
+              <w:t xml:space="preserve">2% = 9 programs</w:t>
+            </w:r>
+          </w:p>
+        </w:tc>
+        <w:tc>
+          <w:tcPr>
+            <w:tcW w:w="2520" w:type="dxa"/>
+          </w:tcPr>
+          <w:p>
+            <w:pPr>
+              <w:spacing w:before="40" w:after="40"/>
+            </w:pPr>
+            <w:r>
+              <w:rPr>
+                <w:b/>
+                <w:sz w:val="18"/>
+              </w:rPr>
+              <w:t xml:space="preserve">6% = 26 programs</w:t>
+            </w:r>
+          </w:p>
+        </w:tc>
+        <w:tc>
+          <w:tcPr>
+            <w:tcW w:w="2520" w:type="dxa"/>
+          </w:tcPr>
+          <w:p>
+            <w:pPr>
+              <w:spacing w:before="40" w:after="40"/>
+            </w:pPr>
+            <w:r>
+              <w:rPr>
+                <w:sz w:val="18"/>
+              </w:rPr>
+              <w:t xml:space="preserve">15% = 66 programs</w:t>
+            </w:r>
+          </w:p>
+        </w:tc>
+      </w:tr>
+      <w:tr>
+        <w:tc>
+          <w:tcPr>
+            <w:tcW w:w="2520" w:type="dxa"/>
+          </w:tcPr>
+          <w:p>
+            <w:pPr>
+              <w:spacing w:before="40" w:after="40"/>
+            </w:pPr>
+            <w:r>
+              <w:rPr>
+                <w:b/>
+                <w:sz w:val="18"/>
+              </w:rPr>
+              <w:t xml:space="preserve">Paying individuals</w:t>
+            </w:r>
+          </w:p>
+        </w:tc>
+        <w:tc>
+          <w:tcPr>
+            <w:tcW w:w="2520" w:type="dxa"/>
+          </w:tcPr>
+          <w:p>
+            <w:pPr>
+              <w:spacing w:before="40" w:after="40"/>
+            </w:pPr>
+            <w:r>
+              <w:rPr>
+                <w:b/>
+                <w:sz w:val="18"/>
+              </w:rPr>
+              <w:t xml:space="preserve">1,932</w:t>
+            </w:r>
+          </w:p>
+        </w:tc>
+        <w:tc>
+          <w:tcPr>
+            <w:tcW w:w="2520" w:type="dxa"/>
+          </w:tcPr>
+          <w:p>
+            <w:pPr>
+              <w:spacing w:before="40" w:after="40"/>
+            </w:pPr>
+            <w:r>
+              <w:rPr>
+                <w:b/>
+                <w:sz w:val="18"/>
+              </w:rPr>
+              <w:t xml:space="preserve">5,593</w:t>
+            </w:r>
+          </w:p>
+        </w:tc>
+        <w:tc>
+          <w:tcPr>
+            <w:tcW w:w="2520" w:type="dxa"/>
+          </w:tcPr>
+          <w:p>
+            <w:pPr>
+              <w:spacing w:before="40" w:after="40"/>
+            </w:pPr>
+            <w:r>
+              <w:rPr>
+                <w:b/>
+                <w:sz w:val="18"/>
+              </w:rPr>
+              <w:t xml:space="preserve">14,644</w:t>
+            </w:r>
+          </w:p>
+        </w:tc>
+      </w:tr>
+      <w:tr>
+        <w:tc>
+          <w:tcPr>
+            <w:tcW w:w="2520" w:type="dxa"/>
+          </w:tcPr>
+          <w:p>
+            <w:pPr>
+              <w:spacing w:before="40" w:after="40"/>
+            </w:pPr>
+            <w:r>
+              <w:rPr>
+                <w:b/>
+                <w:sz w:val="18"/>
+              </w:rPr>
+              <w:t xml:space="preserve">Revenue, Paths A + B</w:t>
+            </w:r>
+          </w:p>
+        </w:tc>
+        <w:tc>
+          <w:tcPr>
+            <w:tcW w:w="2520" w:type="dxa"/>
+          </w:tcPr>
+          <w:p>
+            <w:pPr>
+              <w:spacing w:before="40" w:after="40"/>
+            </w:pPr>
+            <w:r>
+              <w:rPr>
+                <w:sz w:val="18"/>
+              </w:rPr>
+              <w:t xml:space="preserve">$193,200</w:t>
+            </w:r>
+          </w:p>
+        </w:tc>
+        <w:tc>
+          <w:tcPr>
+            <w:tcW w:w="2520" w:type="dxa"/>
+          </w:tcPr>
+          <w:p>
+            <w:pPr>
+              <w:spacing w:before="40" w:after="40"/>
+            </w:pPr>
+            <w:r>
+              <w:rPr>
+                <w:b/>
+                <w:sz w:val="18"/>
+              </w:rPr>
+              <w:t xml:space="preserve">$559,300</w:t>
+            </w:r>
+          </w:p>
+        </w:tc>
+        <w:tc>
+          <w:tcPr>
+            <w:tcW w:w="2520" w:type="dxa"/>
+          </w:tcPr>
+          <w:p>
+            <w:pPr>
+              <w:spacing w:before="40" w:after="40"/>
+            </w:pPr>
+            <w:r>
+              <w:rPr>
+                <w:sz w:val="18"/>
+              </w:rPr>
+              <w:t xml:space="preserve">$1,464,400</w:t>
+            </w:r>
+          </w:p>
+        </w:tc>
+      </w:tr>
+      <w:tr>
+        <w:tc>
+          <w:tcPr>
+            <w:tcW w:w="2520" w:type="dxa"/>
+          </w:tcPr>
+          <w:p>
+            <w:pPr>
+              <w:spacing w:before="40" w:after="40"/>
+            </w:pPr>
+            <w:r>
+              <w:rPr>
+                <w:b/>
+                <w:sz w:val="18"/>
+              </w:rPr>
+              <w:t xml:space="preserve">Revenue, Path C</w:t>
+            </w:r>
+          </w:p>
+        </w:tc>
+        <w:tc>
+          <w:tcPr>
+            <w:tcW w:w="2520" w:type="dxa"/>
+          </w:tcPr>
+          <w:p>
+            <w:pPr>
+              <w:spacing w:before="40" w:after="40"/>
+            </w:pPr>
+            <w:r>
+              <w:rPr>
+                <w:sz w:val="18"/>
+              </w:rPr>
+              <w:t xml:space="preserve">$36,000</w:t>
+            </w:r>
+          </w:p>
+        </w:tc>
+        <w:tc>
+          <w:tcPr>
+            <w:tcW w:w="2520" w:type="dxa"/>
+          </w:tcPr>
+          <w:p>
+            <w:pPr>
+              <w:spacing w:before="40" w:after="40"/>
+            </w:pPr>
+            <w:r>
+              <w:rPr>
+                <w:b/>
+                <w:sz w:val="18"/>
+              </w:rPr>
+              <w:t xml:space="preserve">$104,000</w:t>
+            </w:r>
+          </w:p>
+        </w:tc>
+        <w:tc>
+          <w:tcPr>
+            <w:tcW w:w="2520" w:type="dxa"/>
+          </w:tcPr>
+          <w:p>
+            <w:pPr>
+              <w:spacing w:before="40" w:after="40"/>
+            </w:pPr>
+            <w:r>
+              <w:rPr>
+                <w:sz w:val="18"/>
+              </w:rPr>
+              <w:t xml:space="preserve">$264,000</w:t>
+            </w:r>
+          </w:p>
+        </w:tc>
+      </w:tr>
+      <w:tr>
+        <w:tc>
+          <w:tcPr>
+            <w:tcW w:w="2520" w:type="dxa"/>
+          </w:tcPr>
+          <w:p>
+            <w:pPr>
+              <w:spacing w:before="40" w:after="40"/>
+            </w:pPr>
+            <w:r>
+              <w:rPr>
+                <w:b/>
+                <w:sz w:val="18"/>
+              </w:rPr>
+              <w:t xml:space="preserve">Gross revenue</w:t>
+            </w:r>
+          </w:p>
+        </w:tc>
+        <w:tc>
+          <w:tcPr>
+            <w:tcW w:w="2520" w:type="dxa"/>
+          </w:tcPr>
+          <w:p>
+            <w:pPr>
+              <w:spacing w:before="40" w:after="40"/>
+            </w:pPr>
+            <w:r>
+              <w:rPr>
+                <w:b/>
+                <w:sz w:val="18"/>
+              </w:rPr>
+              <w:t xml:space="preserve">$229,200</w:t>
+            </w:r>
+          </w:p>
+        </w:tc>
+        <w:tc>
+          <w:tcPr>
+            <w:tcW w:w="2520" w:type="dxa"/>
+          </w:tcPr>
+          <w:p>
+            <w:pPr>
+              <w:spacing w:before="40" w:after="40"/>
+            </w:pPr>
+            <w:r>
+              <w:rPr>
+                <w:b/>
+                <w:sz w:val="18"/>
+              </w:rPr>
+              <w:t xml:space="preserve">$663,300</w:t>
+            </w:r>
+          </w:p>
+        </w:tc>
+        <w:tc>
+          <w:tcPr>
+            <w:tcW w:w="2520" w:type="dxa"/>
+          </w:tcPr>
+          <w:p>
+            <w:pPr>
+              <w:spacing w:before="40" w:after="40"/>
+            </w:pPr>
+            <w:r>
+              <w:rPr>
+                <w:b/>
+                <w:sz w:val="18"/>
+              </w:rPr>
+              <w:t xml:space="preserve">$1.73M</w:t>
+            </w:r>
+          </w:p>
+        </w:tc>
+      </w:tr>
+      <w:tr>
+        <w:tc>
+          <w:tcPr>
+            <w:tcW w:w="2520" w:type="dxa"/>
+          </w:tcPr>
+          <w:p>
+            <w:pPr>
+              <w:spacing w:before="40" w:after="40"/>
+            </w:pPr>
+            <w:r>
+              <w:rPr>
+                <w:sz w:val="18"/>
+              </w:rPr>
+              <w:t xml:space="preserve">Less payment processing (~3%)</w:t>
+            </w:r>
+          </w:p>
+        </w:tc>
+        <w:tc>
+          <w:tcPr>
+            <w:tcW w:w="2520" w:type="dxa"/>
+          </w:tcPr>
+          <w:p>
+            <w:pPr>
+              <w:spacing w:before="40" w:after="40"/>
+            </w:pPr>
+            <w:r>
+              <w:rPr>
+                <w:sz w:val="18"/>
+              </w:rPr>
+              <w:t xml:space="preserve">−$6,876</w:t>
+            </w:r>
+          </w:p>
+        </w:tc>
+        <w:tc>
+          <w:tcPr>
+            <w:tcW w:w="2520" w:type="dxa"/>
+          </w:tcPr>
+          <w:p>
+            <w:pPr>
+              <w:spacing w:before="40" w:after="40"/>
+            </w:pPr>
+            <w:r>
+              <w:rPr>
+                <w:sz w:val="18"/>
+              </w:rPr>
+              <w:t xml:space="preserve">−$19,899</w:t>
+            </w:r>
+          </w:p>
+        </w:tc>
+        <w:tc>
+          <w:tcPr>
+            <w:tcW w:w="2520" w:type="dxa"/>
+          </w:tcPr>
+          <w:p>
+            <w:pPr>
+              <w:spacing w:before="40" w:after="40"/>
+            </w:pPr>
+            <w:r>
+              <w:rPr>
+                <w:sz w:val="18"/>
+              </w:rPr>
+              <w:t xml:space="preserve">−$51,900</w:t>
+            </w:r>
+          </w:p>
+        </w:tc>
+      </w:tr>
+      <w:tr>
+        <w:tc>
+          <w:tcPr>
+            <w:tcW w:w="2520" w:type="dxa"/>
+          </w:tcPr>
+          <w:p>
+            <w:pPr>
+              <w:spacing w:before="40" w:after="40"/>
+            </w:pPr>
+            <w:r>
+              <w:rPr>
+                <w:b/>
+                <w:sz w:val="18"/>
+              </w:rPr>
+              <w:t xml:space="preserve">Net revenue</w:t>
+            </w:r>
+          </w:p>
+        </w:tc>
+        <w:tc>
+          <w:tcPr>
+            <w:tcW w:w="2520" w:type="dxa"/>
+          </w:tcPr>
+          <w:p>
+            <w:pPr>
+              <w:spacing w:before="40" w:after="40"/>
+            </w:pPr>
+            <w:r>
+              <w:rPr>
+                <w:b/>
+                <w:sz w:val="18"/>
+              </w:rPr>
+              <w:t xml:space="preserve">$222,300</w:t>
+            </w:r>
+          </w:p>
+        </w:tc>
+        <w:tc>
+          <w:tcPr>
+            <w:tcW w:w="2520" w:type="dxa"/>
+          </w:tcPr>
+          <w:p>
+            <w:pPr>
+              <w:spacing w:before="40" w:after="40"/>
+            </w:pPr>
+            <w:r>
+              <w:rPr>
+                <w:b/>
+                <w:sz w:val="18"/>
+              </w:rPr>
+              <w:t xml:space="preserve">$643,400</w:t>
+            </w:r>
+          </w:p>
+        </w:tc>
+        <w:tc>
+          <w:tcPr>
+            <w:tcW w:w="2520" w:type="dxa"/>
+          </w:tcPr>
+          <w:p>
+            <w:pPr>
+              <w:spacing w:before="40" w:after="40"/>
+            </w:pPr>
+            <w:r>
+              <w:rPr>
+                <w:b/>
+                <w:sz w:val="18"/>
+              </w:rPr>
+              <w:t xml:space="preserve">$1.68M</w:t>
+            </w:r>
+          </w:p>
+        </w:tc>
+      </w:tr>
+    </w:tbl>
+    <w:p>
+      <w:pPr>
+        <w:spacing w:after="0"/>
+      </w:pPr>
+    </w:p>
+    <w:p>
+      <w:pPr>
+        <w:pStyle w:val="Heading2"/>
+      </w:pPr>
+      <w:r>
+        <w:t xml:space="preserve">The honest headline</w:t>
+      </w:r>
+    </w:p>
+    <w:p>
+      <w:r>
+        <w:rPr>
+          <w:b/>
+        </w:rPr>
+        <w:t xml:space="preserve">At $100/year, the base case is a ~$660,000/year business.</w:t>
+      </w:r>
+      <w:r>
+        <w:t xml:space="preserve"> That is a real small business and not a venture outcome. </w:t>
+      </w:r>
+      <w:r>
+        <w:rPr>
+          <w:b/>
+        </w:rPr>
+        <w:t xml:space="preserve">The constraint is not adoption — it is that the countable population is small.</w:t>
+      </w:r>
+      <w:r>
+        <w:t xml:space="preserve"> Even capturing </w:t>
+      </w:r>
+      <w:r>
+        <w:rPr>
+          <w:b/>
+        </w:rPr>
+        <w:t xml:space="preserve">4% of every deep-sim PC owner in America plus 12% of every deal-focused sport management student</w:t>
+      </w:r>
+      <w:r>
+        <w:t xml:space="preserve"> produces $1.7M.</w:t>
+      </w:r>
+    </w:p>
+    <w:p>
+      <w:r>
+        <w:t xml:space="preserve">Compare with the other dossiers' base cases: DietGrocery $30.7M, SportsLayer $21.5M, StartupValuation $1.77M, ArtCommission $1.05M, Voting ~$650k. </w:t>
+      </w:r>
+      <w:r>
+        <w:rPr>
+          <w:b/>
+        </w:rPr>
+        <w:t xml:space="preserve">This model lands at the bottom of that group.</w:t>
+      </w:r>
+    </w:p>
+    <w:p>
+      <w:pPr>
+        <w:pBdr>
+          <w:bottom w:val="single" w:sz="6" w:space="6" w:color="C9CCD1"/>
+        </w:pBdr>
+      </w:pPr>
+    </w:p>
+    <w:p>
+      <w:pPr>
+        <w:pStyle w:val="Heading1"/>
+      </w:pPr>
+      <w:r>
+        <w:t xml:space="preserve">What actually moves the number</w:t>
+      </w:r>
+    </w:p>
+    <w:p>
+      <w:r>
+        <w:rPr>
+          <w:b/>
+        </w:rPr>
+        <w:t xml:space="preserve">Price, not users.</w:t>
+      </w:r>
+      <w:r>
+        <w:t xml:space="preserve"> The same base-case user count at different prices:</w:t>
+      </w:r>
+    </w:p>
+    <w:tbl>
+      <w:tblPr>
+        <w:tblW w:w="10080" w:type="dxa"/>
+        <w:tblBorders>
+          <w:top w:val="single" w:sz="4" w:space="0" w:color="C9CCD1"/>
+          <w:left w:val="single" w:sz="4" w:space="0" w:color="C9CCD1"/>
+          <w:bottom w:val="single" w:sz="4" w:space="0" w:color="C9CCD1"/>
+          <w:right w:val="single" w:sz="4" w:space="0" w:color="C9CCD1"/>
+          <w:insideH w:val="single" w:sz="4" w:space="0" w:color="C9CCD1"/>
+          <w:insideV w:val="single" w:sz="4" w:space="0" w:color="C9CCD1"/>
+        </w:tblBorders>
+        <w:tblLayout w:type="fixed"/>
+      </w:tblPr>
+      <w:tblGrid>
+        <w:gridCol w:w="2016"/>
+        <w:gridCol w:w="2016"/>
+        <w:gridCol w:w="2016"/>
+        <w:gridCol w:w="2016"/>
+        <w:gridCol w:w="2016"/>
+      </w:tblGrid>
+      <w:tr>
+        <w:trPr>
+          <w:tblHeader/>
+        </w:trPr>
+        <w:tc>
+          <w:tcPr>
+            <w:tcW w:w="2016" w:type="dxa"/>
+            <w:shd w:val="clear" w:color="auto" w:fill="EFF1F3"/>
+          </w:tcPr>
+          <w:p>
+            <w:pPr>
+              <w:spacing w:before="40" w:after="40"/>
+            </w:pPr>
+            <w:r>
+              <w:rPr>
+                <w:b/>
+                <w:sz w:val="18"/>
+              </w:rPr>
+              <w:t xml:space="preserve">Price →</w:t>
+            </w:r>
+          </w:p>
+        </w:tc>
+        <w:tc>
+          <w:tcPr>
+            <w:tcW w:w="2016" w:type="dxa"/>
+            <w:shd w:val="clear" w:color="auto" w:fill="EFF1F3"/>
+          </w:tcPr>
+          <w:p>
+            <w:pPr>
+              <w:spacing w:before="40" w:after="40"/>
+            </w:pPr>
+            <w:r>
+              <w:rPr>
+                <w:b/>
+                <w:sz w:val="18"/>
+              </w:rPr>
+              <w:t xml:space="preserve">$50</w:t>
+            </w:r>
+          </w:p>
+        </w:tc>
+        <w:tc>
+          <w:tcPr>
+            <w:tcW w:w="2016" w:type="dxa"/>
+            <w:shd w:val="clear" w:color="auto" w:fill="EFF1F3"/>
+          </w:tcPr>
+          <w:p>
+            <w:pPr>
+              <w:spacing w:before="40" w:after="40"/>
+            </w:pPr>
+            <w:r>
+              <w:rPr>
+                <w:b/>
+                <w:sz w:val="18"/>
+              </w:rPr>
+              <w:t xml:space="preserve">$100 (base)</w:t>
+            </w:r>
+          </w:p>
+        </w:tc>
+        <w:tc>
+          <w:tcPr>
+            <w:tcW w:w="2016" w:type="dxa"/>
+            <w:shd w:val="clear" w:color="auto" w:fill="EFF1F3"/>
+          </w:tcPr>
+          <w:p>
+            <w:pPr>
+              <w:spacing w:before="40" w:after="40"/>
+            </w:pPr>
+            <w:r>
+              <w:rPr>
+                <w:b/>
+                <w:sz w:val="18"/>
+              </w:rPr>
+              <w:t xml:space="preserve">$200</w:t>
+            </w:r>
+          </w:p>
+        </w:tc>
+        <w:tc>
+          <w:tcPr>
+            <w:tcW w:w="2016" w:type="dxa"/>
+            <w:shd w:val="clear" w:color="auto" w:fill="EFF1F3"/>
+          </w:tcPr>
+          <w:p>
+            <w:pPr>
+              <w:spacing w:before="40" w:after="40"/>
+            </w:pPr>
+            <w:r>
+              <w:rPr>
+                <w:b/>
+                <w:sz w:val="18"/>
+              </w:rPr>
+              <w:t xml:space="preserve">$400</w:t>
+            </w:r>
+          </w:p>
+        </w:tc>
+      </w:tr>
+      <w:tr>
+        <w:tc>
+          <w:tcPr>
+            <w:tcW w:w="2016" w:type="dxa"/>
+          </w:tcPr>
+          <w:p>
+            <w:pPr>
+              <w:spacing w:before="40" w:after="40"/>
+            </w:pPr>
+            <w:r>
+              <w:rPr>
+                <w:sz w:val="18"/>
+              </w:rPr>
+              <w:t xml:space="preserve">Paths A + B revenue</w:t>
+            </w:r>
+          </w:p>
+        </w:tc>
+        <w:tc>
+          <w:tcPr>
+            <w:tcW w:w="2016" w:type="dxa"/>
+          </w:tcPr>
+          <w:p>
+            <w:pPr>
+              <w:spacing w:before="40" w:after="40"/>
+            </w:pPr>
+            <w:r>
+              <w:rPr>
+                <w:sz w:val="18"/>
+              </w:rPr>
+              <w:t xml:space="preserve">$279,650</w:t>
+            </w:r>
+          </w:p>
+        </w:tc>
+        <w:tc>
+          <w:tcPr>
+            <w:tcW w:w="2016" w:type="dxa"/>
+          </w:tcPr>
+          <w:p>
+            <w:pPr>
+              <w:spacing w:before="40" w:after="40"/>
+            </w:pPr>
+            <w:r>
+              <w:rPr>
+                <w:b/>
+                <w:sz w:val="18"/>
+              </w:rPr>
+              <w:t xml:space="preserve">$559,300</w:t>
+            </w:r>
+          </w:p>
+        </w:tc>
+        <w:tc>
+          <w:tcPr>
+            <w:tcW w:w="2016" w:type="dxa"/>
+          </w:tcPr>
+          <w:p>
+            <w:pPr>
+              <w:spacing w:before="40" w:after="40"/>
+            </w:pPr>
+            <w:r>
+              <w:rPr>
+                <w:sz w:val="18"/>
+              </w:rPr>
+              <w:t xml:space="preserve">$1.12M</w:t>
+            </w:r>
+          </w:p>
+        </w:tc>
+        <w:tc>
+          <w:tcPr>
+            <w:tcW w:w="2016" w:type="dxa"/>
+          </w:tcPr>
+          <w:p>
+            <w:pPr>
+              <w:spacing w:before="40" w:after="40"/>
+            </w:pPr>
+            <w:r>
+              <w:rPr>
+                <w:sz w:val="18"/>
+              </w:rPr>
+              <w:t xml:space="preserve">$2.24M</w:t>
+            </w:r>
+          </w:p>
+        </w:tc>
+      </w:tr>
+    </w:tbl>
+    <w:p>
+      <w:pPr>
+        <w:spacing w:after="0"/>
+      </w:pPr>
+    </w:p>
+    <w:p>
+      <w:r>
+        <w:rPr>
+          <w:b/>
+        </w:rPr>
+        <w:t xml:space="preserve">$400/year is not absurd for a career credential</w:t>
+      </w:r>
+      <w:r>
+        <w:t xml:space="preserve"> — Section 2 showed sports lawyers earning $100,626 and a single 3% NFL commission worth $150,000 on a $5M contract. But it is absurd for a game, and Section 3 showed the competing products cost </w:t>
+      </w:r>
+      <w:r>
+        <w:rPr>
+          <w:b/>
+        </w:rPr>
+        <w:t xml:space="preserve">$29.99–$69.99 once</w:t>
+      </w:r>
+      <w:r>
+        <w:t xml:space="preserve">.</w:t>
+      </w:r>
+    </w:p>
+    <w:p>
+      <w:r>
+        <w:rPr>
+          <w:b/>
+        </w:rPr>
+        <w:t xml:space="preserve">The institutional licence is the lever that scales.</w:t>
+      </w:r>
+      <w:r>
+        <w:t xml:space="preserve"> At $5,000 per program instead of $4,000:</w:t>
+      </w:r>
+    </w:p>
+    <w:tbl>
+      <w:tblPr>
+        <w:tblW w:w="10080" w:type="dxa"/>
+        <w:tblBorders>
+          <w:top w:val="single" w:sz="4" w:space="0" w:color="C9CCD1"/>
+          <w:left w:val="single" w:sz="4" w:space="0" w:color="C9CCD1"/>
+          <w:bottom w:val="single" w:sz="4" w:space="0" w:color="C9CCD1"/>
+          <w:right w:val="single" w:sz="4" w:space="0" w:color="C9CCD1"/>
+          <w:insideH w:val="single" w:sz="4" w:space="0" w:color="C9CCD1"/>
+          <w:insideV w:val="single" w:sz="4" w:space="0" w:color="C9CCD1"/>
+        </w:tblBorders>
+        <w:tblLayout w:type="fixed"/>
+      </w:tblPr>
+      <w:tblGrid>
+        <w:gridCol w:w="2016"/>
+        <w:gridCol w:w="2016"/>
+        <w:gridCol w:w="2016"/>
+        <w:gridCol w:w="2016"/>
+        <w:gridCol w:w="2016"/>
+      </w:tblGrid>
+      <w:tr>
+        <w:trPr>
+          <w:tblHeader/>
+        </w:trPr>
+        <w:tc>
+          <w:tcPr>
+            <w:tcW w:w="2016" w:type="dxa"/>
+            <w:shd w:val="clear" w:color="auto" w:fill="EFF1F3"/>
+          </w:tcPr>
+          <w:p>
+            <w:pPr>
+              <w:spacing w:before="40" w:after="40"/>
+            </w:pPr>
+            <w:r>
+              <w:rPr>
+                <w:b/>
+                <w:sz w:val="18"/>
+              </w:rPr>
+              <w:t xml:space="preserve">Programs adopting →</w:t>
+            </w:r>
+          </w:p>
+        </w:tc>
+        <w:tc>
+          <w:tcPr>
+            <w:tcW w:w="2016" w:type="dxa"/>
+            <w:shd w:val="clear" w:color="auto" w:fill="EFF1F3"/>
+          </w:tcPr>
+          <w:p>
+            <w:pPr>
+              <w:spacing w:before="40" w:after="40"/>
+            </w:pPr>
+            <w:r>
+              <w:rPr>
+                <w:b/>
+                <w:sz w:val="18"/>
+              </w:rPr>
+              <w:t xml:space="preserve">9</w:t>
+            </w:r>
+          </w:p>
+        </w:tc>
+        <w:tc>
+          <w:tcPr>
+            <w:tcW w:w="2016" w:type="dxa"/>
+            <w:shd w:val="clear" w:color="auto" w:fill="EFF1F3"/>
+          </w:tcPr>
+          <w:p>
+            <w:pPr>
+              <w:spacing w:before="40" w:after="40"/>
+            </w:pPr>
+            <w:r>
+              <w:rPr>
+                <w:b/>
+                <w:sz w:val="18"/>
+              </w:rPr>
+              <w:t xml:space="preserve">26</w:t>
+            </w:r>
+          </w:p>
+        </w:tc>
+        <w:tc>
+          <w:tcPr>
+            <w:tcW w:w="2016" w:type="dxa"/>
+            <w:shd w:val="clear" w:color="auto" w:fill="EFF1F3"/>
+          </w:tcPr>
+          <w:p>
+            <w:pPr>
+              <w:spacing w:before="40" w:after="40"/>
+            </w:pPr>
+            <w:r>
+              <w:rPr>
+                <w:b/>
+                <w:sz w:val="18"/>
+              </w:rPr>
+              <w:t xml:space="preserve">66</w:t>
+            </w:r>
+          </w:p>
+        </w:tc>
+        <w:tc>
+          <w:tcPr>
+            <w:tcW w:w="2016" w:type="dxa"/>
+            <w:shd w:val="clear" w:color="auto" w:fill="EFF1F3"/>
+          </w:tcPr>
+          <w:p>
+            <w:pPr>
+              <w:spacing w:before="40" w:after="40"/>
+            </w:pPr>
+            <w:r>
+              <w:rPr>
+                <w:b/>
+                <w:sz w:val="18"/>
+              </w:rPr>
+              <w:t xml:space="preserve">132 (30% of all 441)</w:t>
+            </w:r>
+          </w:p>
+        </w:tc>
+      </w:tr>
+      <w:tr>
+        <w:tc>
+          <w:tcPr>
+            <w:tcW w:w="2016" w:type="dxa"/>
+          </w:tcPr>
+          <w:p>
+            <w:pPr>
+              <w:spacing w:before="40" w:after="40"/>
+            </w:pPr>
+            <w:r>
+              <w:rPr>
+                <w:sz w:val="18"/>
+              </w:rPr>
+              <w:t xml:space="preserve">Revenue at $5,000 each</w:t>
+            </w:r>
+          </w:p>
+        </w:tc>
+        <w:tc>
+          <w:tcPr>
+            <w:tcW w:w="2016" w:type="dxa"/>
+          </w:tcPr>
+          <w:p>
+            <w:pPr>
+              <w:spacing w:before="40" w:after="40"/>
+            </w:pPr>
+            <w:r>
+              <w:rPr>
+                <w:sz w:val="18"/>
+              </w:rPr>
+              <w:t xml:space="preserve">$45,000</w:t>
+            </w:r>
+          </w:p>
+        </w:tc>
+        <w:tc>
+          <w:tcPr>
+            <w:tcW w:w="2016" w:type="dxa"/>
+          </w:tcPr>
+          <w:p>
+            <w:pPr>
+              <w:spacing w:before="40" w:after="40"/>
+            </w:pPr>
+            <w:r>
+              <w:rPr>
+                <w:sz w:val="18"/>
+              </w:rPr>
+              <w:t xml:space="preserve">$130,000</w:t>
+            </w:r>
+          </w:p>
+        </w:tc>
+        <w:tc>
+          <w:tcPr>
+            <w:tcW w:w="2016" w:type="dxa"/>
+          </w:tcPr>
+          <w:p>
+            <w:pPr>
+              <w:spacing w:before="40" w:after="40"/>
+            </w:pPr>
+            <w:r>
+              <w:rPr>
+                <w:sz w:val="18"/>
+              </w:rPr>
+              <w:t xml:space="preserve">$330,000</w:t>
+            </w:r>
+          </w:p>
+        </w:tc>
+        <w:tc>
+          <w:tcPr>
+            <w:tcW w:w="2016" w:type="dxa"/>
+          </w:tcPr>
+          <w:p>
+            <w:pPr>
+              <w:spacing w:before="40" w:after="40"/>
+            </w:pPr>
+            <w:r>
+              <w:rPr>
+                <w:b/>
+                <w:sz w:val="18"/>
+              </w:rPr>
+              <w:t xml:space="preserve">$660,000</w:t>
+            </w:r>
+          </w:p>
+        </w:tc>
+      </w:tr>
+    </w:tbl>
+    <w:p>
+      <w:pPr>
+        <w:spacing w:after="0"/>
+      </w:pPr>
+    </w:p>
+    <w:p>
+      <w:r>
+        <w:rPr>
+          <w:b/>
+        </w:rPr>
+        <w:t xml:space="preserve">Reaching 30% of every sport management program in the country produces the same revenue as the entire base case.</w:t>
+      </w:r>
+      <w:r>
+        <w:t xml:space="preserve"> That tells you the institutional path is necessary, not optional — and that it is also capped, because there are only 441 buyers.</w:t>
+      </w:r>
+    </w:p>
+    <w:p>
+      <w:pPr>
+        <w:pBdr>
+          <w:bottom w:val="single" w:sz="6" w:space="6" w:color="C9CCD1"/>
+        </w:pBdr>
+      </w:pPr>
+    </w:p>
+    <w:p>
+      <w:pPr>
+        <w:pStyle w:val="Heading1"/>
+      </w:pPr>
+      <w:r>
+        <w:t xml:space="preserve">Every assumption, stated</w:t>
+      </w:r>
+    </w:p>
+    <w:tbl>
+      <w:tblPr>
+        <w:tblW w:w="10080" w:type="dxa"/>
+        <w:tblBorders>
+          <w:top w:val="single" w:sz="4" w:space="0" w:color="C9CCD1"/>
+          <w:left w:val="single" w:sz="4" w:space="0" w:color="C9CCD1"/>
+          <w:bottom w:val="single" w:sz="4" w:space="0" w:color="C9CCD1"/>
+          <w:right w:val="single" w:sz="4" w:space="0" w:color="C9CCD1"/>
+          <w:insideH w:val="single" w:sz="4" w:space="0" w:color="C9CCD1"/>
+          <w:insideV w:val="single" w:sz="4" w:space="0" w:color="C9CCD1"/>
+        </w:tblBorders>
+        <w:tblLayout w:type="fixed"/>
+      </w:tblPr>
+      <w:tblGrid>
+        <w:gridCol w:w="1680"/>
+        <w:gridCol w:w="1680"/>
+        <w:gridCol w:w="1680"/>
+        <w:gridCol w:w="1680"/>
+        <w:gridCol w:w="1680"/>
+        <w:gridCol w:w="1680"/>
+      </w:tblGrid>
+      <w:tr>
+        <w:trPr>
+          <w:tblHeader/>
+        </w:trPr>
+        <w:tc>
+          <w:tcPr>
+            <w:tcW w:w="1680" w:type="dxa"/>
+            <w:shd w:val="clear" w:color="auto" w:fill="EFF1F3"/>
+          </w:tcPr>
+          <w:p>
+            <w:pPr>
+              <w:spacing w:before="40" w:after="40"/>
+            </w:pPr>
+            <w:r>
+              <w:rPr>
+                <w:b/>
+                <w:sz w:val="18"/>
+              </w:rPr>
+              <w:t xml:space="preserve">#</w:t>
+            </w:r>
+          </w:p>
+        </w:tc>
+        <w:tc>
+          <w:tcPr>
+            <w:tcW w:w="1680" w:type="dxa"/>
+            <w:shd w:val="clear" w:color="auto" w:fill="EFF1F3"/>
+          </w:tcPr>
+          <w:p>
+            <w:pPr>
+              <w:spacing w:before="40" w:after="40"/>
+            </w:pPr>
+            <w:r>
+              <w:rPr>
+                <w:b/>
+                <w:sz w:val="18"/>
+              </w:rPr>
+              <w:t xml:space="preserve">Assumption</w:t>
+            </w:r>
+          </w:p>
+        </w:tc>
+        <w:tc>
+          <w:tcPr>
+            <w:tcW w:w="1680" w:type="dxa"/>
+            <w:shd w:val="clear" w:color="auto" w:fill="EFF1F3"/>
+          </w:tcPr>
+          <w:p>
+            <w:pPr>
+              <w:spacing w:before="40" w:after="40"/>
+            </w:pPr>
+            <w:r>
+              <w:rPr>
+                <w:b/>
+                <w:sz w:val="18"/>
+              </w:rPr>
+              <w:t xml:space="preserve">Value</w:t>
+            </w:r>
+          </w:p>
+        </w:tc>
+        <w:tc>
+          <w:tcPr>
+            <w:tcW w:w="1680" w:type="dxa"/>
+            <w:shd w:val="clear" w:color="auto" w:fill="EFF1F3"/>
+          </w:tcPr>
+          <w:p>
+            <w:pPr>
+              <w:spacing w:before="40" w:after="40"/>
+            </w:pPr>
+            <w:r>
+              <w:rPr>
+                <w:b/>
+                <w:sz w:val="18"/>
+              </w:rPr>
+              <w:t xml:space="preserve">Source / basis</w:t>
+            </w:r>
+          </w:p>
+        </w:tc>
+        <w:tc>
+          <w:tcPr>
+            <w:tcW w:w="1680" w:type="dxa"/>
+            <w:shd w:val="clear" w:color="auto" w:fill="EFF1F3"/>
+          </w:tcPr>
+          <w:p>
+            <w:pPr>
+              <w:spacing w:before="40" w:after="40"/>
+            </w:pPr>
+            <w:r>
+              <w:rPr>
+                <w:b/>
+                <w:sz w:val="18"/>
+              </w:rPr>
+              <w:t xml:space="preserve">Type</w:t>
+            </w:r>
+          </w:p>
+        </w:tc>
+        <w:tc>
+          <w:tcPr>
+            <w:tcW w:w="1680" w:type="dxa"/>
+            <w:shd w:val="clear" w:color="auto" w:fill="EFF1F3"/>
+          </w:tcPr>
+          <w:p>
+            <w:pPr>
+              <w:spacing w:before="40" w:after="40"/>
+            </w:pPr>
+            <w:r>
+              <w:rPr>
+                <w:b/>
+                <w:sz w:val="18"/>
+              </w:rPr>
+              <w:t xml:space="preserve">If it's wrong</w:t>
+            </w:r>
+          </w:p>
+        </w:tc>
+      </w:tr>
+      <w:tr>
+        <w:tc>
+          <w:tcPr>
+            <w:tcW w:w="1680" w:type="dxa"/>
+          </w:tcPr>
+          <w:p>
+            <w:pPr>
+              <w:spacing w:before="40" w:after="40"/>
+            </w:pPr>
+            <w:r>
+              <w:rPr>
+                <w:sz w:val="18"/>
+              </w:rPr>
+              <w:t xml:space="preserve">A1</w:t>
+            </w:r>
+          </w:p>
+        </w:tc>
+        <w:tc>
+          <w:tcPr>
+            <w:tcW w:w="1680" w:type="dxa"/>
+          </w:tcPr>
+          <w:p>
+            <w:pPr>
+              <w:spacing w:before="40" w:after="40"/>
+            </w:pPr>
+            <w:r>
+              <w:rPr>
+                <w:sz w:val="18"/>
+              </w:rPr>
+              <w:t xml:space="preserve">Sports management degrees per year</w:t>
+            </w:r>
+          </w:p>
+        </w:tc>
+        <w:tc>
+          <w:tcPr>
+            <w:tcW w:w="1680" w:type="dxa"/>
+          </w:tcPr>
+          <w:p>
+            <w:pPr>
+              <w:spacing w:before="40" w:after="40"/>
+            </w:pPr>
+            <w:r>
+              <w:rPr>
+                <w:sz w:val="18"/>
+              </w:rPr>
+              <w:t xml:space="preserve">16,971</w:t>
+            </w:r>
+          </w:p>
+        </w:tc>
+        <w:tc>
+          <w:tcPr>
+            <w:tcW w:w="1680" w:type="dxa"/>
+          </w:tcPr>
+          <w:p>
+            <w:pPr>
+              <w:spacing w:before="40" w:after="40"/>
+            </w:pPr>
+            <w:r>
+              <w:rPr>
+                <w:sz w:val="18"/>
+              </w:rPr>
+              <w:t xml:space="preserve">College Factual, 2020–21</w:t>
+            </w:r>
+          </w:p>
+        </w:tc>
+        <w:tc>
+          <w:tcPr>
+            <w:tcW w:w="1680" w:type="dxa"/>
+          </w:tcPr>
+          <w:p>
+            <w:pPr>
+              <w:spacing w:before="40" w:after="40"/>
+            </w:pPr>
+            <w:r>
+              <w:rPr>
+                <w:sz w:val="18"/>
+              </w:rPr>
+              <w:t xml:space="preserve">⚠️ </w:t>
+            </w:r>
+            <w:r>
+              <w:rPr>
+                <w:b/>
+                <w:sz w:val="18"/>
+              </w:rPr>
+              <w:t xml:space="preserve">Verified but stale</w:t>
+            </w:r>
+            <w:r>
+              <w:rPr>
+                <w:sz w:val="18"/>
+              </w:rPr>
+              <w:t xml:space="preserve"> (five years old; NCES blocks automated access)</w:t>
+            </w:r>
+          </w:p>
+        </w:tc>
+        <w:tc>
+          <w:tcPr>
+            <w:tcW w:w="1680" w:type="dxa"/>
+          </w:tcPr>
+          <w:p>
+            <w:pPr>
+              <w:spacing w:before="40" w:after="40"/>
+            </w:pPr>
+            <w:r>
+              <w:rPr>
+                <w:sz w:val="18"/>
+              </w:rPr>
+              <w:t xml:space="preserve">Growth since 2021 would raise every Path A figure proportionally</w:t>
+            </w:r>
+          </w:p>
+        </w:tc>
+      </w:tr>
+      <w:tr>
+        <w:tc>
+          <w:tcPr>
+            <w:tcW w:w="1680" w:type="dxa"/>
+          </w:tcPr>
+          <w:p>
+            <w:pPr>
+              <w:spacing w:before="40" w:after="40"/>
+            </w:pPr>
+            <w:r>
+              <w:rPr>
+                <w:sz w:val="18"/>
+              </w:rPr>
+              <w:t xml:space="preserve">A2</w:t>
+            </w:r>
+          </w:p>
+        </w:tc>
+        <w:tc>
+          <w:tcPr>
+            <w:tcW w:w="1680" w:type="dxa"/>
+          </w:tcPr>
+          <w:p>
+            <w:pPr>
+              <w:spacing w:before="40" w:after="40"/>
+            </w:pPr>
+            <w:r>
+              <w:rPr>
+                <w:sz w:val="18"/>
+              </w:rPr>
+              <w:t xml:space="preserve">4-year enrolled pipeline</w:t>
+            </w:r>
+          </w:p>
+        </w:tc>
+        <w:tc>
+          <w:tcPr>
+            <w:tcW w:w="1680" w:type="dxa"/>
+          </w:tcPr>
+          <w:p>
+            <w:pPr>
+              <w:spacing w:before="40" w:after="40"/>
+            </w:pPr>
+            <w:r>
+              <w:rPr>
+                <w:sz w:val="18"/>
+              </w:rPr>
+              <w:t xml:space="preserve">×4</w:t>
+            </w:r>
+          </w:p>
+        </w:tc>
+        <w:tc>
+          <w:tcPr>
+            <w:tcW w:w="1680" w:type="dxa"/>
+          </w:tcPr>
+          <w:p>
+            <w:pPr>
+              <w:spacing w:before="40" w:after="40"/>
+            </w:pPr>
+            <w:r>
+              <w:rPr>
+                <w:sz w:val="18"/>
+              </w:rPr>
+              <w:t xml:space="preserve">My multiplication</w:t>
+            </w:r>
+          </w:p>
+        </w:tc>
+        <w:tc>
+          <w:tcPr>
+            <w:tcW w:w="1680" w:type="dxa"/>
+          </w:tcPr>
+          <w:p>
+            <w:pPr>
+              <w:spacing w:before="40" w:after="40"/>
+            </w:pPr>
+            <w:r>
+              <w:rPr>
+                <w:rFonts w:ascii="Consolas" w:hAnsi="Consolas"/>
+                <w:sz w:val="18"/>
+              </w:rPr>
+              <w:t xml:space="preserve">[UNVERIFIED]</w:t>
+            </w:r>
+          </w:p>
+        </w:tc>
+        <w:tc>
+          <w:tcPr>
+            <w:tcW w:w="1680" w:type="dxa"/>
+          </w:tcPr>
+          <w:p>
+            <w:pPr>
+              <w:spacing w:before="40" w:after="40"/>
+            </w:pPr>
+            <w:r>
+              <w:rPr>
+                <w:sz w:val="18"/>
+              </w:rPr>
+              <w:t xml:space="preserve">Dropouts and 2-year entrants make this soft in both directions</w:t>
+            </w:r>
+          </w:p>
+        </w:tc>
+      </w:tr>
+      <w:tr>
+        <w:tc>
+          <w:tcPr>
+            <w:tcW w:w="1680" w:type="dxa"/>
+          </w:tcPr>
+          <w:p>
+            <w:pPr>
+              <w:spacing w:before="40" w:after="40"/>
+            </w:pPr>
+            <w:r>
+              <w:rPr>
+                <w:sz w:val="18"/>
+              </w:rPr>
+              <w:t xml:space="preserve">A3</w:t>
+            </w:r>
+          </w:p>
+        </w:tc>
+        <w:tc>
+          <w:tcPr>
+            <w:tcW w:w="1680" w:type="dxa"/>
+          </w:tcPr>
+          <w:p>
+            <w:pPr>
+              <w:spacing w:before="40" w:after="40"/>
+            </w:pPr>
+            <w:r>
+              <w:rPr>
+                <w:sz w:val="18"/>
+              </w:rPr>
+              <w:t xml:space="preserve">Share aiming at deal-side roles</w:t>
+            </w:r>
+          </w:p>
+        </w:tc>
+        <w:tc>
+          <w:tcPr>
+            <w:tcW w:w="1680" w:type="dxa"/>
+          </w:tcPr>
+          <w:p>
+            <w:pPr>
+              <w:spacing w:before="40" w:after="40"/>
+            </w:pPr>
+            <w:r>
+              <w:rPr>
+                <w:sz w:val="18"/>
+              </w:rPr>
+              <w:t xml:space="preserve">30%</w:t>
+            </w:r>
+          </w:p>
+        </w:tc>
+        <w:tc>
+          <w:tcPr>
+            <w:tcW w:w="1680" w:type="dxa"/>
+          </w:tcPr>
+          <w:p>
+            <w:pPr>
+              <w:spacing w:before="40" w:after="40"/>
+            </w:pPr>
+            <w:r>
+              <w:rPr>
+                <w:sz w:val="18"/>
+              </w:rPr>
+              <w:t xml:space="preserve">No published breakdown of sport management career intent</w:t>
+            </w:r>
+          </w:p>
+        </w:tc>
+        <w:tc>
+          <w:tcPr>
+            <w:tcW w:w="1680" w:type="dxa"/>
+          </w:tcPr>
+          <w:p>
+            <w:pPr>
+              <w:spacing w:before="40" w:after="40"/>
+            </w:pPr>
+            <w:r>
+              <w:rPr>
+                <w:rFonts w:ascii="Consolas" w:hAnsi="Consolas"/>
+                <w:sz w:val="18"/>
+              </w:rPr>
+              <w:t xml:space="preserve">[UNVERIFIED]</w:t>
+            </w:r>
+          </w:p>
+        </w:tc>
+        <w:tc>
+          <w:tcPr>
+            <w:tcW w:w="1680" w:type="dxa"/>
+          </w:tcPr>
+          <w:p>
+            <w:pPr>
+              <w:spacing w:before="40" w:after="40"/>
+            </w:pPr>
+            <w:r>
+              <w:rPr>
+                <w:sz w:val="18"/>
+              </w:rPr>
+              <w:t xml:space="preserve">At 15%, Path A halves; at 50%, it rises 67%</w:t>
+            </w:r>
+          </w:p>
+        </w:tc>
+      </w:tr>
+      <w:tr>
+        <w:tc>
+          <w:tcPr>
+            <w:tcW w:w="1680" w:type="dxa"/>
+          </w:tcPr>
+          <w:p>
+            <w:pPr>
+              <w:spacing w:before="40" w:after="40"/>
+            </w:pPr>
+            <w:r>
+              <w:rPr>
+                <w:sz w:val="18"/>
+              </w:rPr>
+              <w:t xml:space="preserve">A4</w:t>
+            </w:r>
+          </w:p>
+        </w:tc>
+        <w:tc>
+          <w:tcPr>
+            <w:tcW w:w="1680" w:type="dxa"/>
+          </w:tcPr>
+          <w:p>
+            <w:pPr>
+              <w:spacing w:before="40" w:after="40"/>
+            </w:pPr>
+            <w:r>
+              <w:rPr>
+                <w:sz w:val="18"/>
+              </w:rPr>
+              <w:t xml:space="preserve">Steam reviews → owners</w:t>
+            </w:r>
+          </w:p>
+        </w:tc>
+        <w:tc>
+          <w:tcPr>
+            <w:tcW w:w="1680" w:type="dxa"/>
+          </w:tcPr>
+          <w:p>
+            <w:pPr>
+              <w:spacing w:before="40" w:after="40"/>
+            </w:pPr>
+            <w:r>
+              <w:rPr>
+                <w:sz w:val="18"/>
+              </w:rPr>
+              <w:t xml:space="preserve">×30</w:t>
+            </w:r>
+          </w:p>
+        </w:tc>
+        <w:tc>
+          <w:tcPr>
+            <w:tcW w:w="1680" w:type="dxa"/>
+          </w:tcPr>
+          <w:p>
+            <w:pPr>
+              <w:spacing w:before="40" w:after="40"/>
+            </w:pPr>
+            <w:r>
+              <w:rPr>
+                <w:sz w:val="18"/>
+              </w:rPr>
+              <w:t xml:space="preserve">Widely used industry heuristic</w:t>
+            </w:r>
+          </w:p>
+        </w:tc>
+        <w:tc>
+          <w:tcPr>
+            <w:tcW w:w="1680" w:type="dxa"/>
+          </w:tcPr>
+          <w:p>
+            <w:pPr>
+              <w:spacing w:before="40" w:after="40"/>
+            </w:pPr>
+            <w:r>
+              <w:rPr>
+                <w:rFonts w:ascii="Consolas" w:hAnsi="Consolas"/>
+                <w:sz w:val="18"/>
+              </w:rPr>
+              <w:t xml:space="preserve">[UNVERIFIED — not a measurement]</w:t>
+            </w:r>
+          </w:p>
+        </w:tc>
+        <w:tc>
+          <w:tcPr>
+            <w:tcW w:w="1680" w:type="dxa"/>
+          </w:tcPr>
+          <w:p>
+            <w:pPr>
+              <w:spacing w:before="40" w:after="40"/>
+            </w:pPr>
+            <w:r>
+              <w:rPr>
+                <w:sz w:val="18"/>
+              </w:rPr>
+              <w:t xml:space="preserve">At ×15, Path B halves; at ×50, it rises 67%. </w:t>
+            </w:r>
+            <w:r>
+              <w:rPr>
+                <w:b/>
+                <w:sz w:val="18"/>
+              </w:rPr>
+              <w:t xml:space="preserve">The single softest number here</w:t>
+            </w:r>
+          </w:p>
+        </w:tc>
+      </w:tr>
+      <w:tr>
+        <w:tc>
+          <w:tcPr>
+            <w:tcW w:w="1680" w:type="dxa"/>
+          </w:tcPr>
+          <w:p>
+            <w:pPr>
+              <w:spacing w:before="40" w:after="40"/>
+            </w:pPr>
+            <w:r>
+              <w:rPr>
+                <w:sz w:val="18"/>
+              </w:rPr>
+              <w:t xml:space="preserve">A5</w:t>
+            </w:r>
+          </w:p>
+        </w:tc>
+        <w:tc>
+          <w:tcPr>
+            <w:tcW w:w="1680" w:type="dxa"/>
+          </w:tcPr>
+          <w:p>
+            <w:pPr>
+              <w:spacing w:before="40" w:after="40"/>
+            </w:pPr>
+            <w:r>
+              <w:rPr>
+                <w:sz w:val="18"/>
+              </w:rPr>
+              <w:t xml:space="preserve">Console franchise players excluded</w:t>
+            </w:r>
+          </w:p>
+        </w:tc>
+        <w:tc>
+          <w:tcPr>
+            <w:tcW w:w="1680" w:type="dxa"/>
+          </w:tcPr>
+          <w:p>
+            <w:pPr>
+              <w:spacing w:before="40" w:after="40"/>
+            </w:pPr>
+            <w:r>
+              <w:rPr>
+                <w:sz w:val="18"/>
+              </w:rPr>
+              <w:t xml:space="preserve">—</w:t>
+            </w:r>
+          </w:p>
+        </w:tc>
+        <w:tc>
+          <w:tcPr>
+            <w:tcW w:w="1680" w:type="dxa"/>
+          </w:tcPr>
+          <w:p>
+            <w:pPr>
+              <w:spacing w:before="40" w:after="40"/>
+            </w:pPr>
+            <w:r>
+              <w:rPr>
+                <w:sz w:val="18"/>
+              </w:rPr>
+              <w:t xml:space="preserve">Madden/2K buyers purchase for on-field play</w:t>
+            </w:r>
+          </w:p>
+        </w:tc>
+        <w:tc>
+          <w:tcPr>
+            <w:tcW w:w="1680" w:type="dxa"/>
+          </w:tcPr>
+          <w:p>
+            <w:pPr>
+              <w:spacing w:before="40" w:after="40"/>
+            </w:pPr>
+            <w:r>
+              <w:rPr>
+                <w:b/>
+                <w:sz w:val="18"/>
+              </w:rPr>
+              <w:t xml:space="preserve">Deliberate exclusion</w:t>
+            </w:r>
+          </w:p>
+        </w:tc>
+        <w:tc>
+          <w:tcPr>
+            <w:tcW w:w="1680" w:type="dxa"/>
+          </w:tcPr>
+          <w:p>
+            <w:pPr>
+              <w:spacing w:before="40" w:after="40"/>
+            </w:pPr>
+            <w:r>
+              <w:rPr>
+                <w:sz w:val="18"/>
+              </w:rPr>
+              <w:t xml:space="preserve">Including them would inflate SAM by millions on no evidence of negotiation demand</w:t>
+            </w:r>
+          </w:p>
+        </w:tc>
+      </w:tr>
+      <w:tr>
+        <w:tc>
+          <w:tcPr>
+            <w:tcW w:w="1680" w:type="dxa"/>
+          </w:tcPr>
+          <w:p>
+            <w:pPr>
+              <w:spacing w:before="40" w:after="40"/>
+            </w:pPr>
+            <w:r>
+              <w:rPr>
+                <w:sz w:val="18"/>
+              </w:rPr>
+              <w:t xml:space="preserve">A6</w:t>
+            </w:r>
+          </w:p>
+        </w:tc>
+        <w:tc>
+          <w:tcPr>
+            <w:tcW w:w="1680" w:type="dxa"/>
+          </w:tcPr>
+          <w:p>
+            <w:pPr>
+              <w:spacing w:before="40" w:after="40"/>
+            </w:pPr>
+            <w:r>
+              <w:rPr>
+                <w:sz w:val="18"/>
+              </w:rPr>
+              <w:t xml:space="preserve">Adoption, Path A</w:t>
+            </w:r>
+          </w:p>
+        </w:tc>
+        <w:tc>
+          <w:tcPr>
+            <w:tcW w:w="1680" w:type="dxa"/>
+          </w:tcPr>
+          <w:p>
+            <w:pPr>
+              <w:spacing w:before="40" w:after="40"/>
+            </w:pPr>
+            <w:r>
+              <w:rPr>
+                <w:sz w:val="18"/>
+              </w:rPr>
+              <w:t xml:space="preserve">2/5/12%</w:t>
+            </w:r>
+          </w:p>
+        </w:tc>
+        <w:tc>
+          <w:tcPr>
+            <w:tcW w:w="1680" w:type="dxa"/>
+          </w:tcPr>
+          <w:p>
+            <w:pPr>
+              <w:spacing w:before="40" w:after="40"/>
+            </w:pPr>
+            <w:r>
+              <w:rPr>
+                <w:sz w:val="18"/>
+              </w:rPr>
+              <w:t xml:space="preserve">No comparable product to calibrate against</w:t>
+            </w:r>
+          </w:p>
+        </w:tc>
+        <w:tc>
+          <w:tcPr>
+            <w:tcW w:w="1680" w:type="dxa"/>
+          </w:tcPr>
+          <w:p>
+            <w:pPr>
+              <w:spacing w:before="40" w:after="40"/>
+            </w:pPr>
+            <w:r>
+              <w:rPr>
+                <w:rFonts w:ascii="Consolas" w:hAnsi="Consolas"/>
+                <w:sz w:val="18"/>
+              </w:rPr>
+              <w:t xml:space="preserve">[UNVERIFIED]</w:t>
+            </w:r>
+          </w:p>
+        </w:tc>
+        <w:tc>
+          <w:tcPr>
+            <w:tcW w:w="1680" w:type="dxa"/>
+          </w:tcPr>
+          <w:p>
+            <w:pPr>
+              <w:spacing w:before="40" w:after="40"/>
+            </w:pPr>
+            <w:r>
+              <w:rPr>
+                <w:sz w:val="18"/>
+              </w:rPr>
+              <w:t xml:space="preserve">See sensitivity</w:t>
+            </w:r>
+          </w:p>
+        </w:tc>
+      </w:tr>
+      <w:tr>
+        <w:tc>
+          <w:tcPr>
+            <w:tcW w:w="1680" w:type="dxa"/>
+          </w:tcPr>
+          <w:p>
+            <w:pPr>
+              <w:spacing w:before="40" w:after="40"/>
+            </w:pPr>
+            <w:r>
+              <w:rPr>
+                <w:sz w:val="18"/>
+              </w:rPr>
+              <w:t xml:space="preserve">A7</w:t>
+            </w:r>
+          </w:p>
+        </w:tc>
+        <w:tc>
+          <w:tcPr>
+            <w:tcW w:w="1680" w:type="dxa"/>
+          </w:tcPr>
+          <w:p>
+            <w:pPr>
+              <w:spacing w:before="40" w:after="40"/>
+            </w:pPr>
+            <w:r>
+              <w:rPr>
+                <w:sz w:val="18"/>
+              </w:rPr>
+              <w:t xml:space="preserve">Adoption, Path B</w:t>
+            </w:r>
+          </w:p>
+        </w:tc>
+        <w:tc>
+          <w:tcPr>
+            <w:tcW w:w="1680" w:type="dxa"/>
+          </w:tcPr>
+          <w:p>
+            <w:pPr>
+              <w:spacing w:before="40" w:after="40"/>
+            </w:pPr>
+            <w:r>
+              <w:rPr>
+                <w:sz w:val="18"/>
+              </w:rPr>
+              <w:t xml:space="preserve">0.5/1.5/4%</w:t>
+            </w:r>
+          </w:p>
+        </w:tc>
+        <w:tc>
+          <w:tcPr>
+            <w:tcW w:w="1680" w:type="dxa"/>
+          </w:tcPr>
+          <w:p>
+            <w:pPr>
+              <w:spacing w:before="40" w:after="40"/>
+            </w:pPr>
+            <w:r>
+              <w:rPr>
+                <w:sz w:val="18"/>
+              </w:rPr>
+              <w:t xml:space="preserve">Ditto</w:t>
+            </w:r>
+          </w:p>
+        </w:tc>
+        <w:tc>
+          <w:tcPr>
+            <w:tcW w:w="1680" w:type="dxa"/>
+          </w:tcPr>
+          <w:p>
+            <w:pPr>
+              <w:spacing w:before="40" w:after="40"/>
+            </w:pPr>
+            <w:r>
+              <w:rPr>
+                <w:rFonts w:ascii="Consolas" w:hAnsi="Consolas"/>
+                <w:sz w:val="18"/>
+              </w:rPr>
+              <w:t xml:space="preserve">[UNVERIFIED]</w:t>
+            </w:r>
+          </w:p>
+        </w:tc>
+        <w:tc>
+          <w:tcPr>
+            <w:tcW w:w="1680" w:type="dxa"/>
+          </w:tcPr>
+          <w:p>
+            <w:pPr>
+              <w:spacing w:before="40" w:after="40"/>
+            </w:pPr>
+            <w:r>
+              <w:rPr>
+                <w:sz w:val="18"/>
+              </w:rPr>
+              <w:t xml:space="preserve">See sensitivity</w:t>
+            </w:r>
+          </w:p>
+        </w:tc>
+      </w:tr>
+      <w:tr>
+        <w:tc>
+          <w:tcPr>
+            <w:tcW w:w="1680" w:type="dxa"/>
+          </w:tcPr>
+          <w:p>
+            <w:pPr>
+              <w:spacing w:before="40" w:after="40"/>
+            </w:pPr>
+            <w:r>
+              <w:rPr>
+                <w:sz w:val="18"/>
+              </w:rPr>
+              <w:t xml:space="preserve">A8</w:t>
+            </w:r>
+          </w:p>
+        </w:tc>
+        <w:tc>
+          <w:tcPr>
+            <w:tcW w:w="1680" w:type="dxa"/>
+          </w:tcPr>
+          <w:p>
+            <w:pPr>
+              <w:spacing w:before="40" w:after="40"/>
+            </w:pPr>
+            <w:r>
+              <w:rPr>
+                <w:sz w:val="18"/>
+              </w:rPr>
+              <w:t xml:space="preserve">Adoption, Path C</w:t>
+            </w:r>
+          </w:p>
+        </w:tc>
+        <w:tc>
+          <w:tcPr>
+            <w:tcW w:w="1680" w:type="dxa"/>
+          </w:tcPr>
+          <w:p>
+            <w:pPr>
+              <w:spacing w:before="40" w:after="40"/>
+            </w:pPr>
+            <w:r>
+              <w:rPr>
+                <w:sz w:val="18"/>
+              </w:rPr>
+              <w:t xml:space="preserve">2/6/15% of 441 programs</w:t>
+            </w:r>
+          </w:p>
+        </w:tc>
+        <w:tc>
+          <w:tcPr>
+            <w:tcW w:w="1680" w:type="dxa"/>
+          </w:tcPr>
+          <w:p>
+            <w:pPr>
+              <w:spacing w:before="40" w:after="40"/>
+            </w:pPr>
+            <w:r>
+              <w:rPr>
+                <w:sz w:val="18"/>
+              </w:rPr>
+              <w:t xml:space="preserve">Ditto</w:t>
+            </w:r>
+          </w:p>
+        </w:tc>
+        <w:tc>
+          <w:tcPr>
+            <w:tcW w:w="1680" w:type="dxa"/>
+          </w:tcPr>
+          <w:p>
+            <w:pPr>
+              <w:spacing w:before="40" w:after="40"/>
+            </w:pPr>
+            <w:r>
+              <w:rPr>
+                <w:rFonts w:ascii="Consolas" w:hAnsi="Consolas"/>
+                <w:sz w:val="18"/>
+              </w:rPr>
+              <w:t xml:space="preserve">[UNVERIFIED]</w:t>
+            </w:r>
+          </w:p>
+        </w:tc>
+        <w:tc>
+          <w:tcPr>
+            <w:tcW w:w="1680" w:type="dxa"/>
+          </w:tcPr>
+          <w:p>
+            <w:pPr>
+              <w:spacing w:before="40" w:after="40"/>
+            </w:pPr>
+            <w:r>
+              <w:rPr>
+                <w:sz w:val="18"/>
+              </w:rPr>
+              <w:t xml:space="preserve">The most testable of the three — 441 named institutions</w:t>
+            </w:r>
+          </w:p>
+        </w:tc>
+      </w:tr>
+      <w:tr>
+        <w:tc>
+          <w:tcPr>
+            <w:tcW w:w="1680" w:type="dxa"/>
+          </w:tcPr>
+          <w:p>
+            <w:pPr>
+              <w:spacing w:before="40" w:after="40"/>
+            </w:pPr>
+            <w:r>
+              <w:rPr>
+                <w:sz w:val="18"/>
+              </w:rPr>
+              <w:t xml:space="preserve">A9</w:t>
+            </w:r>
+          </w:p>
+        </w:tc>
+        <w:tc>
+          <w:tcPr>
+            <w:tcW w:w="1680" w:type="dxa"/>
+          </w:tcPr>
+          <w:p>
+            <w:pPr>
+              <w:spacing w:before="40" w:after="40"/>
+            </w:pPr>
+            <w:r>
+              <w:rPr>
+                <w:sz w:val="18"/>
+              </w:rPr>
+              <w:t xml:space="preserve">Price</w:t>
+            </w:r>
+          </w:p>
+        </w:tc>
+        <w:tc>
+          <w:tcPr>
+            <w:tcW w:w="1680" w:type="dxa"/>
+          </w:tcPr>
+          <w:p>
+            <w:pPr>
+              <w:spacing w:before="40" w:after="40"/>
+            </w:pPr>
+            <w:r>
+              <w:rPr>
+                <w:sz w:val="18"/>
+              </w:rPr>
+              <w:t xml:space="preserve">$100/yr</w:t>
+            </w:r>
+          </w:p>
+        </w:tc>
+        <w:tc>
+          <w:tcPr>
+            <w:tcW w:w="1680" w:type="dxa"/>
+          </w:tcPr>
+          <w:p>
+            <w:pPr>
+              <w:spacing w:before="40" w:after="40"/>
+            </w:pPr>
+            <w:r>
+              <w:rPr>
+                <w:sz w:val="18"/>
+              </w:rPr>
+              <w:t xml:space="preserve">Your input. Sits </w:t>
+            </w:r>
+            <w:r>
+              <w:rPr>
+                <w:b/>
+                <w:sz w:val="18"/>
+              </w:rPr>
+              <w:t xml:space="preserve">above</w:t>
+            </w:r>
+            <w:r>
+              <w:rPr>
+                <w:sz w:val="18"/>
+              </w:rPr>
+              <w:t xml:space="preserve"> every competing product's one-time price ($29.99–$69.99) and </w:t>
+            </w:r>
+            <w:r>
+              <w:rPr>
+                <w:b/>
+                <w:sz w:val="18"/>
+              </w:rPr>
+              <w:t xml:space="preserve">far below</w:t>
+            </w:r>
+            <w:r>
+              <w:rPr>
+                <w:sz w:val="18"/>
+              </w:rPr>
+              <w:t xml:space="preserve"> professional training</w:t>
+            </w:r>
+          </w:p>
+        </w:tc>
+        <w:tc>
+          <w:tcPr>
+            <w:tcW w:w="1680" w:type="dxa"/>
+          </w:tcPr>
+          <w:p>
+            <w:pPr>
+              <w:spacing w:before="40" w:after="40"/>
+            </w:pPr>
+            <w:r>
+              <w:rPr>
+                <w:b/>
+                <w:sz w:val="18"/>
+              </w:rPr>
+              <w:t xml:space="preserve">Verified as out-of-band</w:t>
+            </w:r>
+          </w:p>
+        </w:tc>
+        <w:tc>
+          <w:tcPr>
+            <w:tcW w:w="1680" w:type="dxa"/>
+          </w:tcPr>
+          <w:p>
+            <w:pPr>
+              <w:spacing w:before="40" w:after="40"/>
+            </w:pPr>
+            <w:r>
+              <w:rPr>
+                <w:sz w:val="18"/>
+              </w:rPr>
+              <w:t xml:space="preserve">See the price table</w:t>
+            </w:r>
+          </w:p>
+        </w:tc>
+      </w:tr>
+      <w:tr>
+        <w:tc>
+          <w:tcPr>
+            <w:tcW w:w="1680" w:type="dxa"/>
+          </w:tcPr>
+          <w:p>
+            <w:pPr>
+              <w:spacing w:before="40" w:after="40"/>
+            </w:pPr>
+            <w:r>
+              <w:rPr>
+                <w:sz w:val="18"/>
+              </w:rPr>
+              <w:t xml:space="preserve">A10</w:t>
+            </w:r>
+          </w:p>
+        </w:tc>
+        <w:tc>
+          <w:tcPr>
+            <w:tcW w:w="1680" w:type="dxa"/>
+          </w:tcPr>
+          <w:p>
+            <w:pPr>
+              <w:spacing w:before="40" w:after="40"/>
+            </w:pPr>
+            <w:r>
+              <w:rPr>
+                <w:sz w:val="18"/>
+              </w:rPr>
+              <w:t xml:space="preserve">Program seat count</w:t>
+            </w:r>
+          </w:p>
+        </w:tc>
+        <w:tc>
+          <w:tcPr>
+            <w:tcW w:w="1680" w:type="dxa"/>
+          </w:tcPr>
+          <w:p>
+            <w:pPr>
+              <w:spacing w:before="40" w:after="40"/>
+            </w:pPr>
+            <w:r>
+              <w:rPr>
+                <w:sz w:val="18"/>
+              </w:rPr>
+              <w:t xml:space="preserve">40 students/program</w:t>
+            </w:r>
+          </w:p>
+        </w:tc>
+        <w:tc>
+          <w:tcPr>
+            <w:tcW w:w="1680" w:type="dxa"/>
+          </w:tcPr>
+          <w:p>
+            <w:pPr>
+              <w:spacing w:before="40" w:after="40"/>
+            </w:pPr>
+            <w:r>
+              <w:rPr>
+                <w:sz w:val="18"/>
+              </w:rPr>
+              <w:t xml:space="preserve">Judgment</w:t>
+            </w:r>
+          </w:p>
+        </w:tc>
+        <w:tc>
+          <w:tcPr>
+            <w:tcW w:w="1680" w:type="dxa"/>
+          </w:tcPr>
+          <w:p>
+            <w:pPr>
+              <w:spacing w:before="40" w:after="40"/>
+            </w:pPr>
+            <w:r>
+              <w:rPr>
+                <w:rFonts w:ascii="Consolas" w:hAnsi="Consolas"/>
+                <w:sz w:val="18"/>
+              </w:rPr>
+              <w:t xml:space="preserve">[UNVERIFIED]</w:t>
+            </w:r>
+          </w:p>
+        </w:tc>
+        <w:tc>
+          <w:tcPr>
+            <w:tcW w:w="1680" w:type="dxa"/>
+          </w:tcPr>
+          <w:p>
+            <w:pPr>
+              <w:spacing w:before="40" w:after="40"/>
+            </w:pPr>
+            <w:r>
+              <w:rPr>
+                <w:sz w:val="18"/>
+              </w:rPr>
+              <w:t xml:space="preserve">Drives Path C linearly</w:t>
+            </w:r>
+          </w:p>
+        </w:tc>
+      </w:tr>
+      <w:tr>
+        <w:tc>
+          <w:tcPr>
+            <w:tcW w:w="1680" w:type="dxa"/>
+          </w:tcPr>
+          <w:p>
+            <w:pPr>
+              <w:spacing w:before="40" w:after="40"/>
+            </w:pPr>
+            <w:r>
+              <w:rPr>
+                <w:sz w:val="18"/>
+              </w:rPr>
+              <w:t xml:space="preserve">A11</w:t>
+            </w:r>
+          </w:p>
+        </w:tc>
+        <w:tc>
+          <w:tcPr>
+            <w:tcW w:w="1680" w:type="dxa"/>
+          </w:tcPr>
+          <w:p>
+            <w:pPr>
+              <w:spacing w:before="40" w:after="40"/>
+            </w:pPr>
+            <w:r>
+              <w:rPr>
+                <w:sz w:val="18"/>
+              </w:rPr>
+              <w:t xml:space="preserve">Payment processing ~3%</w:t>
+            </w:r>
+          </w:p>
+        </w:tc>
+        <w:tc>
+          <w:tcPr>
+            <w:tcW w:w="1680" w:type="dxa"/>
+          </w:tcPr>
+          <w:p>
+            <w:pPr>
+              <w:spacing w:before="40" w:after="40"/>
+            </w:pPr>
+            <w:r>
+              <w:rPr>
+                <w:sz w:val="18"/>
+              </w:rPr>
+              <w:t xml:space="preserve">Web checkout</w:t>
+            </w:r>
+          </w:p>
+        </w:tc>
+        <w:tc>
+          <w:tcPr>
+            <w:tcW w:w="1680" w:type="dxa"/>
+          </w:tcPr>
+          <w:p>
+            <w:pPr>
+              <w:spacing w:before="40" w:after="40"/>
+            </w:pPr>
+            <w:r>
+              <w:rPr>
+                <w:b/>
+                <w:sz w:val="18"/>
+              </w:rPr>
+              <w:t xml:space="preserve">Verified as standard</w:t>
+            </w:r>
+          </w:p>
+        </w:tc>
+        <w:tc>
+          <w:tcPr>
+            <w:tcW w:w="1680" w:type="dxa"/>
+          </w:tcPr>
+          <w:p>
+            <w:pPr>
+              <w:spacing w:before="40" w:after="40"/>
+            </w:pPr>
+            <w:r>
+              <w:rPr>
+                <w:sz w:val="18"/>
+              </w:rPr>
+              <w:t xml:space="preserve">App-store billing would cost 15–30% instead</w:t>
+            </w:r>
+          </w:p>
+        </w:tc>
+      </w:tr>
+      <w:tr>
+        <w:tc>
+          <w:tcPr>
+            <w:tcW w:w="1680" w:type="dxa"/>
+          </w:tcPr>
+          <w:p>
+            <w:pPr>
+              <w:spacing w:before="40" w:after="40"/>
+            </w:pPr>
+            <w:r>
+              <w:rPr>
+                <w:sz w:val="18"/>
+              </w:rPr>
+              <w:t xml:space="preserve">A12</w:t>
+            </w:r>
+          </w:p>
+        </w:tc>
+        <w:tc>
+          <w:tcPr>
+            <w:tcW w:w="1680" w:type="dxa"/>
+          </w:tcPr>
+          <w:p>
+            <w:pPr>
+              <w:spacing w:before="40" w:after="40"/>
+            </w:pPr>
+            <w:r>
+              <w:rPr>
+                <w:sz w:val="18"/>
+              </w:rPr>
+              <w:t xml:space="preserve">Paths don't overlap</w:t>
+            </w:r>
+          </w:p>
+        </w:tc>
+        <w:tc>
+          <w:tcPr>
+            <w:tcW w:w="1680" w:type="dxa"/>
+          </w:tcPr>
+          <w:p>
+            <w:pPr>
+              <w:spacing w:before="40" w:after="40"/>
+            </w:pPr>
+            <w:r>
+              <w:rPr>
+                <w:sz w:val="18"/>
+              </w:rPr>
+              <w:t xml:space="preserve">—</w:t>
+            </w:r>
+          </w:p>
+        </w:tc>
+        <w:tc>
+          <w:tcPr>
+            <w:tcW w:w="1680" w:type="dxa"/>
+          </w:tcPr>
+          <w:p>
+            <w:pPr>
+              <w:spacing w:before="40" w:after="40"/>
+            </w:pPr>
+            <w:r>
+              <w:rPr>
+                <w:sz w:val="18"/>
+              </w:rPr>
+              <w:t xml:space="preserve">A student could also be an enthusiast</w:t>
+            </w:r>
+          </w:p>
+        </w:tc>
+        <w:tc>
+          <w:tcPr>
+            <w:tcW w:w="1680" w:type="dxa"/>
+          </w:tcPr>
+          <w:p>
+            <w:pPr>
+              <w:spacing w:before="40" w:after="40"/>
+            </w:pPr>
+            <w:r>
+              <w:rPr>
+                <w:sz w:val="18"/>
+              </w:rPr>
+              <w:t xml:space="preserve">⚠️ </w:t>
+            </w:r>
+            <w:r>
+              <w:rPr>
+                <w:b/>
+                <w:sz w:val="18"/>
+              </w:rPr>
+              <w:t xml:space="preserve">Some double-counting is likely</w:t>
+            </w:r>
+            <w:r>
+              <w:rPr>
+                <w:sz w:val="18"/>
+              </w:rPr>
+              <w:t xml:space="preserve"> and would reduce the totals</w:t>
+            </w:r>
+          </w:p>
+        </w:tc>
+      </w:tr>
+    </w:tbl>
+    <w:p>
+      <w:pPr>
+        <w:spacing w:after="0"/>
+      </w:pPr>
+    </w:p>
+    <w:p>
+      <w:pPr>
+        <w:pBdr>
+          <w:bottom w:val="single" w:sz="6" w:space="6" w:color="C9CCD1"/>
+        </w:pBdr>
+      </w:pPr>
+    </w:p>
+    <w:p>
+      <w:pPr>
+        <w:pStyle w:val="Heading1"/>
+      </w:pPr>
+      <w:r>
+        <w:t xml:space="preserve">Sensitivity</w:t>
+      </w:r>
+    </w:p>
+    <w:p>
+      <w:r>
+        <w:rPr>
+          <w:b/>
+        </w:rPr>
+        <w:t xml:space="preserve">Path B adoption (the biggest revenue line):</w:t>
+      </w:r>
+    </w:p>
+    <w:tbl>
+      <w:tblPr>
+        <w:tblW w:w="10080" w:type="dxa"/>
+        <w:tblBorders>
+          <w:top w:val="single" w:sz="4" w:space="0" w:color="C9CCD1"/>
+          <w:left w:val="single" w:sz="4" w:space="0" w:color="C9CCD1"/>
+          <w:bottom w:val="single" w:sz="4" w:space="0" w:color="C9CCD1"/>
+          <w:right w:val="single" w:sz="4" w:space="0" w:color="C9CCD1"/>
+          <w:insideH w:val="single" w:sz="4" w:space="0" w:color="C9CCD1"/>
+          <w:insideV w:val="single" w:sz="4" w:space="0" w:color="C9CCD1"/>
+        </w:tblBorders>
+        <w:tblLayout w:type="fixed"/>
+      </w:tblPr>
+      <w:tblGrid>
+        <w:gridCol w:w="1680"/>
+        <w:gridCol w:w="1680"/>
+        <w:gridCol w:w="1680"/>
+        <w:gridCol w:w="1680"/>
+        <w:gridCol w:w="1680"/>
+        <w:gridCol w:w="1680"/>
+      </w:tblGrid>
+      <w:tr>
+        <w:trPr>
+          <w:tblHeader/>
+        </w:trPr>
+        <w:tc>
+          <w:tcPr>
+            <w:tcW w:w="1680" w:type="dxa"/>
+            <w:shd w:val="clear" w:color="auto" w:fill="EFF1F3"/>
+          </w:tcPr>
+          <w:p>
+            <w:pPr>
+              <w:spacing w:before="40" w:after="40"/>
+            </w:pPr>
+            <w:r>
+              <w:rPr>
+                <w:b/>
+                <w:sz w:val="18"/>
+              </w:rPr>
+              <w:t xml:space="preserve">Adoption →</w:t>
+            </w:r>
+          </w:p>
+        </w:tc>
+        <w:tc>
+          <w:tcPr>
+            <w:tcW w:w="1680" w:type="dxa"/>
+            <w:shd w:val="clear" w:color="auto" w:fill="EFF1F3"/>
+          </w:tcPr>
+          <w:p>
+            <w:pPr>
+              <w:spacing w:before="40" w:after="40"/>
+            </w:pPr>
+            <w:r>
+              <w:rPr>
+                <w:b/>
+                <w:sz w:val="18"/>
+              </w:rPr>
+              <w:t xml:space="preserve">0.5%</w:t>
+            </w:r>
+          </w:p>
+        </w:tc>
+        <w:tc>
+          <w:tcPr>
+            <w:tcW w:w="1680" w:type="dxa"/>
+            <w:shd w:val="clear" w:color="auto" w:fill="EFF1F3"/>
+          </w:tcPr>
+          <w:p>
+            <w:pPr>
+              <w:spacing w:before="40" w:after="40"/>
+            </w:pPr>
+            <w:r>
+              <w:rPr>
+                <w:b/>
+                <w:sz w:val="18"/>
+              </w:rPr>
+              <w:t xml:space="preserve">1%</w:t>
+            </w:r>
+          </w:p>
+        </w:tc>
+        <w:tc>
+          <w:tcPr>
+            <w:tcW w:w="1680" w:type="dxa"/>
+            <w:shd w:val="clear" w:color="auto" w:fill="EFF1F3"/>
+          </w:tcPr>
+          <w:p>
+            <w:pPr>
+              <w:spacing w:before="40" w:after="40"/>
+            </w:pPr>
+            <w:r>
+              <w:rPr>
+                <w:b/>
+                <w:sz w:val="18"/>
+              </w:rPr>
+              <w:t xml:space="preserve">1.5% (base)</w:t>
+            </w:r>
+          </w:p>
+        </w:tc>
+        <w:tc>
+          <w:tcPr>
+            <w:tcW w:w="1680" w:type="dxa"/>
+            <w:shd w:val="clear" w:color="auto" w:fill="EFF1F3"/>
+          </w:tcPr>
+          <w:p>
+            <w:pPr>
+              <w:spacing w:before="40" w:after="40"/>
+            </w:pPr>
+            <w:r>
+              <w:rPr>
+                <w:b/>
+                <w:sz w:val="18"/>
+              </w:rPr>
+              <w:t xml:space="preserve">3%</w:t>
+            </w:r>
+          </w:p>
+        </w:tc>
+        <w:tc>
+          <w:tcPr>
+            <w:tcW w:w="1680" w:type="dxa"/>
+            <w:shd w:val="clear" w:color="auto" w:fill="EFF1F3"/>
+          </w:tcPr>
+          <w:p>
+            <w:pPr>
+              <w:spacing w:before="40" w:after="40"/>
+            </w:pPr>
+            <w:r>
+              <w:rPr>
+                <w:b/>
+                <w:sz w:val="18"/>
+              </w:rPr>
+              <w:t xml:space="preserve">4%</w:t>
+            </w:r>
+          </w:p>
+        </w:tc>
+      </w:tr>
+      <w:tr>
+        <w:tc>
+          <w:tcPr>
+            <w:tcW w:w="1680" w:type="dxa"/>
+          </w:tcPr>
+          <w:p>
+            <w:pPr>
+              <w:spacing w:before="40" w:after="40"/>
+            </w:pPr>
+            <w:r>
+              <w:rPr>
+                <w:sz w:val="18"/>
+              </w:rPr>
+              <w:t xml:space="preserve">Subscribers</w:t>
+            </w:r>
+          </w:p>
+        </w:tc>
+        <w:tc>
+          <w:tcPr>
+            <w:tcW w:w="1680" w:type="dxa"/>
+          </w:tcPr>
+          <w:p>
+            <w:pPr>
+              <w:spacing w:before="40" w:after="40"/>
+            </w:pPr>
+            <w:r>
+              <w:rPr>
+                <w:sz w:val="18"/>
+              </w:rPr>
+              <w:t xml:space="preserve">1,525</w:t>
+            </w:r>
+          </w:p>
+        </w:tc>
+        <w:tc>
+          <w:tcPr>
+            <w:tcW w:w="1680" w:type="dxa"/>
+          </w:tcPr>
+          <w:p>
+            <w:pPr>
+              <w:spacing w:before="40" w:after="40"/>
+            </w:pPr>
+            <w:r>
+              <w:rPr>
+                <w:sz w:val="18"/>
+              </w:rPr>
+              <w:t xml:space="preserve">3,050</w:t>
+            </w:r>
+          </w:p>
+        </w:tc>
+        <w:tc>
+          <w:tcPr>
+            <w:tcW w:w="1680" w:type="dxa"/>
+          </w:tcPr>
+          <w:p>
+            <w:pPr>
+              <w:spacing w:before="40" w:after="40"/>
+            </w:pPr>
+            <w:r>
+              <w:rPr>
+                <w:sz w:val="18"/>
+              </w:rPr>
+              <w:t xml:space="preserve">4,575</w:t>
+            </w:r>
+          </w:p>
+        </w:tc>
+        <w:tc>
+          <w:tcPr>
+            <w:tcW w:w="1680" w:type="dxa"/>
+          </w:tcPr>
+          <w:p>
+            <w:pPr>
+              <w:spacing w:before="40" w:after="40"/>
+            </w:pPr>
+            <w:r>
+              <w:rPr>
+                <w:sz w:val="18"/>
+              </w:rPr>
+              <w:t xml:space="preserve">9,150</w:t>
+            </w:r>
+          </w:p>
+        </w:tc>
+        <w:tc>
+          <w:tcPr>
+            <w:tcW w:w="1680" w:type="dxa"/>
+          </w:tcPr>
+          <w:p>
+            <w:pPr>
+              <w:spacing w:before="40" w:after="40"/>
+            </w:pPr>
+            <w:r>
+              <w:rPr>
+                <w:sz w:val="18"/>
+              </w:rPr>
+              <w:t xml:space="preserve">12,200</w:t>
+            </w:r>
+          </w:p>
+        </w:tc>
+      </w:tr>
+      <w:tr>
+        <w:tc>
+          <w:tcPr>
+            <w:tcW w:w="1680" w:type="dxa"/>
+          </w:tcPr>
+          <w:p>
+            <w:pPr>
+              <w:spacing w:before="40" w:after="40"/>
+            </w:pPr>
+            <w:r>
+              <w:rPr>
+                <w:b/>
+                <w:sz w:val="18"/>
+              </w:rPr>
+              <w:t xml:space="preserve">Revenue</w:t>
+            </w:r>
+          </w:p>
+        </w:tc>
+        <w:tc>
+          <w:tcPr>
+            <w:tcW w:w="1680" w:type="dxa"/>
+          </w:tcPr>
+          <w:p>
+            <w:pPr>
+              <w:spacing w:before="40" w:after="40"/>
+            </w:pPr>
+            <w:r>
+              <w:rPr>
+                <w:sz w:val="18"/>
+              </w:rPr>
+              <w:t xml:space="preserve">$153k</w:t>
+            </w:r>
+          </w:p>
+        </w:tc>
+        <w:tc>
+          <w:tcPr>
+            <w:tcW w:w="1680" w:type="dxa"/>
+          </w:tcPr>
+          <w:p>
+            <w:pPr>
+              <w:spacing w:before="40" w:after="40"/>
+            </w:pPr>
+            <w:r>
+              <w:rPr>
+                <w:sz w:val="18"/>
+              </w:rPr>
+              <w:t xml:space="preserve">$305k</w:t>
+            </w:r>
+          </w:p>
+        </w:tc>
+        <w:tc>
+          <w:tcPr>
+            <w:tcW w:w="1680" w:type="dxa"/>
+          </w:tcPr>
+          <w:p>
+            <w:pPr>
+              <w:spacing w:before="40" w:after="40"/>
+            </w:pPr>
+            <w:r>
+              <w:rPr>
+                <w:b/>
+                <w:sz w:val="18"/>
+              </w:rPr>
+              <w:t xml:space="preserve">$458k</w:t>
+            </w:r>
+          </w:p>
+        </w:tc>
+        <w:tc>
+          <w:tcPr>
+            <w:tcW w:w="1680" w:type="dxa"/>
+          </w:tcPr>
+          <w:p>
+            <w:pPr>
+              <w:spacing w:before="40" w:after="40"/>
+            </w:pPr>
+            <w:r>
+              <w:rPr>
+                <w:sz w:val="18"/>
+              </w:rPr>
+              <w:t xml:space="preserve">$915k</w:t>
+            </w:r>
+          </w:p>
+        </w:tc>
+        <w:tc>
+          <w:tcPr>
+            <w:tcW w:w="1680" w:type="dxa"/>
+          </w:tcPr>
+          <w:p>
+            <w:pPr>
+              <w:spacing w:before="40" w:after="40"/>
+            </w:pPr>
+            <w:r>
+              <w:rPr>
+                <w:sz w:val="18"/>
+              </w:rPr>
+              <w:t xml:space="preserve">$1.22M</w:t>
+            </w:r>
+          </w:p>
+        </w:tc>
+      </w:tr>
+    </w:tbl>
+    <w:p>
+      <w:pPr>
+        <w:spacing w:after="0"/>
+      </w:pPr>
+    </w:p>
+    <w:p>
+      <w:r>
+        <w:rPr>
+          <w:b/>
+        </w:rPr>
+        <w:t xml:space="preserve">The review multiplier (A4), at base adoption:</w:t>
+      </w:r>
+    </w:p>
+    <w:tbl>
+      <w:tblPr>
+        <w:tblW w:w="10080" w:type="dxa"/>
+        <w:tblBorders>
+          <w:top w:val="single" w:sz="4" w:space="0" w:color="C9CCD1"/>
+          <w:left w:val="single" w:sz="4" w:space="0" w:color="C9CCD1"/>
+          <w:bottom w:val="single" w:sz="4" w:space="0" w:color="C9CCD1"/>
+          <w:right w:val="single" w:sz="4" w:space="0" w:color="C9CCD1"/>
+          <w:insideH w:val="single" w:sz="4" w:space="0" w:color="C9CCD1"/>
+          <w:insideV w:val="single" w:sz="4" w:space="0" w:color="C9CCD1"/>
+        </w:tblBorders>
+        <w:tblLayout w:type="fixed"/>
+      </w:tblPr>
+      <w:tblGrid>
+        <w:gridCol w:w="2520"/>
+        <w:gridCol w:w="2520"/>
+        <w:gridCol w:w="2520"/>
+        <w:gridCol w:w="2520"/>
+      </w:tblGrid>
+      <w:tr>
+        <w:trPr>
+          <w:tblHeader/>
+        </w:trPr>
+        <w:tc>
+          <w:tcPr>
+            <w:tcW w:w="2520" w:type="dxa"/>
+            <w:shd w:val="clear" w:color="auto" w:fill="EFF1F3"/>
+          </w:tcPr>
+          <w:p>
+            <w:pPr>
+              <w:spacing w:before="40" w:after="40"/>
+            </w:pPr>
+            <w:r>
+              <w:rPr>
+                <w:b/>
+                <w:sz w:val="18"/>
+              </w:rPr>
+              <w:t xml:space="preserve">Owners per review →</w:t>
+            </w:r>
+          </w:p>
+        </w:tc>
+        <w:tc>
+          <w:tcPr>
+            <w:tcW w:w="2520" w:type="dxa"/>
+            <w:shd w:val="clear" w:color="auto" w:fill="EFF1F3"/>
+          </w:tcPr>
+          <w:p>
+            <w:pPr>
+              <w:spacing w:before="40" w:after="40"/>
+            </w:pPr>
+            <w:r>
+              <w:rPr>
+                <w:b/>
+                <w:sz w:val="18"/>
+              </w:rPr>
+              <w:t xml:space="preserve">×15</w:t>
+            </w:r>
+          </w:p>
+        </w:tc>
+        <w:tc>
+          <w:tcPr>
+            <w:tcW w:w="2520" w:type="dxa"/>
+            <w:shd w:val="clear" w:color="auto" w:fill="EFF1F3"/>
+          </w:tcPr>
+          <w:p>
+            <w:pPr>
+              <w:spacing w:before="40" w:after="40"/>
+            </w:pPr>
+            <w:r>
+              <w:rPr>
+                <w:b/>
+                <w:sz w:val="18"/>
+              </w:rPr>
+              <w:t xml:space="preserve">×30 (base)</w:t>
+            </w:r>
+          </w:p>
+        </w:tc>
+        <w:tc>
+          <w:tcPr>
+            <w:tcW w:w="2520" w:type="dxa"/>
+            <w:shd w:val="clear" w:color="auto" w:fill="EFF1F3"/>
+          </w:tcPr>
+          <w:p>
+            <w:pPr>
+              <w:spacing w:before="40" w:after="40"/>
+            </w:pPr>
+            <w:r>
+              <w:rPr>
+                <w:b/>
+                <w:sz w:val="18"/>
+              </w:rPr>
+              <w:t xml:space="preserve">×50</w:t>
+            </w:r>
+          </w:p>
+        </w:tc>
+      </w:tr>
+      <w:tr>
+        <w:tc>
+          <w:tcPr>
+            <w:tcW w:w="2520" w:type="dxa"/>
+          </w:tcPr>
+          <w:p>
+            <w:pPr>
+              <w:spacing w:before="40" w:after="40"/>
+            </w:pPr>
+            <w:r>
+              <w:rPr>
+                <w:sz w:val="18"/>
+              </w:rPr>
+              <w:t xml:space="preserve">Path B SAM</w:t>
+            </w:r>
+          </w:p>
+        </w:tc>
+        <w:tc>
+          <w:tcPr>
+            <w:tcW w:w="2520" w:type="dxa"/>
+          </w:tcPr>
+          <w:p>
+            <w:pPr>
+              <w:spacing w:before="40" w:after="40"/>
+            </w:pPr>
+            <w:r>
+              <w:rPr>
+                <w:sz w:val="18"/>
+              </w:rPr>
+              <w:t xml:space="preserve">153,000</w:t>
+            </w:r>
+          </w:p>
+        </w:tc>
+        <w:tc>
+          <w:tcPr>
+            <w:tcW w:w="2520" w:type="dxa"/>
+          </w:tcPr>
+          <w:p>
+            <w:pPr>
+              <w:spacing w:before="40" w:after="40"/>
+            </w:pPr>
+            <w:r>
+              <w:rPr>
+                <w:sz w:val="18"/>
+              </w:rPr>
+              <w:t xml:space="preserve">305,000</w:t>
+            </w:r>
+          </w:p>
+        </w:tc>
+        <w:tc>
+          <w:tcPr>
+            <w:tcW w:w="2520" w:type="dxa"/>
+          </w:tcPr>
+          <w:p>
+            <w:pPr>
+              <w:spacing w:before="40" w:after="40"/>
+            </w:pPr>
+            <w:r>
+              <w:rPr>
+                <w:sz w:val="18"/>
+              </w:rPr>
+              <w:t xml:space="preserve">509,000</w:t>
+            </w:r>
+          </w:p>
+        </w:tc>
+      </w:tr>
+      <w:tr>
+        <w:tc>
+          <w:tcPr>
+            <w:tcW w:w="2520" w:type="dxa"/>
+          </w:tcPr>
+          <w:p>
+            <w:pPr>
+              <w:spacing w:before="40" w:after="40"/>
+            </w:pPr>
+            <w:r>
+              <w:rPr>
+                <w:b/>
+                <w:sz w:val="18"/>
+              </w:rPr>
+              <w:t xml:space="preserve">Path B revenue</w:t>
+            </w:r>
+          </w:p>
+        </w:tc>
+        <w:tc>
+          <w:tcPr>
+            <w:tcW w:w="2520" w:type="dxa"/>
+          </w:tcPr>
+          <w:p>
+            <w:pPr>
+              <w:spacing w:before="40" w:after="40"/>
+            </w:pPr>
+            <w:r>
+              <w:rPr>
+                <w:sz w:val="18"/>
+              </w:rPr>
+              <w:t xml:space="preserve">$229k</w:t>
+            </w:r>
+          </w:p>
+        </w:tc>
+        <w:tc>
+          <w:tcPr>
+            <w:tcW w:w="2520" w:type="dxa"/>
+          </w:tcPr>
+          <w:p>
+            <w:pPr>
+              <w:spacing w:before="40" w:after="40"/>
+            </w:pPr>
+            <w:r>
+              <w:rPr>
+                <w:b/>
+                <w:sz w:val="18"/>
+              </w:rPr>
+              <w:t xml:space="preserve">$458k</w:t>
+            </w:r>
+          </w:p>
+        </w:tc>
+        <w:tc>
+          <w:tcPr>
+            <w:tcW w:w="2520" w:type="dxa"/>
+          </w:tcPr>
+          <w:p>
+            <w:pPr>
+              <w:spacing w:before="40" w:after="40"/>
+            </w:pPr>
+            <w:r>
+              <w:rPr>
+                <w:sz w:val="18"/>
+              </w:rPr>
+              <w:t xml:space="preserve">$764k</w:t>
+            </w:r>
+          </w:p>
+        </w:tc>
+      </w:tr>
+    </w:tbl>
+    <w:p>
+      <w:pPr>
+        <w:spacing w:after="0"/>
+      </w:pPr>
+    </w:p>
+    <w:p>
+      <w:pPr>
+        <w:pBdr>
+          <w:bottom w:val="single" w:sz="6" w:space="6" w:color="C9CCD1"/>
+        </w:pBdr>
+      </w:pPr>
+    </w:p>
+    <w:p>
+      <w:pPr>
+        <w:pStyle w:val="Heading1"/>
+      </w:pPr>
+      <w:r>
+        <w:t xml:space="preserve">What this model does *not* claim</w:t>
+      </w:r>
+    </w:p>
+    <w:p>
+      <w:pPr>
+        <w:numPr>
+          <w:ilvl w:val="0"/>
+          <w:numId w:val="1"/>
+        </w:numPr>
+      </w:pPr>
+      <w:r>
+        <w:t xml:space="preserve">No share of the sports industry, the games market or the education market. No such figure appears in the math.</w:t>
+      </w:r>
+    </w:p>
+    <w:p>
+      <w:pPr>
+        <w:numPr>
+          <w:ilvl w:val="0"/>
+          <w:numId w:val="1"/>
+        </w:numPr>
+      </w:pPr>
+      <w:r>
+        <w:t xml:space="preserve">No credit for the 554,298 NCAA athletes, the 68,000 D-I staff or Madden's console audience as addressable customers.</w:t>
+      </w:r>
+    </w:p>
+    <w:p>
+      <w:pPr>
+        <w:numPr>
+          <w:ilvl w:val="0"/>
+          <w:numId w:val="1"/>
+        </w:numPr>
+      </w:pPr>
+      <w:r>
+        <w:t xml:space="preserve">No advertising, data-licensing or agency-recruiting revenue.</w:t>
+      </w:r>
+    </w:p>
+    <w:p>
+      <w:pPr>
+        <w:numPr>
+          <w:ilvl w:val="0"/>
+          <w:numId w:val="1"/>
+        </w:numPr>
+      </w:pPr>
+      <w:r>
+        <w:rPr>
+          <w:b/>
+        </w:rPr>
+        <w:t xml:space="preserve">No revenue from the credential itself</w:t>
+      </w:r>
+      <w:r>
+        <w:t xml:space="preserve"> — no evidence exists that any employer would pay for or accept it (Section 3).</w:t>
+      </w:r>
+    </w:p>
+    <w:p>
+      <w:pPr>
+        <w:pStyle w:val="Heading1"/>
+      </w:pPr>
+      <w:r>
+        <w:t xml:space="preserve">The summary an investor will hear</w:t>
+      </w:r>
+    </w:p>
+    <w:p>
+      <w:r>
+        <w:rPr>
+          <w:b/>
+        </w:rPr>
+        <w:t xml:space="preserve">At $100/year this is a ~$660,000/year business at base case, and under $1.8M even when everything goes right.</w:t>
+      </w:r>
+      <w:r>
+        <w:t xml:space="preserve"> The reason is not conversion — it is that fewer than half a million Americans demonstrably care about simulated front-office deal-making, and the 441 institutions that teach the subject are the only concentrated buyer.</w:t>
+      </w:r>
+    </w:p>
+    <w:p>
+      <w:r>
+        <w:rPr>
+          <w:b/>
+        </w:rPr>
+        <w:t xml:space="preserve">Two changes would alter the answer, and both are decisions rather than research findings:</w:t>
+      </w:r>
+      <w:r>
+        <w:t xml:space="preserve"> price it as professional training rather than a game ($400/yr changes the base case to ~$2.2M), or sell the institutional licence hard, where 30% of all US programs equals the entire current base case.</w:t>
+      </w:r>
+    </w:p>
+    <w:p>
+      <w:pPr>
+        <w:pStyle w:val="Heading1"/>
+      </w:pPr>
+      <w:r>
+        <w:t xml:space="preserve">Flags</w:t>
+      </w:r>
+    </w:p>
+    <w:tbl>
+      <w:tblPr>
+        <w:tblW w:w="10080" w:type="dxa"/>
+        <w:tblBorders>
+          <w:top w:val="single" w:sz="4" w:space="0" w:color="C9CCD1"/>
+          <w:left w:val="single" w:sz="4" w:space="0" w:color="C9CCD1"/>
+          <w:bottom w:val="single" w:sz="4" w:space="0" w:color="C9CCD1"/>
+          <w:right w:val="single" w:sz="4" w:space="0" w:color="C9CCD1"/>
+          <w:insideH w:val="single" w:sz="4" w:space="0" w:color="C9CCD1"/>
+          <w:insideV w:val="single" w:sz="4" w:space="0" w:color="C9CCD1"/>
+        </w:tblBorders>
+        <w:tblLayout w:type="fixed"/>
+      </w:tblPr>
+      <w:tblGrid>
+        <w:gridCol w:w="5040"/>
+        <w:gridCol w:w="5040"/>
+      </w:tblGrid>
+      <w:tr>
+        <w:trPr>
+          <w:tblHeader/>
+        </w:trPr>
+        <w:tc>
+          <w:tcPr>
+            <w:tcW w:w="5040" w:type="dxa"/>
+            <w:shd w:val="clear" w:color="auto" w:fill="EFF1F3"/>
+          </w:tcPr>
+          <w:p>
+            <w:pPr>
+              <w:spacing w:before="40" w:after="40"/>
+            </w:pPr>
+            <w:r>
+              <w:rPr>
+                <w:b/>
+                <w:sz w:val="18"/>
+              </w:rPr>
+              <w:t xml:space="preserve">Item</w:t>
+            </w:r>
+          </w:p>
+        </w:tc>
+        <w:tc>
+          <w:tcPr>
+            <w:tcW w:w="5040" w:type="dxa"/>
+            <w:shd w:val="clear" w:color="auto" w:fill="EFF1F3"/>
+          </w:tcPr>
+          <w:p>
+            <w:pPr>
+              <w:spacing w:before="40" w:after="40"/>
+            </w:pPr>
+            <w:r>
+              <w:rPr>
+                <w:b/>
+                <w:sz w:val="18"/>
+              </w:rPr>
+              <w:t xml:space="preserve">Status</w:t>
+            </w:r>
+          </w:p>
+        </w:tc>
+      </w:tr>
+      <w:tr>
+        <w:tc>
+          <w:tcPr>
+            <w:tcW w:w="5040" w:type="dxa"/>
+          </w:tcPr>
+          <w:p>
+            <w:pPr>
+              <w:spacing w:before="40" w:after="40"/>
+            </w:pPr>
+            <w:r>
+              <w:rPr>
+                <w:sz w:val="18"/>
+              </w:rPr>
+              <w:t xml:space="preserve">Degrees per year (16,971)</w:t>
+            </w:r>
+          </w:p>
+        </w:tc>
+        <w:tc>
+          <w:tcPr>
+            <w:tcW w:w="5040" w:type="dxa"/>
+          </w:tcPr>
+          <w:p>
+            <w:pPr>
+              <w:spacing w:before="40" w:after="40"/>
+            </w:pPr>
+            <w:r>
+              <w:rPr>
+                <w:sz w:val="18"/>
+              </w:rPr>
+              <w:t xml:space="preserve">⚠️ </w:t>
+            </w:r>
+            <w:r>
+              <w:rPr>
+                <w:b/>
+                <w:sz w:val="18"/>
+              </w:rPr>
+              <w:t xml:space="preserve">2020–21 data.</w:t>
+            </w:r>
+            <w:r>
+              <w:rPr>
+                <w:sz w:val="18"/>
+              </w:rPr>
+              <w:t xml:space="preserve"> Five years stale; NCES blocks automated access.</w:t>
+            </w:r>
+          </w:p>
+        </w:tc>
+      </w:tr>
+      <w:tr>
+        <w:tc>
+          <w:tcPr>
+            <w:tcW w:w="5040" w:type="dxa"/>
+          </w:tcPr>
+          <w:p>
+            <w:pPr>
+              <w:spacing w:before="40" w:after="40"/>
+            </w:pPr>
+            <w:r>
+              <w:rPr>
+                <w:sz w:val="18"/>
+              </w:rPr>
+              <w:t xml:space="preserve">Enrolled pipeline (×4) and career-intent share (30%)</w:t>
+            </w:r>
+          </w:p>
+        </w:tc>
+        <w:tc>
+          <w:tcPr>
+            <w:tcW w:w="5040" w:type="dxa"/>
+          </w:tcPr>
+          <w:p>
+            <w:pPr>
+              <w:spacing w:before="40" w:after="40"/>
+            </w:pPr>
+            <w:r>
+              <w:rPr>
+                <w:rFonts w:ascii="Consolas" w:hAnsi="Consolas"/>
+                <w:sz w:val="18"/>
+              </w:rPr>
+              <w:t xml:space="preserve">[UNVERIFIED]</w:t>
+            </w:r>
+            <w:r>
+              <w:rPr>
+                <w:sz w:val="18"/>
+              </w:rPr>
+              <w:t xml:space="preserve"> — both are my judgment, and together they set Path A.</w:t>
+            </w:r>
+          </w:p>
+        </w:tc>
+      </w:tr>
+      <w:tr>
+        <w:tc>
+          <w:tcPr>
+            <w:tcW w:w="5040" w:type="dxa"/>
+          </w:tcPr>
+          <w:p>
+            <w:pPr>
+              <w:spacing w:before="40" w:after="40"/>
+            </w:pPr>
+            <w:r>
+              <w:rPr>
+                <w:sz w:val="18"/>
+              </w:rPr>
+              <w:t xml:space="preserve">Steam review multiplier (×30)</w:t>
+            </w:r>
+          </w:p>
+        </w:tc>
+        <w:tc>
+          <w:tcPr>
+            <w:tcW w:w="5040" w:type="dxa"/>
+          </w:tcPr>
+          <w:p>
+            <w:pPr>
+              <w:spacing w:before="40" w:after="40"/>
+            </w:pPr>
+            <w:r>
+              <w:rPr>
+                <w:rFonts w:ascii="Consolas" w:hAnsi="Consolas"/>
+                <w:sz w:val="18"/>
+              </w:rPr>
+              <w:t xml:space="preserve">[UNVERIFIED]</w:t>
+            </w:r>
+            <w:r>
+              <w:rPr>
+                <w:sz w:val="18"/>
+              </w:rPr>
+              <w:t xml:space="preserve"> — an industry heuristic, not a measurement, and the softest number in the model.</w:t>
+            </w:r>
+          </w:p>
+        </w:tc>
+      </w:tr>
+      <w:tr>
+        <w:tc>
+          <w:tcPr>
+            <w:tcW w:w="5040" w:type="dxa"/>
+          </w:tcPr>
+          <w:p>
+            <w:pPr>
+              <w:spacing w:before="40" w:after="40"/>
+            </w:pPr>
+            <w:r>
+              <w:rPr>
+                <w:sz w:val="18"/>
+              </w:rPr>
+              <w:t xml:space="preserve">Adoption rates</w:t>
+            </w:r>
+          </w:p>
+        </w:tc>
+        <w:tc>
+          <w:tcPr>
+            <w:tcW w:w="5040" w:type="dxa"/>
+          </w:tcPr>
+          <w:p>
+            <w:pPr>
+              <w:spacing w:before="40" w:after="40"/>
+            </w:pPr>
+            <w:r>
+              <w:rPr>
+                <w:rFonts w:ascii="Consolas" w:hAnsi="Consolas"/>
+                <w:sz w:val="18"/>
+              </w:rPr>
+              <w:t xml:space="preserve">[UNVERIFIED]</w:t>
+            </w:r>
+            <w:r>
+              <w:rPr>
+                <w:sz w:val="18"/>
+              </w:rPr>
+              <w:t xml:space="preserve"> — </w:t>
+            </w:r>
+            <w:r>
+              <w:rPr>
+                <w:b/>
+                <w:sz w:val="18"/>
+              </w:rPr>
+              <w:t xml:space="preserve">no comparable paid negotiation-practice product exists to calibrate against.</w:t>
+            </w:r>
+          </w:p>
+        </w:tc>
+      </w:tr>
+      <w:tr>
+        <w:tc>
+          <w:tcPr>
+            <w:tcW w:w="5040" w:type="dxa"/>
+          </w:tcPr>
+          <w:p>
+            <w:pPr>
+              <w:spacing w:before="40" w:after="40"/>
+            </w:pPr>
+            <w:r>
+              <w:rPr>
+                <w:sz w:val="18"/>
+              </w:rPr>
+              <w:t xml:space="preserve">Path overlap</w:t>
+            </w:r>
+          </w:p>
+        </w:tc>
+        <w:tc>
+          <w:tcPr>
+            <w:tcW w:w="5040" w:type="dxa"/>
+          </w:tcPr>
+          <w:p>
+            <w:pPr>
+              <w:spacing w:before="40" w:after="40"/>
+            </w:pPr>
+            <w:r>
+              <w:rPr>
+                <w:sz w:val="18"/>
+              </w:rPr>
+              <w:t xml:space="preserve">⚠️ A student can be an enthusiast; some double-counting is likely.</w:t>
+            </w:r>
+          </w:p>
+        </w:tc>
+      </w:tr>
+      <w:tr>
+        <w:tc>
+          <w:tcPr>
+            <w:tcW w:w="5040" w:type="dxa"/>
+          </w:tcPr>
+          <w:p>
+            <w:pPr>
+              <w:spacing w:before="40" w:after="40"/>
+            </w:pPr>
+            <w:r>
+              <w:rPr>
+                <w:sz w:val="18"/>
+              </w:rPr>
+              <w:t xml:space="preserve">Seats per program (40)</w:t>
+            </w:r>
+          </w:p>
+        </w:tc>
+        <w:tc>
+          <w:tcPr>
+            <w:tcW w:w="5040" w:type="dxa"/>
+          </w:tcPr>
+          <w:p>
+            <w:pPr>
+              <w:spacing w:before="40" w:after="40"/>
+            </w:pPr>
+            <w:r>
+              <w:rPr>
+                <w:rFonts w:ascii="Consolas" w:hAnsi="Consolas"/>
+                <w:sz w:val="18"/>
+              </w:rPr>
+              <w:t xml:space="preserve">[UNVERIFIED]</w:t>
+            </w:r>
+            <w:r>
+              <w:rPr>
+                <w:sz w:val="18"/>
+              </w:rPr>
+              <w:t xml:space="preserve">.</w:t>
+            </w:r>
+          </w:p>
+        </w:tc>
+      </w:tr>
+      <w:tr>
+        <w:tc>
+          <w:tcPr>
+            <w:tcW w:w="5040" w:type="dxa"/>
+          </w:tcPr>
+          <w:p>
+            <w:pPr>
+              <w:spacing w:before="40" w:after="40"/>
+            </w:pPr>
+            <w:r>
+              <w:rPr>
+                <w:sz w:val="18"/>
+              </w:rPr>
+              <w:t xml:space="preserve">Whether programs buy software at all</w:t>
+            </w:r>
+          </w:p>
+        </w:tc>
+        <w:tc>
+          <w:tcPr>
+            <w:tcW w:w="5040" w:type="dxa"/>
+          </w:tcPr>
+          <w:p>
+            <w:pPr>
+              <w:spacing w:before="40" w:after="40"/>
+            </w:pPr>
+            <w:r>
+              <w:rPr>
+                <w:sz w:val="18"/>
+              </w:rPr>
+              <w:t xml:space="preserve">❌ Not researched. 441 named institutions makes this the cheapest thing to test.</w:t>
+            </w:r>
+          </w:p>
+        </w:tc>
+      </w:tr>
+      <w:tr>
+        <w:tc>
+          <w:tcPr>
+            <w:tcW w:w="5040" w:type="dxa"/>
+          </w:tcPr>
+          <w:p>
+            <w:pPr>
+              <w:spacing w:before="40" w:after="40"/>
+            </w:pPr>
+            <w:r>
+              <w:rPr>
+                <w:sz w:val="18"/>
+              </w:rPr>
+              <w:t xml:space="preserve">Whether employers accept a simulator credential</w:t>
+            </w:r>
+          </w:p>
+        </w:tc>
+        <w:tc>
+          <w:tcPr>
+            <w:tcW w:w="5040" w:type="dxa"/>
+          </w:tcPr>
+          <w:p>
+            <w:pPr>
+              <w:spacing w:before="40" w:after="40"/>
+            </w:pPr>
+            <w:r>
+              <w:rPr>
+                <w:sz w:val="18"/>
+              </w:rPr>
+              <w:t xml:space="preserve">❌ No evidence found (Section 3), and no revenue is modeled from it.</w:t>
             </w:r>
           </w:p>
         </w:tc>

</xml_diff>

<commit_message>
Add adversarial test of the AI counterparty claim
Co-Authored-By: Claude Opus 5 <noreply@anthropic.com>
</commit_message>
<xml_diff>
--- a/12_SportsNegotiationApp/ResearchAgents/SportsNegotiationApp_Research.docx
+++ b/12_SportsNegotiationApp/ResearchAgents/SportsNegotiationApp_Research.docx
@@ -104,6 +104,17 @@
       </w:pPr>
       <w:r>
         <w:t xml:space="preserve">Section 4 — Bottom-Up Market Size: three separate customer populations at $100/year, with conservative, base and optimistic cases and every assumption stated. *(Added Sept 25, 2026)*</w:t>
+      </w:r>
+    </w:p>
+    <w:p>
+      <w:pPr>
+        <w:numPr>
+          <w:ilvl w:val="0"/>
+          <w:numId w:val="1"/>
+        </w:numPr>
+      </w:pPr>
+      <w:r>
+        <w:t xml:space="preserve">Section 5 — Testing the "Newly Possible" Claim: evidence for and against, both counterarguments argued at full strength, and the narrowed claim that survives. *(Added Sept 25, 2026)*</w:t>
       </w:r>
     </w:p>
     <w:p>
@@ -13814,6 +13825,1708 @@
                 <w:sz w:val="18"/>
               </w:rPr>
               <w:t xml:space="preserve">❌ No evidence found (Section 3), and no revenue is modeled from it.</w:t>
+            </w:r>
+          </w:p>
+        </w:tc>
+      </w:tr>
+    </w:tbl>
+    <w:p>
+      <w:pPr>
+        <w:spacing w:after="0"/>
+      </w:pPr>
+    </w:p>
+    <w:p>
+      <w:r>
+        <w:br w:type="page"/>
+      </w:r>
+    </w:p>
+    <w:p>
+      <w:pPr>
+        <w:pStyle w:val="Title"/>
+      </w:pPr>
+      <w:r>
+        <w:t xml:space="preserve">Testing the Claim: "AI Can Now Be a Counterparty That Models the Other Side's Interests"</w:t>
+      </w:r>
+    </w:p>
+    <w:p>
+      <w:r>
+        <w:rPr>
+          <w:b/>
+        </w:rPr>
+        <w:t xml:space="preserve">Prepared:</w:t>
+      </w:r>
+      <w:r>
+        <w:t xml:space="preserve"> September 25, 2026</w:t>
+      </w:r>
+    </w:p>
+    <w:p>
+      <w:r>
+        <w:rPr>
+          <w:b/>
+        </w:rPr>
+        <w:t xml:space="preserve">Window searched:</w:t>
+      </w:r>
+      <w:r>
+        <w:t xml:space="preserve"> March 2025 – September 2026, plus the historical record needed to test counterargument 1.</w:t>
+      </w:r>
+    </w:p>
+    <w:p>
+      <w:pPr>
+        <w:pStyle w:val="Heading1"/>
+      </w:pPr>
+      <w:r>
+        <w:t xml:space="preserve">The claim, stated precisely</w:t>
+      </w:r>
+    </w:p>
+    <w:p>
+      <w:pPr>
+        <w:ind w:left="360"/>
+        <w:pBdr>
+          <w:left w:val="single" w:sz="18" w:space="8" w:color="9AA0A6"/>
+        </w:pBdr>
+      </w:pPr>
+      <w:r>
+        <w:t xml:space="preserve">A sports negotiation app is </w:t>
+      </w:r>
+      <w:r>
+        <w:rPr>
+          <w:b/>
+        </w:rPr>
+        <w:t xml:space="preserve">newly possible</w:t>
+      </w:r>
+      <w:r>
+        <w:t xml:space="preserve"> because AI can act as a counterparty that </w:t>
+      </w:r>
+      <w:r>
+        <w:rPr>
+          <w:b/>
+        </w:rPr>
+        <w:t xml:space="preserve">actually models the other side's interests</w:t>
+      </w:r>
+      <w:r>
+        <w:t xml:space="preserve"> — pushing back, holding firm, or walking away — instead of resolving on a hidden dice roll as existing sports games do.</w:t>
+      </w:r>
+    </w:p>
+    <w:p>
+      <w:r>
+        <w:rPr>
+          <w:b/>
+        </w:rPr>
+        <w:t xml:space="preserve">Verdict up front: the capability was demonstrated in 2022, and the one failure mode that would destroy this product — conceding under pressure — is still measurable in frontier models today.</w:t>
+      </w:r>
+      <w:r>
+        <w:t xml:space="preserve"> What changed is cost and accessibility, not capability. The narrowed claim is at the end.</w:t>
+      </w:r>
+    </w:p>
+    <w:p>
+      <w:pPr>
+        <w:pBdr>
+          <w:bottom w:val="single" w:sz="6" w:space="6" w:color="C9CCD1"/>
+        </w:pBdr>
+      </w:pPr>
+    </w:p>
+    <w:p>
+      <w:pPr>
+        <w:pStyle w:val="Heading1"/>
+      </w:pPr>
+      <w:r>
+        <w:t xml:space="preserve">Part 1 — Evidence FOR</w:t>
+      </w:r>
+    </w:p>
+    <w:p>
+      <w:pPr>
+        <w:pStyle w:val="Heading2"/>
+      </w:pPr>
+      <w:r>
+        <w:t xml:space="preserve">1a. Negotiation is now a measured capability, not a hope</w:t>
+      </w:r>
+    </w:p>
+    <w:tbl>
+      <w:tblPr>
+        <w:tblW w:w="10080" w:type="dxa"/>
+        <w:tblBorders>
+          <w:top w:val="single" w:sz="4" w:space="0" w:color="C9CCD1"/>
+          <w:left w:val="single" w:sz="4" w:space="0" w:color="C9CCD1"/>
+          <w:bottom w:val="single" w:sz="4" w:space="0" w:color="C9CCD1"/>
+          <w:right w:val="single" w:sz="4" w:space="0" w:color="C9CCD1"/>
+          <w:insideH w:val="single" w:sz="4" w:space="0" w:color="C9CCD1"/>
+          <w:insideV w:val="single" w:sz="4" w:space="0" w:color="C9CCD1"/>
+        </w:tblBorders>
+        <w:tblLayout w:type="fixed"/>
+      </w:tblPr>
+      <w:tblGrid>
+        <w:gridCol w:w="5040"/>
+        <w:gridCol w:w="5040"/>
+      </w:tblGrid>
+      <w:tr>
+        <w:trPr>
+          <w:tblHeader/>
+        </w:trPr>
+        <w:tc>
+          <w:tcPr>
+            <w:tcW w:w="5040" w:type="dxa"/>
+            <w:shd w:val="clear" w:color="auto" w:fill="EFF1F3"/>
+          </w:tcPr>
+          <w:p>
+            <w:pPr>
+              <w:spacing w:before="40" w:after="40"/>
+            </w:pPr>
+            <w:r>
+              <w:rPr>
+                <w:b/>
+                <w:sz w:val="18"/>
+              </w:rPr>
+              <w:t xml:space="preserve">Finding</w:t>
+            </w:r>
+          </w:p>
+        </w:tc>
+        <w:tc>
+          <w:tcPr>
+            <w:tcW w:w="5040" w:type="dxa"/>
+            <w:shd w:val="clear" w:color="auto" w:fill="EFF1F3"/>
+          </w:tcPr>
+          <w:p>
+            <w:pPr>
+              <w:spacing w:before="40" w:after="40"/>
+            </w:pPr>
+            <w:r>
+              <w:rPr>
+                <w:b/>
+                <w:sz w:val="18"/>
+              </w:rPr>
+              <w:t xml:space="preserve">Source</w:t>
+            </w:r>
+          </w:p>
+        </w:tc>
+      </w:tr>
+      <w:tr>
+        <w:tc>
+          <w:tcPr>
+            <w:tcW w:w="5040" w:type="dxa"/>
+          </w:tcPr>
+          <w:p>
+            <w:pPr>
+              <w:spacing w:before="40" w:after="40"/>
+            </w:pPr>
+            <w:r>
+              <w:rPr>
+                <w:sz w:val="18"/>
+              </w:rPr>
+              <w:t xml:space="preserve">Benchmarks exist specifically for multi-turn bargaining with private reservation values and welfare scoring — </w:t>
+            </w:r>
+            <w:r>
+              <w:rPr>
+                <w:b/>
+                <w:sz w:val="18"/>
+              </w:rPr>
+              <w:t xml:space="preserve">NegotiationArena</w:t>
+            </w:r>
+            <w:r>
+              <w:rPr>
+                <w:sz w:val="18"/>
+              </w:rPr>
+              <w:t xml:space="preserve">, </w:t>
+            </w:r>
+            <w:r>
+              <w:rPr>
+                <w:b/>
+                <w:sz w:val="18"/>
+              </w:rPr>
+              <w:t xml:space="preserve">BargainArena</w:t>
+            </w:r>
+          </w:p>
+        </w:tc>
+        <w:tc>
+          <w:tcPr>
+            <w:tcW w:w="5040" w:type="dxa"/>
+          </w:tcPr>
+          <w:p>
+            <w:pPr>
+              <w:spacing w:before="40" w:after="40"/>
+            </w:pPr>
+            <w:hyperlink r:id="rHl20">
+              <w:r>
+                <w:rPr>
+                  <w:rStyle w:val="Hyperlink"/>
+                  <w:sz w:val="18"/>
+                </w:rPr>
+                <w:t xml:space="preserve">Measuring Bargaining Abilities of LLMs</w:t>
+              </w:r>
+            </w:hyperlink>
+          </w:p>
+        </w:tc>
+      </w:tr>
+      <w:tr>
+        <w:tc>
+          <w:tcPr>
+            <w:tcW w:w="5040" w:type="dxa"/>
+          </w:tcPr>
+          <w:p>
+            <w:pPr>
+              <w:spacing w:before="40" w:after="40"/>
+            </w:pPr>
+            <w:r>
+              <w:rPr>
+                <w:sz w:val="18"/>
+              </w:rPr>
+              <w:t xml:space="preserve">Models have </w:t>
+            </w:r>
+            <w:r>
+              <w:rPr>
+                <w:b/>
+                <w:sz w:val="18"/>
+              </w:rPr>
+              <w:t xml:space="preserve">distinguishable negotiating styles</w:t>
+            </w:r>
+            <w:r>
+              <w:rPr>
+                <w:sz w:val="18"/>
+              </w:rPr>
+              <w:t xml:space="preserve">: Claude-3 skews aggressive, GPT-4 splits fairly, Llama-3 strikes the most effective bargains</w:t>
+            </w:r>
+          </w:p>
+        </w:tc>
+        <w:tc>
+          <w:tcPr>
+            <w:tcW w:w="5040" w:type="dxa"/>
+          </w:tcPr>
+          <w:p>
+            <w:pPr>
+              <w:spacing w:before="40" w:after="40"/>
+            </w:pPr>
+            <w:hyperlink r:id="rHl20">
+              <w:r>
+                <w:rPr>
+                  <w:rStyle w:val="Hyperlink"/>
+                  <w:sz w:val="18"/>
+                </w:rPr>
+                <w:t xml:space="preserve">Same benchmark paper</w:t>
+              </w:r>
+            </w:hyperlink>
+          </w:p>
+        </w:tc>
+      </w:tr>
+      <w:tr>
+        <w:tc>
+          <w:tcPr>
+            <w:tcW w:w="5040" w:type="dxa"/>
+          </w:tcPr>
+          <w:p>
+            <w:pPr>
+              <w:spacing w:before="40" w:after="40"/>
+            </w:pPr>
+            <w:r>
+              <w:rPr>
+                <w:sz w:val="18"/>
+              </w:rPr>
+              <w:t xml:space="preserve">Active 2025–26 research on diagnosing negotiation agents beyond win rate</w:t>
+            </w:r>
+          </w:p>
+        </w:tc>
+        <w:tc>
+          <w:tcPr>
+            <w:tcW w:w="5040" w:type="dxa"/>
+          </w:tcPr>
+          <w:p>
+            <w:pPr>
+              <w:spacing w:before="40" w:after="40"/>
+            </w:pPr>
+            <w:hyperlink r:id="rHl21">
+              <w:r>
+                <w:rPr>
+                  <w:rStyle w:val="Hyperlink"/>
+                  <w:sz w:val="18"/>
+                </w:rPr>
+                <w:t xml:space="preserve">Diagnosing LLM Negotiation Agents Beyond Deal Rate</w:t>
+              </w:r>
+            </w:hyperlink>
+            <w:r>
+              <w:rPr>
+                <w:sz w:val="18"/>
+              </w:rPr>
+              <w:t xml:space="preserve">; </w:t>
+            </w:r>
+            <w:hyperlink r:id="rHl49">
+              <w:r>
+                <w:rPr>
+                  <w:rStyle w:val="Hyperlink"/>
+                  <w:sz w:val="18"/>
+                </w:rPr>
+                <w:t xml:space="preserve">MERIT, ACL 2026</w:t>
+              </w:r>
+            </w:hyperlink>
+          </w:p>
+        </w:tc>
+      </w:tr>
+    </w:tbl>
+    <w:p>
+      <w:pPr>
+        <w:spacing w:after="0"/>
+      </w:pPr>
+    </w:p>
+    <w:p>
+      <w:r>
+        <w:rPr>
+          <w:b/>
+        </w:rPr>
+        <w:t xml:space="preserve">Five years ago you could not have measured whether your counterparty was any good. Now you can</w:t>
+      </w:r>
+      <w:r>
+        <w:t xml:space="preserve"> — and that matters more for a training product than raw capability does.</w:t>
+      </w:r>
+    </w:p>
+    <w:p>
+      <w:pPr>
+        <w:pStyle w:val="Heading2"/>
+      </w:pPr>
+      <w:r>
+        <w:t xml:space="preserve">1b. Somebody is already selling practice-against-an-AI, with money behind it</w:t>
+      </w:r>
+    </w:p>
+    <w:p>
+      <w:pPr>
+        <w:numPr>
+          <w:ilvl w:val="0"/>
+          <w:numId w:val="1"/>
+        </w:numPr>
+      </w:pPr>
+      <w:r>
+        <w:rPr>
+          <w:b/>
+        </w:rPr>
+        <w:t xml:space="preserve">Hyperbound: $15M Series A, September 2025</w:t>
+      </w:r>
+      <w:r>
+        <w:t xml:space="preserve"> (Peak XV), running AI personas trained on </w:t>
+      </w:r>
+      <w:r>
+        <w:rPr>
+          <w:b/>
+        </w:rPr>
+        <w:t xml:space="preserve">2M+ hours of real B2B call data</w:t>
+      </w:r>
+      <w:r>
+        <w:t xml:space="preserve">, with multiparty deal scenarios and scorecards. (</w:t>
+      </w:r>
+      <w:hyperlink r:id="rHl19">
+        <w:r>
+          <w:rPr>
+            <w:rStyle w:val="Hyperlink"/>
+          </w:rPr>
+          <w:t xml:space="preserve">Hyperbound</w:t>
+        </w:r>
+      </w:hyperlink>
+      <w:r>
+        <w:t xml:space="preserve">)</w:t>
+      </w:r>
+    </w:p>
+    <w:p>
+      <w:pPr>
+        <w:numPr>
+          <w:ilvl w:val="0"/>
+          <w:numId w:val="1"/>
+        </w:numPr>
+      </w:pPr>
+      <w:r>
+        <w:rPr>
+          <w:b/>
+        </w:rPr>
+        <w:t xml:space="preserve">Second Nature: $22M Series B, October 2025.</w:t>
+      </w:r>
+      <w:r>
+        <w:t xml:space="preserve"> (</w:t>
+      </w:r>
+      <w:hyperlink r:id="rHl18">
+        <w:r>
+          <w:rPr>
+            <w:rStyle w:val="Hyperlink"/>
+          </w:rPr>
+          <w:t xml:space="preserve">Yahoo Finance</w:t>
+        </w:r>
+      </w:hyperlink>
+      <w:r>
+        <w:t xml:space="preserve">)</w:t>
+      </w:r>
+    </w:p>
+    <w:p>
+      <w:r>
+        <w:rPr>
+          <w:b/>
+        </w:rPr>
+        <w:t xml:space="preserve">The mechanic your product depends on is a funded category — in sales.</w:t>
+      </w:r>
+    </w:p>
+    <w:p>
+      <w:pPr>
+        <w:pStyle w:val="Heading2"/>
+      </w:pPr>
+      <w:r>
+        <w:t xml:space="preserve">1c. The inputs a counterparty needs are public</w:t>
+      </w:r>
+    </w:p>
+    <w:p>
+      <w:r>
+        <w:t xml:space="preserve">Spotrac publishes contract structures at </w:t>
+      </w:r>
+      <w:r>
+        <w:rPr>
+          <w:b/>
+        </w:rPr>
+        <w:t xml:space="preserve">$30/year</w:t>
+      </w:r>
+      <w:r>
+        <w:t xml:space="preserve">, Over The Cap publishes NFL cap positions, and the league CBAs are public documents. </w:t>
+      </w:r>
+      <w:r>
+        <w:rPr>
+          <w:b/>
+        </w:rPr>
+        <w:t xml:space="preserve">A simulated GM's reservation value can be grounded in real data without licensing anything</w:t>
+      </w:r>
+      <w:r>
+        <w:t xml:space="preserve"> — unlike player likenesses, which is what constrains the games.</w:t>
+      </w:r>
+    </w:p>
+    <w:p>
+      <w:pPr>
+        <w:pStyle w:val="Heading2"/>
+      </w:pPr>
+      <w:r>
+        <w:t xml:space="preserve">1d. The incumbents' failure is not a capability failure</w:t>
+      </w:r>
+    </w:p>
+    <w:p>
+      <w:r>
+        <w:t xml:space="preserve">Section 3 showed Front Office Football Nine </w:t>
+      </w:r>
+      <w:r>
+        <w:rPr>
+          <w:b/>
+        </w:rPr>
+        <w:t xml:space="preserve">won't let a user construct a trade at all</w:t>
+      </w:r>
+      <w:r>
+        <w:t xml:space="preserve">, and Football Manager conducts negotiation </w:t>
+      </w:r>
+      <w:r>
+        <w:rPr>
+          <w:b/>
+        </w:rPr>
+        <w:t xml:space="preserve">by text message</w:t>
+      </w:r>
+      <w:r>
+        <w:t xml:space="preserve">. Those are 2023–2025 design decisions, not technical limits. </w:t>
+      </w:r>
+      <w:r>
+        <w:rPr>
+          <w:b/>
+        </w:rPr>
+        <w:t xml:space="preserve">The bar you are clearing is low.</w:t>
+      </w:r>
+    </w:p>
+    <w:p>
+      <w:pPr>
+        <w:pBdr>
+          <w:bottom w:val="single" w:sz="6" w:space="6" w:color="C9CCD1"/>
+        </w:pBdr>
+      </w:pPr>
+    </w:p>
+    <w:p>
+      <w:pPr>
+        <w:pStyle w:val="Heading1"/>
+      </w:pPr>
+      <w:r>
+        <w:t xml:space="preserve">Part 2 — Evidence AGAINST</w:t>
+      </w:r>
+    </w:p>
+    <w:p>
+      <w:pPr>
+        <w:pStyle w:val="Heading2"/>
+      </w:pPr>
+      <w:r>
+        <w:t xml:space="preserve">2a. The measured failure mode is exactly "caves under pressure"</w:t>
+      </w:r>
+    </w:p>
+    <w:p>
+      <w:r>
+        <w:t xml:space="preserve">This is the strongest counter-evidence in the file, because it targets the specific verb in the claim — *hold firm*.</w:t>
+      </w:r>
+    </w:p>
+    <w:tbl>
+      <w:tblPr>
+        <w:tblW w:w="10080" w:type="dxa"/>
+        <w:tblBorders>
+          <w:top w:val="single" w:sz="4" w:space="0" w:color="C9CCD1"/>
+          <w:left w:val="single" w:sz="4" w:space="0" w:color="C9CCD1"/>
+          <w:bottom w:val="single" w:sz="4" w:space="0" w:color="C9CCD1"/>
+          <w:right w:val="single" w:sz="4" w:space="0" w:color="C9CCD1"/>
+          <w:insideH w:val="single" w:sz="4" w:space="0" w:color="C9CCD1"/>
+          <w:insideV w:val="single" w:sz="4" w:space="0" w:color="C9CCD1"/>
+        </w:tblBorders>
+        <w:tblLayout w:type="fixed"/>
+      </w:tblPr>
+      <w:tblGrid>
+        <w:gridCol w:w="5040"/>
+        <w:gridCol w:w="5040"/>
+      </w:tblGrid>
+      <w:tr>
+        <w:trPr>
+          <w:tblHeader/>
+        </w:trPr>
+        <w:tc>
+          <w:tcPr>
+            <w:tcW w:w="5040" w:type="dxa"/>
+            <w:shd w:val="clear" w:color="auto" w:fill="EFF1F3"/>
+          </w:tcPr>
+          <w:p>
+            <w:pPr>
+              <w:spacing w:before="40" w:after="40"/>
+            </w:pPr>
+            <w:r>
+              <w:rPr>
+                <w:b/>
+                <w:sz w:val="18"/>
+              </w:rPr>
+              <w:t xml:space="preserve">Finding</w:t>
+            </w:r>
+          </w:p>
+        </w:tc>
+        <w:tc>
+          <w:tcPr>
+            <w:tcW w:w="5040" w:type="dxa"/>
+            <w:shd w:val="clear" w:color="auto" w:fill="EFF1F3"/>
+          </w:tcPr>
+          <w:p>
+            <w:pPr>
+              <w:spacing w:before="40" w:after="40"/>
+            </w:pPr>
+            <w:r>
+              <w:rPr>
+                <w:b/>
+                <w:sz w:val="18"/>
+              </w:rPr>
+              <w:t xml:space="preserve">Source</w:t>
+            </w:r>
+          </w:p>
+        </w:tc>
+      </w:tr>
+      <w:tr>
+        <w:tc>
+          <w:tcPr>
+            <w:tcW w:w="5040" w:type="dxa"/>
+          </w:tcPr>
+          <w:p>
+            <w:pPr>
+              <w:spacing w:before="40" w:after="40"/>
+            </w:pPr>
+            <w:r>
+              <w:rPr>
+                <w:b/>
+                <w:sz w:val="18"/>
+              </w:rPr>
+              <w:t xml:space="preserve">SYCON-Bench</w:t>
+            </w:r>
+            <w:r>
+              <w:rPr>
+                <w:sz w:val="18"/>
+              </w:rPr>
+              <w:t xml:space="preserve"> measures "how quickly a model conforms to the user and how frequently it shifts its stance </w:t>
+            </w:r>
+            <w:r>
+              <w:rPr>
+                <w:b/>
+                <w:sz w:val="18"/>
+              </w:rPr>
+              <w:t xml:space="preserve">under sustained user pressure</w:t>
+            </w:r>
+            <w:r>
+              <w:rPr>
+                <w:sz w:val="18"/>
+              </w:rPr>
+              <w:t xml:space="preserve">"</w:t>
+            </w:r>
+          </w:p>
+        </w:tc>
+        <w:tc>
+          <w:tcPr>
+            <w:tcW w:w="5040" w:type="dxa"/>
+          </w:tcPr>
+          <w:p>
+            <w:pPr>
+              <w:spacing w:before="40" w:after="40"/>
+            </w:pPr>
+            <w:hyperlink r:id="rHl50">
+              <w:r>
+                <w:rPr>
+                  <w:rStyle w:val="Hyperlink"/>
+                  <w:sz w:val="18"/>
+                </w:rPr>
+                <w:t xml:space="preserve">SYCON-Bench, EMNLP 2025</w:t>
+              </w:r>
+            </w:hyperlink>
+          </w:p>
+        </w:tc>
+      </w:tr>
+      <w:tr>
+        <w:tc>
+          <w:tcPr>
+            <w:tcW w:w="5040" w:type="dxa"/>
+          </w:tcPr>
+          <w:p>
+            <w:pPr>
+              <w:spacing w:before="40" w:after="40"/>
+            </w:pPr>
+            <w:r>
+              <w:rPr>
+                <w:sz w:val="18"/>
+              </w:rPr>
+              <w:t xml:space="preserve">On an LLM-as-judge evaluation, </w:t>
+            </w:r>
+            <w:r>
+              <w:rPr>
+                <w:b/>
+                <w:sz w:val="18"/>
+              </w:rPr>
+              <w:t xml:space="preserve">the best model (GPT-5) produced sycophantic answers 29% of the time</w:t>
+            </w:r>
+          </w:p>
+        </w:tc>
+        <w:tc>
+          <w:tcPr>
+            <w:tcW w:w="5040" w:type="dxa"/>
+          </w:tcPr>
+          <w:p>
+            <w:pPr>
+              <w:spacing w:before="40" w:after="40"/>
+            </w:pPr>
+            <w:hyperlink r:id="rHl51">
+              <w:r>
+                <w:rPr>
+                  <w:rStyle w:val="Hyperlink"/>
+                  <w:sz w:val="18"/>
+                </w:rPr>
+                <w:t xml:space="preserve">Sycophancy taxonomy survey</w:t>
+              </w:r>
+            </w:hyperlink>
+          </w:p>
+        </w:tc>
+      </w:tr>
+      <w:tr>
+        <w:tc>
+          <w:tcPr>
+            <w:tcW w:w="5040" w:type="dxa"/>
+          </w:tcPr>
+          <w:p>
+            <w:pPr>
+              <w:spacing w:before="40" w:after="40"/>
+            </w:pPr>
+            <w:r>
+              <w:rPr>
+                <w:b/>
+                <w:sz w:val="18"/>
+              </w:rPr>
+              <w:t xml:space="preserve">OpenAI shipped and then rolled back a sycophantic GPT-4o in four days (April 25–29, 2025)</w:t>
+            </w:r>
+            <w:r>
+              <w:rPr>
+                <w:sz w:val="18"/>
+              </w:rPr>
+              <w:t xml:space="preserve">, and admitted sycophancy "wasn't explicitly flagged as part of internal hands-on testing" and had </w:t>
+            </w:r>
+            <w:r>
+              <w:rPr>
+                <w:b/>
+                <w:sz w:val="18"/>
+              </w:rPr>
+              <w:t xml:space="preserve">no deployment evaluations tracking it</w:t>
+            </w:r>
+          </w:p>
+        </w:tc>
+        <w:tc>
+          <w:tcPr>
+            <w:tcW w:w="5040" w:type="dxa"/>
+          </w:tcPr>
+          <w:p>
+            <w:pPr>
+              <w:spacing w:before="40" w:after="40"/>
+            </w:pPr>
+            <w:hyperlink r:id="rHl52">
+              <w:r>
+                <w:rPr>
+                  <w:rStyle w:val="Hyperlink"/>
+                  <w:sz w:val="18"/>
+                </w:rPr>
+                <w:t xml:space="preserve">OpenAI</w:t>
+              </w:r>
+            </w:hyperlink>
+          </w:p>
+        </w:tc>
+      </w:tr>
+    </w:tbl>
+    <w:p>
+      <w:pPr>
+        <w:spacing w:after="0"/>
+      </w:pPr>
+    </w:p>
+    <w:p>
+      <w:r>
+        <w:rPr>
+          <w:b/>
+        </w:rPr>
+        <w:t xml:space="preserve">A counterparty that folds because the user pushed harder teaches the opposite of the intended lesson</w:t>
+      </w:r>
+      <w:r>
+        <w:t xml:space="preserve"> — and Section 2 contains the real-world version: an AI sales trainer told a user *"you did great"* after they deliberately performed badly.</w:t>
+      </w:r>
+    </w:p>
+    <w:p>
+      <w:pPr>
+        <w:pStyle w:val="Heading2"/>
+      </w:pPr>
+      <w:r>
+        <w:t xml:space="preserve">2b. The literature says counterparty modeling isn't strategy</w:t>
+      </w:r>
+    </w:p>
+    <w:p>
+      <w:r>
+        <w:t xml:space="preserve">A 2026 paper is titled </w:t>
+      </w:r>
+      <w:r>
+        <w:rPr>
+          <w:b/>
+        </w:rPr>
+        <w:t xml:space="preserve">"Counterparty Modeling is Not Strategy: The Limits of LLM Negotiators"</w:t>
+      </w:r>
+      <w:r>
+        <w:t xml:space="preserve"> (</w:t>
+      </w:r>
+      <w:hyperlink r:id="rHl22">
+        <w:r>
+          <w:rPr>
+            <w:rStyle w:val="Hyperlink"/>
+          </w:rPr>
+          <w:t xml:space="preserve">arXiv</w:t>
+        </w:r>
+      </w:hyperlink>
+      <w:r>
+        <w:t xml:space="preserve">). The broader finding: models show "underdeveloped Theory-of-Mind, restricted strategic adaptability, and often superficial reasoning," and falter "on consistency, legitimacy, and commitment </w:t>
+      </w:r>
+      <w:r>
+        <w:rPr>
+          <w:b/>
+        </w:rPr>
+        <w:t xml:space="preserve">when stakes rise</w:t>
+      </w:r>
+      <w:r>
+        <w:t xml:space="preserve">."</w:t>
+      </w:r>
+    </w:p>
+    <w:p>
+      <w:r>
+        <w:rPr>
+          <w:b/>
+        </w:rPr>
+        <w:t xml:space="preserve">"Commitment" is precisely the ability to say no and mean it.</w:t>
+      </w:r>
+    </w:p>
+    <w:p>
+      <w:pPr>
+        <w:pStyle w:val="Heading2"/>
+      </w:pPr>
+      <w:r>
+        <w:t xml:space="preserve">2c. Consistency across repeated play is unsolved</w:t>
+      </w:r>
+    </w:p>
+    <w:p>
+      <w:r>
+        <w:t xml:space="preserve">τ-bench shows frontier function-calling agents scoring ~61% on single attempts but </w:t>
+      </w:r>
+      <w:r>
+        <w:rPr>
+          <w:b/>
+        </w:rPr>
+        <w:t xml:space="preserve">below 25% at pass^8</w:t>
+      </w:r>
+      <w:r>
+        <w:t xml:space="preserve"> — succeeding on all eight independent runs of the same task (</w:t>
+      </w:r>
+      <w:hyperlink r:id="rHl53">
+        <w:r>
+          <w:rPr>
+            <w:rStyle w:val="Hyperlink"/>
+          </w:rPr>
+          <w:t xml:space="preserve">τ-bench</w:t>
+        </w:r>
+      </w:hyperlink>
+      <w:r>
+        <w:t xml:space="preserve">). A practice tool is played dozens of times. </w:t>
+      </w:r>
+      <w:r>
+        <w:rPr>
+          <w:b/>
+        </w:rPr>
+        <w:t xml:space="preserve">Users will find the run where the counterparty behaves absurdly, and that is the run they'll remember.</w:t>
+      </w:r>
+    </w:p>
+    <w:p>
+      <w:pPr>
+        <w:pStyle w:val="Heading2"/>
+      </w:pPr>
+      <w:r>
+        <w:t xml:space="preserve">2d. Twenty years of evidence that the hard part isn't language</w:t>
+      </w:r>
+    </w:p>
+    <w:p>
+      <w:r>
+        <w:t xml:space="preserve">OOTP Developments has been building trade AI since 1999. Its own users, across three consecutive annual releases, say it trades stars </w:t>
+      </w:r>
+      <w:r>
+        <w:rPr>
+          <w:b/>
+        </w:rPr>
+        <w:t xml:space="preserve">with 100% salary retention for scrap prospects</w:t>
+      </w:r>
+      <w:r>
+        <w:t xml:space="preserve"> and "the trade AI is still terrible" (Section 2). </w:t>
+      </w:r>
+      <w:r>
+        <w:rPr>
+          <w:b/>
+        </w:rPr>
+        <w:t xml:space="preserve">That is a valuation and reasoning problem, not a dialogue problem</w:t>
+      </w:r>
+      <w:r>
+        <w:t xml:space="preserve"> — and an LLM does not solve it by talking more fluently.</w:t>
+      </w:r>
+    </w:p>
+    <w:p>
+      <w:pPr>
+        <w:pBdr>
+          <w:bottom w:val="single" w:sz="6" w:space="6" w:color="C9CCD1"/>
+        </w:pBdr>
+      </w:pPr>
+    </w:p>
+    <w:p>
+      <w:pPr>
+        <w:pStyle w:val="Heading1"/>
+      </w:pPr>
+      <w:r>
+        <w:t xml:space="preserve">Part 3 — Counterargument 1, argued at full strength</w:t>
+      </w:r>
+    </w:p>
+    <w:p>
+      <w:pPr>
+        <w:pStyle w:val="Heading2"/>
+      </w:pPr>
+      <w:r>
+        <w:rPr>
+          <w:b/>
+        </w:rPr>
+        <w:t xml:space="preserve">"This was already possible five years ago."</w:t>
+      </w:r>
+    </w:p>
+    <w:p>
+      <w:r>
+        <w:rPr>
+          <w:b/>
+        </w:rPr>
+        <w:t xml:space="preserve">It was demonstrated four years ago, in Science, by an AI that did exactly what the claim describes.</w:t>
+      </w:r>
+    </w:p>
+    <w:p>
+      <w:r>
+        <w:rPr>
+          <w:b/>
+        </w:rPr>
+        <w:t xml:space="preserve">November 2022: Meta's CICERO</w:t>
+      </w:r>
+      <w:r>
+        <w:t xml:space="preserve"> played full-press Diplomacy — a game that "cannot be solved purely through self-play; it requires... understanding other players' motivations and perspectives and using natural language to negotiate complex shared plans." It worked by </w:t>
+      </w:r>
+      <w:r>
+        <w:rPr>
+          <w:b/>
+        </w:rPr>
+        <w:t xml:space="preserve">"inferring players' beliefs and intentions from its conversations and generating dialogue in pursuit of its plans."</w:t>
+      </w:r>
+      <w:r>
+        <w:t xml:space="preserve"> Across 40 games in an online league it scored </w:t>
+      </w:r>
+      <w:r>
+        <w:rPr>
+          <w:b/>
+        </w:rPr>
+        <w:t xml:space="preserve">more than double the human average and ranked in the top 10%</w:t>
+      </w:r>
+      <w:r>
+        <w:t xml:space="preserve">. (</w:t>
+      </w:r>
+      <w:hyperlink r:id="rHl54">
+        <w:r>
+          <w:rPr>
+            <w:rStyle w:val="Hyperlink"/>
+          </w:rPr>
+          <w:t xml:space="preserve">Science</w:t>
+        </w:r>
+      </w:hyperlink>
+      <w:r>
+        <w:t xml:space="preserve">; </w:t>
+      </w:r>
+      <w:hyperlink r:id="rHl55">
+        <w:r>
+          <w:rPr>
+            <w:rStyle w:val="Hyperlink"/>
+          </w:rPr>
+          <w:t xml:space="preserve">Meta AI</w:t>
+        </w:r>
+      </w:hyperlink>
+      <w:r>
+        <w:t xml:space="preserve">)</w:t>
+      </w:r>
+    </w:p>
+    <w:p>
+      <w:r>
+        <w:rPr>
+          <w:b/>
+        </w:rPr>
+        <w:t xml:space="preserve">CICERO pushed back, held firm, formed and broke alliances, and modeled the other side's interests — on a 2.7-billion-parameter language model.</w:t>
+      </w:r>
+      <w:r>
+        <w:t xml:space="preserve"> That is roughly one-thousandth the size of a frontier model today. The capability was not gated on scale.</w:t>
+      </w:r>
+    </w:p>
+    <w:p>
+      <w:r>
+        <w:rPr>
+          <w:b/>
+        </w:rPr>
+        <w:t xml:space="preserve">And the strategic-reasoning half is older still:</w:t>
+      </w:r>
+      <w:r>
+        <w:t xml:space="preserve"> Libratus (2017) and Pluribus (2019) beat top professionals at poker — bluffing, leverage and commitment under hidden information. The </w:t>
+      </w:r>
+      <w:r>
+        <w:rPr>
+          <w:b/>
+        </w:rPr>
+        <w:t xml:space="preserve">Automated Negotiating Agents Competition</w:t>
+      </w:r>
+      <w:r>
+        <w:t xml:space="preserve"> has run since 2010. Rubinstein's bargaining model dates to 1982.</w:t>
+      </w:r>
+    </w:p>
+    <w:p>
+      <w:r>
+        <w:rPr>
+          <w:b/>
+        </w:rPr>
+        <w:t xml:space="preserve">Meanwhile the games chose the dice roll.</w:t>
+      </w:r>
+      <w:r>
+        <w:t xml:space="preserve"> Football Manager has modeled agents, wage demands and clause negotiation for two decades; OOTP models arbitration and salary retention. </w:t>
+      </w:r>
+      <w:r>
+        <w:rPr>
+          <w:b/>
+        </w:rPr>
+        <w:t xml:space="preserve">They resolve negotiation with a probability check because it is cheap, deterministic and testable — not because nobody could build a reasoning counterparty.</w:t>
+      </w:r>
+      <w:r>
+        <w:t xml:space="preserve"> The premise mistakes a product decision for a technology limit.</w:t>
+      </w:r>
+    </w:p>
+    <w:p>
+      <w:r>
+        <w:rPr>
+          <w:b/>
+        </w:rPr>
+        <w:t xml:space="preserve">Where this argument is weakest:</w:t>
+      </w:r>
+      <w:r>
+        <w:t xml:space="preserve"> CICERO cost a research lab a year and worked in exactly one game with fixed rules and a closed action space. What is genuinely new is that </w:t>
+      </w:r>
+      <w:r>
+        <w:rPr>
+          <w:b/>
+        </w:rPr>
+        <w:t xml:space="preserve">a competent negotiating counterparty is now an API call at a few cents</w:t>
+      </w:r>
+      <w:r>
+        <w:t xml:space="preserve">, buildable by a student rather than a lab — and that it can hold a conversation about *any* sport without being retrained for each one. Cheap and general is a real change, even when the underlying capability isn't new.</w:t>
+      </w:r>
+    </w:p>
+    <w:p>
+      <w:pPr>
+        <w:pBdr>
+          <w:bottom w:val="single" w:sz="6" w:space="6" w:color="C9CCD1"/>
+        </w:pBdr>
+      </w:pPr>
+    </w:p>
+    <w:p>
+      <w:pPr>
+        <w:pStyle w:val="Heading1"/>
+      </w:pPr>
+      <w:r>
+        <w:t xml:space="preserve">Part 4 — Counterargument 2, argued at full strength</w:t>
+      </w:r>
+    </w:p>
+    <w:p>
+      <w:pPr>
+        <w:pStyle w:val="Heading2"/>
+      </w:pPr>
+      <w:r>
+        <w:rPr>
+          <w:b/>
+        </w:rPr>
+        <w:t xml:space="preserve">"This still is not possible."</w:t>
+      </w:r>
+    </w:p>
+    <w:p>
+      <w:r>
+        <w:rPr>
+          <w:b/>
+        </w:rPr>
+        <w:t xml:space="preserve">1. The counterparty will fold, and there is a benchmark named after the problem.</w:t>
+      </w:r>
+      <w:r>
+        <w:t xml:space="preserve"> SYCON-Bench exists because models shift their stance under sustained user pressure; the best model tested is sycophantic 29% of the time; OpenAI shipped a sycophantic model and didn't catch it because it had </w:t>
+      </w:r>
+      <w:r>
+        <w:rPr>
+          <w:b/>
+        </w:rPr>
+        <w:t xml:space="preserve">no evaluation tracking it</w:t>
+      </w:r>
+      <w:r>
+        <w:t xml:space="preserve">. Your entire product value is a counterparty that doesn't cave. </w:t>
+      </w:r>
+      <w:r>
+        <w:rPr>
+          <w:b/>
+        </w:rPr>
+        <w:t xml:space="preserve">You would be building on the single most documented weakness of the technology.</w:t>
+      </w:r>
+    </w:p>
+    <w:p>
+      <w:r>
+        <w:rPr>
+          <w:b/>
+        </w:rPr>
+        <w:t xml:space="preserve">2. Holding firm requires a number nobody has.</w:t>
+      </w:r>
+      <w:r>
+        <w:t xml:space="preserve"> To refuse an offer, the AI needs a defensible reservation value — what this player is worth to this team at this cap position. Spotrac and Over The Cap publish *data*, not *valuations*. </w:t>
+      </w:r>
+      <w:r>
+        <w:rPr>
+          <w:b/>
+        </w:rPr>
+        <w:t xml:space="preserve">OOTP has had a valuation engine for over twenty years and its own 1,000-hour users call it irrational.</w:t>
+      </w:r>
+      <w:r>
+        <w:t xml:space="preserve"> Without that number, "holding firm" is just refusing at random, which is a dice roll with better prose.</w:t>
+      </w:r>
+    </w:p>
+    <w:p>
+      <w:r>
+        <w:rPr>
+          <w:b/>
+        </w:rPr>
+        <w:t xml:space="preserve">3. Consistency fails exactly where practice lives.</w:t>
+      </w:r>
+      <w:r>
+        <w:t xml:space="preserve"> pass^8 below 25%. A student doing twenty negotiations for a class will hit the absurd run, and one absurd run destroys the credibility of the score.</w:t>
+      </w:r>
+    </w:p>
+    <w:p>
+      <w:r>
+        <w:rPr>
+          <w:b/>
+        </w:rPr>
+        <w:t xml:space="preserve">4. There is no answer key.</w:t>
+      </w:r>
+      <w:r>
+        <w:t xml:space="preserve"> Sales roleplay scores against known-good behaviours. A contract negotiation has no ground truth — Section 3 found no rubric, no benchmark and no employer that recognises a simulator credential.</w:t>
+      </w:r>
+    </w:p>
+    <w:p>
+      <w:r>
+        <w:rPr>
+          <w:b/>
+        </w:rPr>
+        <w:t xml:space="preserve">5. The market has judged the adjacent product.</w:t>
+      </w:r>
+      <w:r>
+        <w:t xml:space="preserve"> The only AI trainer in Section 2 with public reviews </w:t>
+      </w:r>
+      <w:r>
+        <w:rPr>
+          <w:b/>
+        </w:rPr>
+        <w:t xml:space="preserve">praised a deliberately bad performance.</w:t>
+      </w:r>
+      <w:r>
+        <w:t xml:space="preserve"> That is the failure mode, already shipped, already reviewed.</w:t>
+      </w:r>
+    </w:p>
+    <w:p>
+      <w:r>
+        <w:rPr>
+          <w:b/>
+        </w:rPr>
+        <w:t xml:space="preserve">Where this argument is weakest:</w:t>
+      </w:r>
+      <w:r>
+        <w:t xml:space="preserve"> it treats the counterparty as a single LLM deciding freely. </w:t>
+      </w:r>
+      <w:r>
+        <w:rPr>
+          <w:b/>
+        </w:rPr>
+        <w:t xml:space="preserve">Nothing stops the reservation value and walk-away rules from being ordinary code</w:t>
+      </w:r>
+      <w:r>
+        <w:t xml:space="preserve">, with the model used only to argue, explain and respond in natural language. That architecture — deterministic economics, language on top — sidesteps sycophancy and consistency entirely, and it is what the SportsLayer dossier's own verdict recommended for a different problem: "the cheapest-option and cancel-date logic should run as ordinary code, not AI reasoning."</w:t>
+      </w:r>
+    </w:p>
+    <w:p>
+      <w:pPr>
+        <w:pBdr>
+          <w:bottom w:val="single" w:sz="6" w:space="6" w:color="C9CCD1"/>
+        </w:pBdr>
+      </w:pPr>
+    </w:p>
+    <w:p>
+      <w:pPr>
+        <w:pStyle w:val="Heading1"/>
+      </w:pPr>
+      <w:r>
+        <w:t xml:space="preserve">Part 5 — What survives</w:t>
+      </w:r>
+    </w:p>
+    <w:p>
+      <w:pPr>
+        <w:ind w:left="360"/>
+        <w:pBdr>
+          <w:left w:val="single" w:sz="18" w:space="8" w:color="9AA0A6"/>
+        </w:pBdr>
+      </w:pPr>
+      <w:r>
+        <w:rPr>
+          <w:b/>
+        </w:rPr>
+        <w:t xml:space="preserve">Not newly possible — newly cheap, general, and measurable.</w:t>
+      </w:r>
+      <w:r>
+        <w:t xml:space="preserve"> A counterparty that models the other side's interests and negotiates in natural language was demonstrated in *Science* in November 2022 by CICERO, on a 2.7B-parameter model, and the strategic half is older than that. What changed by 2026 is that it costs cents rather than a research year, works across sports without retraining, and can finally be </w:t>
+      </w:r>
+      <w:r>
+        <w:rPr>
+          <w:b/>
+        </w:rPr>
+        <w:t xml:space="preserve">evaluated</w:t>
+      </w:r>
+      <w:r>
+        <w:t xml:space="preserve"> — NegotiationArena, BargainArena and SYCON-Bench did not exist when the incumbents made their design choices. </w:t>
+      </w:r>
+      <w:r>
+        <w:rPr>
+          <w:b/>
+        </w:rPr>
+        <w:t xml:space="preserve">What has not changed is that frontier models still concede under sustained pressure (GPT-5: sycophantic 29% of the time), still lack consistency across repeated play (pass^8 &lt; 25%), and still cannot produce the player-valuation number that "holding firm" requires — a problem OOTP has failed at for twenty years with hand-written code.</w:t>
+      </w:r>
+      <w:r>
+        <w:t xml:space="preserve"> The version that survives puts the </w:t>
+      </w:r>
+      <w:r>
+        <w:rPr>
+          <w:b/>
+        </w:rPr>
+        <w:t xml:space="preserve">reservation value and the walk-away rule in deterministic code</w:t>
+      </w:r>
+      <w:r>
+        <w:t xml:space="preserve"> and uses the model only to argue, explain and respond.</w:t>
+      </w:r>
+    </w:p>
+    <w:p>
+      <w:pPr>
+        <w:pStyle w:val="Heading2"/>
+      </w:pPr>
+      <w:r>
+        <w:t xml:space="preserve">Four tests that would falsify this — cheapest first</w:t>
+      </w:r>
+    </w:p>
+    <w:p>
+      <w:r>
+        <w:t xml:space="preserve">1. </w:t>
+      </w:r>
+      <w:r>
+        <w:rPr>
+          <w:b/>
+        </w:rPr>
+        <w:t xml:space="preserve">The hold-firm test (a weekend, no code).</w:t>
+      </w:r>
+      <w:r>
+        <w:t xml:space="preserve"> Script 20 negotiations where the correct behaviour is to refuse. Push hard on each — repeat, escalate, flatter, appeal to fairness. </w:t>
+      </w:r>
+      <w:r>
+        <w:rPr>
+          <w:b/>
+        </w:rPr>
+        <w:t xml:space="preserve">Count how often the counterparty caves.</w:t>
+      </w:r>
+      <w:r>
+        <w:t xml:space="preserve"> SYCON-Bench's method is published; copy it. </w:t>
+      </w:r>
+      <w:r>
+        <w:rPr>
+          <w:b/>
+        </w:rPr>
+        <w:t xml:space="preserve">If it folds more than ~10% of the time, the product teaches the wrong lesson and nothing else matters.</w:t>
+      </w:r>
+    </w:p>
+    <w:p>
+      <w:r>
+        <w:t xml:space="preserve">2. </w:t>
+      </w:r>
+      <w:r>
+        <w:rPr>
+          <w:b/>
+        </w:rPr>
+        <w:t xml:space="preserve">The reservation-value test.</w:t>
+      </w:r>
+      <w:r>
+        <w:t xml:space="preserve"> Take 20 real contracts, build a walk-away number for each from public Spotrac/Over The Cap data, and show them to a practitioner. </w:t>
+      </w:r>
+      <w:r>
+        <w:rPr>
+          <w:b/>
+        </w:rPr>
+        <w:t xml:space="preserve">If they can't defend the numbers, the counterparty has nothing to hold firm about.</w:t>
+      </w:r>
+    </w:p>
+    <w:p>
+      <w:r>
+        <w:t xml:space="preserve">3. </w:t>
+      </w:r>
+      <w:r>
+        <w:rPr>
+          <w:b/>
+        </w:rPr>
+        <w:t xml:space="preserve">The exploit test.</w:t>
+      </w:r>
+      <w:r>
+        <w:t xml:space="preserve"> Put it in front of five OOTP or Football Manager veterans with 500+ hours. </w:t>
+      </w:r>
+      <w:r>
+        <w:rPr>
+          <w:b/>
+        </w:rPr>
+        <w:t xml:space="preserve">If they find a repeatable way to fleece the AI within three sessions, you have a dice roll with better dialogue.</w:t>
+      </w:r>
+    </w:p>
+    <w:p>
+      <w:r>
+        <w:t xml:space="preserve">4. </w:t>
+      </w:r>
+      <w:r>
+        <w:rPr>
+          <w:b/>
+        </w:rPr>
+        <w:t xml:space="preserve">The credential test.</w:t>
+      </w:r>
+      <w:r>
+        <w:t xml:space="preserve"> Ask five of the 441 sport management programs whether they would grade with it, and five agencies whether a score would affect an interview. </w:t>
+      </w:r>
+      <w:r>
+        <w:rPr>
+          <w:b/>
+        </w:rPr>
+        <w:t xml:space="preserve">Section 3 found no evidence anyone would, and Section 4 models zero revenue from it.</w:t>
+      </w:r>
+    </w:p>
+    <w:p>
+      <w:pPr>
+        <w:pBdr>
+          <w:bottom w:val="single" w:sz="6" w:space="6" w:color="C9CCD1"/>
+        </w:pBdr>
+      </w:pPr>
+    </w:p>
+    <w:p>
+      <w:pPr>
+        <w:pStyle w:val="Heading1"/>
+      </w:pPr>
+      <w:r>
+        <w:t xml:space="preserve">Flags</w:t>
+      </w:r>
+    </w:p>
+    <w:tbl>
+      <w:tblPr>
+        <w:tblW w:w="10080" w:type="dxa"/>
+        <w:tblBorders>
+          <w:top w:val="single" w:sz="4" w:space="0" w:color="C9CCD1"/>
+          <w:left w:val="single" w:sz="4" w:space="0" w:color="C9CCD1"/>
+          <w:bottom w:val="single" w:sz="4" w:space="0" w:color="C9CCD1"/>
+          <w:right w:val="single" w:sz="4" w:space="0" w:color="C9CCD1"/>
+          <w:insideH w:val="single" w:sz="4" w:space="0" w:color="C9CCD1"/>
+          <w:insideV w:val="single" w:sz="4" w:space="0" w:color="C9CCD1"/>
+        </w:tblBorders>
+        <w:tblLayout w:type="fixed"/>
+      </w:tblPr>
+      <w:tblGrid>
+        <w:gridCol w:w="5040"/>
+        <w:gridCol w:w="5040"/>
+      </w:tblGrid>
+      <w:tr>
+        <w:trPr>
+          <w:tblHeader/>
+        </w:trPr>
+        <w:tc>
+          <w:tcPr>
+            <w:tcW w:w="5040" w:type="dxa"/>
+            <w:shd w:val="clear" w:color="auto" w:fill="EFF1F3"/>
+          </w:tcPr>
+          <w:p>
+            <w:pPr>
+              <w:spacing w:before="40" w:after="40"/>
+            </w:pPr>
+            <w:r>
+              <w:rPr>
+                <w:b/>
+                <w:sz w:val="18"/>
+              </w:rPr>
+              <w:t xml:space="preserve">Item</w:t>
+            </w:r>
+          </w:p>
+        </w:tc>
+        <w:tc>
+          <w:tcPr>
+            <w:tcW w:w="5040" w:type="dxa"/>
+            <w:shd w:val="clear" w:color="auto" w:fill="EFF1F3"/>
+          </w:tcPr>
+          <w:p>
+            <w:pPr>
+              <w:spacing w:before="40" w:after="40"/>
+            </w:pPr>
+            <w:r>
+              <w:rPr>
+                <w:b/>
+                <w:sz w:val="18"/>
+              </w:rPr>
+              <w:t xml:space="preserve">Status</w:t>
+            </w:r>
+          </w:p>
+        </w:tc>
+      </w:tr>
+      <w:tr>
+        <w:tc>
+          <w:tcPr>
+            <w:tcW w:w="5040" w:type="dxa"/>
+          </w:tcPr>
+          <w:p>
+            <w:pPr>
+              <w:spacing w:before="40" w:after="40"/>
+            </w:pPr>
+            <w:r>
+              <w:rPr>
+                <w:sz w:val="18"/>
+              </w:rPr>
+              <w:t xml:space="preserve">"GPT-5 sycophantic 29% of the time"</w:t>
+            </w:r>
+          </w:p>
+        </w:tc>
+        <w:tc>
+          <w:tcPr>
+            <w:tcW w:w="5040" w:type="dxa"/>
+          </w:tcPr>
+          <w:p>
+            <w:pPr>
+              <w:spacing w:before="40" w:after="40"/>
+            </w:pPr>
+            <w:r>
+              <w:rPr>
+                <w:sz w:val="18"/>
+              </w:rPr>
+              <w:t xml:space="preserve">⚠️ From an LLM-as-judge evaluation reported in a taxonomy survey, not a direct benchmark run. Directionally consistent with SYCON-Bench and the ELEPHANT results.</w:t>
+            </w:r>
+          </w:p>
+        </w:tc>
+      </w:tr>
+      <w:tr>
+        <w:tc>
+          <w:tcPr>
+            <w:tcW w:w="5040" w:type="dxa"/>
+          </w:tcPr>
+          <w:p>
+            <w:pPr>
+              <w:spacing w:before="40" w:after="40"/>
+            </w:pPr>
+            <w:r>
+              <w:rPr>
+                <w:sz w:val="18"/>
+              </w:rPr>
+              <w:t xml:space="preserve">τ-bench pass^8 figure</w:t>
+            </w:r>
+          </w:p>
+        </w:tc>
+        <w:tc>
+          <w:tcPr>
+            <w:tcW w:w="5040" w:type="dxa"/>
+          </w:tcPr>
+          <w:p>
+            <w:pPr>
+              <w:spacing w:before="40" w:after="40"/>
+            </w:pPr>
+            <w:r>
+              <w:rPr>
+                <w:sz w:val="18"/>
+              </w:rPr>
+              <w:t xml:space="preserve">⚠️ Customer-service domains, not negotiation. Directionally applicable, not a measurement of this task.</w:t>
+            </w:r>
+          </w:p>
+        </w:tc>
+      </w:tr>
+      <w:tr>
+        <w:tc>
+          <w:tcPr>
+            <w:tcW w:w="5040" w:type="dxa"/>
+          </w:tcPr>
+          <w:p>
+            <w:pPr>
+              <w:spacing w:before="40" w:after="40"/>
+            </w:pPr>
+            <w:r>
+              <w:rPr>
+                <w:sz w:val="18"/>
+              </w:rPr>
+              <w:t xml:space="preserve">CICERO's applicability</w:t>
+            </w:r>
+          </w:p>
+        </w:tc>
+        <w:tc>
+          <w:tcPr>
+            <w:tcW w:w="5040" w:type="dxa"/>
+          </w:tcPr>
+          <w:p>
+            <w:pPr>
+              <w:spacing w:before="40" w:after="40"/>
+            </w:pPr>
+            <w:r>
+              <w:rPr>
+                <w:sz w:val="18"/>
+              </w:rPr>
+              <w:t xml:space="preserve">⚠️ Diplomacy has fixed rules and a closed action space. Contract negotiation does not. </w:t>
+            </w:r>
+            <w:r>
+              <w:rPr>
+                <w:b/>
+                <w:sz w:val="18"/>
+              </w:rPr>
+              <w:t xml:space="preserve">The comparison shows the capability existed; it does not prove it transfers.</w:t>
+            </w:r>
+          </w:p>
+        </w:tc>
+      </w:tr>
+      <w:tr>
+        <w:tc>
+          <w:tcPr>
+            <w:tcW w:w="5040" w:type="dxa"/>
+          </w:tcPr>
+          <w:p>
+            <w:pPr>
+              <w:spacing w:before="40" w:after="40"/>
+            </w:pPr>
+            <w:r>
+              <w:rPr>
+                <w:sz w:val="18"/>
+              </w:rPr>
+              <w:t xml:space="preserve">Negotiation benchmark findings</w:t>
+            </w:r>
+          </w:p>
+        </w:tc>
+        <w:tc>
+          <w:tcPr>
+            <w:tcW w:w="5040" w:type="dxa"/>
+          </w:tcPr>
+          <w:p>
+            <w:pPr>
+              <w:spacing w:before="40" w:after="40"/>
+            </w:pPr>
+            <w:r>
+              <w:rPr>
+                <w:sz w:val="18"/>
+              </w:rPr>
+              <w:t xml:space="preserve">⚠️ Model-specific results (Claude aggressive, GPT-4 fair) come from a 2024-era paper; model behaviour has changed since.</w:t>
+            </w:r>
+          </w:p>
+        </w:tc>
+      </w:tr>
+      <w:tr>
+        <w:tc>
+          <w:tcPr>
+            <w:tcW w:w="5040" w:type="dxa"/>
+          </w:tcPr>
+          <w:p>
+            <w:pPr>
+              <w:spacing w:before="40" w:after="40"/>
+            </w:pPr>
+            <w:r>
+              <w:rPr>
+                <w:sz w:val="18"/>
+              </w:rPr>
+              <w:t xml:space="preserve">Public data as ground truth</w:t>
+            </w:r>
+          </w:p>
+        </w:tc>
+        <w:tc>
+          <w:tcPr>
+            <w:tcW w:w="5040" w:type="dxa"/>
+          </w:tcPr>
+          <w:p>
+            <w:pPr>
+              <w:spacing w:before="40" w:after="40"/>
+            </w:pPr>
+            <w:r>
+              <w:rPr>
+                <w:sz w:val="18"/>
+              </w:rPr>
+              <w:t xml:space="preserve">⚠️ Spotrac's $30/yr price is from the company's social post; Over The Cap doesn't publish a price. Neither publishes a </w:t>
+            </w:r>
+            <w:r>
+              <w:rPr>
+                <w:b/>
+                <w:sz w:val="18"/>
+              </w:rPr>
+              <w:t xml:space="preserve">valuation model</w:t>
+            </w:r>
+            <w:r>
+              <w:rPr>
+                <w:sz w:val="18"/>
+              </w:rPr>
+              <w:t xml:space="preserve">, which is the part that matters.</w:t>
+            </w:r>
+          </w:p>
+        </w:tc>
+      </w:tr>
+      <w:tr>
+        <w:tc>
+          <w:tcPr>
+            <w:tcW w:w="5040" w:type="dxa"/>
+          </w:tcPr>
+          <w:p>
+            <w:pPr>
+              <w:spacing w:before="40" w:after="40"/>
+            </w:pPr>
+            <w:r>
+              <w:rPr>
+                <w:b/>
+                <w:sz w:val="18"/>
+              </w:rPr>
+              <w:t xml:space="preserve">Reddit</w:t>
+            </w:r>
+          </w:p>
+        </w:tc>
+        <w:tc>
+          <w:tcPr>
+            <w:tcW w:w="5040" w:type="dxa"/>
+          </w:tcPr>
+          <w:p>
+            <w:pPr>
+              <w:spacing w:before="40" w:after="40"/>
+            </w:pPr>
+            <w:r>
+              <w:rPr>
+                <w:sz w:val="18"/>
+              </w:rPr>
+              <w:t xml:space="preserve">❌ Blocked throughout. Sim communities argue about trade-AI realism constantly and none of it is here — </w:t>
+            </w:r>
+            <w:r>
+              <w:rPr>
+                <w:b/>
+                <w:sz w:val="18"/>
+              </w:rPr>
+              <w:t xml:space="preserve">the biggest evidence gap in this dossier.</w:t>
+            </w:r>
+          </w:p>
+        </w:tc>
+      </w:tr>
+      <w:tr>
+        <w:tc>
+          <w:tcPr>
+            <w:tcW w:w="5040" w:type="dxa"/>
+          </w:tcPr>
+          <w:p>
+            <w:pPr>
+              <w:spacing w:before="40" w:after="40"/>
+            </w:pPr>
+            <w:r>
+              <w:rPr>
+                <w:sz w:val="18"/>
+              </w:rPr>
+              <w:t xml:space="preserve">Employer recognition</w:t>
+            </w:r>
+          </w:p>
+        </w:tc>
+        <w:tc>
+          <w:tcPr>
+            <w:tcW w:w="5040" w:type="dxa"/>
+          </w:tcPr>
+          <w:p>
+            <w:pPr>
+              <w:spacing w:before="40" w:after="40"/>
+            </w:pPr>
+            <w:r>
+              <w:rPr>
+                <w:sz w:val="18"/>
+              </w:rPr>
+              <w:t xml:space="preserve">❌ No evidence found in either direction.</w:t>
+            </w:r>
+          </w:p>
+        </w:tc>
+      </w:tr>
+      <w:tr>
+        <w:tc>
+          <w:tcPr>
+            <w:tcW w:w="5040" w:type="dxa"/>
+          </w:tcPr>
+          <w:p>
+            <w:pPr>
+              <w:spacing w:before="40" w:after="40"/>
+            </w:pPr>
+            <w:r>
+              <w:rPr>
+                <w:sz w:val="18"/>
+              </w:rPr>
+              <w:t xml:space="preserve">Whether deterministic-economics-plus-LLM-language actually works</w:t>
+            </w:r>
+          </w:p>
+        </w:tc>
+        <w:tc>
+          <w:tcPr>
+            <w:tcW w:w="5040" w:type="dxa"/>
+          </w:tcPr>
+          <w:p>
+            <w:pPr>
+              <w:spacing w:before="40" w:after="40"/>
+            </w:pPr>
+            <w:r>
+              <w:rPr>
+                <w:sz w:val="18"/>
+              </w:rPr>
+              <w:t xml:space="preserve">❌ </w:t>
+            </w:r>
+            <w:r>
+              <w:rPr>
+                <w:b/>
+                <w:sz w:val="18"/>
+              </w:rPr>
+              <w:t xml:space="preserve">Untested.</w:t>
+            </w:r>
+            <w:r>
+              <w:rPr>
+                <w:sz w:val="18"/>
+              </w:rPr>
+              <w:t xml:space="preserve"> It is the architecture this section recommends and nobody in the research has shipped it for sport.</w:t>
             </w:r>
           </w:p>
         </w:tc>

</xml_diff>